<commit_message>
Implementacion de cuadro de requerimientos no funcionales
</commit_message>
<xml_diff>
--- a/Documents/FD03-EPIS-Informe Especificación Requerimientos.docx
+++ b/Documents/FD03-EPIS-Informe Especificación Requerimientos.docx
@@ -6387,6 +6387,2759 @@
         <w:t>Cuadro de Requerimientos No funcionales</w:t>
       </w:r>
     </w:p>
+    <w:tbl>
+      <w:tblPr>
+        <w:tblW w:w="0" w:type="dxa"/>
+        <w:tblCellMar>
+          <w:left w:w="0" w:type="dxa"/>
+          <w:right w:w="0" w:type="dxa"/>
+        </w:tblCellMar>
+        <w:tblLook w:val="04A0" w:firstRow="1" w:lastRow="0" w:firstColumn="1" w:lastColumn="0" w:noHBand="0" w:noVBand="1"/>
+      </w:tblPr>
+      <w:tblGrid>
+        <w:gridCol w:w="566"/>
+        <w:gridCol w:w="1643"/>
+        <w:gridCol w:w="2186"/>
+        <w:gridCol w:w="911"/>
+        <w:gridCol w:w="979"/>
+        <w:gridCol w:w="1122"/>
+        <w:gridCol w:w="1067"/>
+      </w:tblGrid>
+      <w:tr>
+        <w:trPr>
+          <w:trHeight w:val="315"/>
+        </w:trPr>
+        <w:tc>
+          <w:tcPr>
+            <w:tcW w:w="0" w:type="auto"/>
+            <w:gridSpan w:val="7"/>
+            <w:tcBorders>
+              <w:top w:val="single" w:sz="12" w:space="0" w:color="000000"/>
+              <w:left w:val="single" w:sz="12" w:space="0" w:color="000000"/>
+              <w:bottom w:val="single" w:sz="6" w:space="0" w:color="000000"/>
+              <w:right w:val="single" w:sz="12" w:space="0" w:color="000000"/>
+            </w:tcBorders>
+            <w:shd w:val="clear" w:color="auto" w:fill="45818E"/>
+            <w:tcMar>
+              <w:top w:w="30" w:type="dxa"/>
+              <w:left w:w="45" w:type="dxa"/>
+              <w:bottom w:w="30" w:type="dxa"/>
+              <w:right w:w="45" w:type="dxa"/>
+            </w:tcMar>
+            <w:vAlign w:val="bottom"/>
+            <w:hideMark/>
+          </w:tcPr>
+          <w:p>
+            <w:pPr>
+              <w:spacing w:after="0" w:line="240" w:lineRule="auto"/>
+              <w:jc w:val="center"/>
+              <w:rPr>
+                <w:rFonts w:eastAsia="Times New Roman"/>
+                <w:b/>
+                <w:bCs/>
+                <w:color w:val="FFFFFF"/>
+                <w:sz w:val="26"/>
+                <w:szCs w:val="26"/>
+              </w:rPr>
+            </w:pPr>
+            <w:bookmarkStart w:id="24" w:name="_heading=h.pc21corewfy" w:colFirst="0" w:colLast="0"/>
+            <w:bookmarkEnd w:id="24"/>
+            <w:r>
+              <w:rPr>
+                <w:rFonts w:eastAsia="Times New Roman"/>
+                <w:b/>
+                <w:bCs/>
+                <w:color w:val="FFFFFF"/>
+                <w:sz w:val="26"/>
+                <w:szCs w:val="26"/>
+              </w:rPr>
+              <w:t>Requerimientos No Funcionales - GDI-IA</w:t>
+            </w:r>
+          </w:p>
+        </w:tc>
+      </w:tr>
+      <w:tr>
+        <w:trPr>
+          <w:trHeight w:val="315"/>
+        </w:trPr>
+        <w:tc>
+          <w:tcPr>
+            <w:tcW w:w="0" w:type="auto"/>
+            <w:tcBorders>
+              <w:top w:val="single" w:sz="6" w:space="0" w:color="CCCCCC"/>
+              <w:left w:val="single" w:sz="6" w:space="0" w:color="000000"/>
+              <w:bottom w:val="single" w:sz="6" w:space="0" w:color="000000"/>
+              <w:right w:val="single" w:sz="6" w:space="0" w:color="000000"/>
+            </w:tcBorders>
+            <w:shd w:val="clear" w:color="auto" w:fill="B6D7A8"/>
+            <w:tcMar>
+              <w:top w:w="30" w:type="dxa"/>
+              <w:left w:w="45" w:type="dxa"/>
+              <w:bottom w:w="30" w:type="dxa"/>
+              <w:right w:w="45" w:type="dxa"/>
+            </w:tcMar>
+            <w:vAlign w:val="bottom"/>
+            <w:hideMark/>
+          </w:tcPr>
+          <w:p>
+            <w:pPr>
+              <w:spacing w:after="0" w:line="240" w:lineRule="auto"/>
+              <w:jc w:val="center"/>
+              <w:rPr>
+                <w:rFonts w:eastAsia="Times New Roman"/>
+              </w:rPr>
+            </w:pPr>
+            <w:r>
+              <w:rPr>
+                <w:rFonts w:eastAsia="Times New Roman"/>
+              </w:rPr>
+              <w:t>REQS</w:t>
+            </w:r>
+          </w:p>
+        </w:tc>
+        <w:tc>
+          <w:tcPr>
+            <w:tcW w:w="0" w:type="auto"/>
+            <w:tcBorders>
+              <w:top w:val="single" w:sz="6" w:space="0" w:color="CCCCCC"/>
+              <w:left w:val="single" w:sz="6" w:space="0" w:color="CCCCCC"/>
+              <w:bottom w:val="single" w:sz="6" w:space="0" w:color="000000"/>
+              <w:right w:val="single" w:sz="6" w:space="0" w:color="000000"/>
+            </w:tcBorders>
+            <w:shd w:val="clear" w:color="auto" w:fill="B6D7A8"/>
+            <w:tcMar>
+              <w:top w:w="30" w:type="dxa"/>
+              <w:left w:w="45" w:type="dxa"/>
+              <w:bottom w:w="30" w:type="dxa"/>
+              <w:right w:w="45" w:type="dxa"/>
+            </w:tcMar>
+            <w:vAlign w:val="bottom"/>
+            <w:hideMark/>
+          </w:tcPr>
+          <w:p>
+            <w:pPr>
+              <w:spacing w:after="0" w:line="240" w:lineRule="auto"/>
+              <w:jc w:val="center"/>
+              <w:rPr>
+                <w:rFonts w:eastAsia="Times New Roman"/>
+              </w:rPr>
+            </w:pPr>
+            <w:r>
+              <w:rPr>
+                <w:rFonts w:eastAsia="Times New Roman"/>
+              </w:rPr>
+              <w:t>Requerimiento</w:t>
+            </w:r>
+          </w:p>
+        </w:tc>
+        <w:tc>
+          <w:tcPr>
+            <w:tcW w:w="0" w:type="auto"/>
+            <w:tcBorders>
+              <w:top w:val="single" w:sz="6" w:space="0" w:color="CCCCCC"/>
+              <w:left w:val="single" w:sz="6" w:space="0" w:color="CCCCCC"/>
+              <w:bottom w:val="single" w:sz="6" w:space="0" w:color="000000"/>
+              <w:right w:val="single" w:sz="6" w:space="0" w:color="000000"/>
+            </w:tcBorders>
+            <w:shd w:val="clear" w:color="auto" w:fill="B6D7A8"/>
+            <w:tcMar>
+              <w:top w:w="30" w:type="dxa"/>
+              <w:left w:w="45" w:type="dxa"/>
+              <w:bottom w:w="30" w:type="dxa"/>
+              <w:right w:w="45" w:type="dxa"/>
+            </w:tcMar>
+            <w:vAlign w:val="bottom"/>
+            <w:hideMark/>
+          </w:tcPr>
+          <w:p>
+            <w:pPr>
+              <w:spacing w:after="0" w:line="240" w:lineRule="auto"/>
+              <w:jc w:val="center"/>
+              <w:rPr>
+                <w:rFonts w:eastAsia="Times New Roman"/>
+              </w:rPr>
+            </w:pPr>
+            <w:r>
+              <w:rPr>
+                <w:rFonts w:eastAsia="Times New Roman"/>
+              </w:rPr>
+              <w:t>Descripción</w:t>
+            </w:r>
+          </w:p>
+        </w:tc>
+        <w:tc>
+          <w:tcPr>
+            <w:tcW w:w="0" w:type="auto"/>
+            <w:tcBorders>
+              <w:top w:val="single" w:sz="6" w:space="0" w:color="CCCCCC"/>
+              <w:left w:val="single" w:sz="6" w:space="0" w:color="CCCCCC"/>
+              <w:bottom w:val="single" w:sz="6" w:space="0" w:color="000000"/>
+              <w:right w:val="single" w:sz="6" w:space="0" w:color="000000"/>
+            </w:tcBorders>
+            <w:shd w:val="clear" w:color="auto" w:fill="B6D7A8"/>
+            <w:tcMar>
+              <w:top w:w="30" w:type="dxa"/>
+              <w:left w:w="45" w:type="dxa"/>
+              <w:bottom w:w="30" w:type="dxa"/>
+              <w:right w:w="45" w:type="dxa"/>
+            </w:tcMar>
+            <w:vAlign w:val="bottom"/>
+            <w:hideMark/>
+          </w:tcPr>
+          <w:p>
+            <w:pPr>
+              <w:spacing w:after="0" w:line="240" w:lineRule="auto"/>
+              <w:jc w:val="center"/>
+              <w:rPr>
+                <w:rFonts w:eastAsia="Times New Roman"/>
+              </w:rPr>
+            </w:pPr>
+            <w:r>
+              <w:rPr>
+                <w:rFonts w:eastAsia="Times New Roman"/>
+              </w:rPr>
+              <w:t>Prioridad</w:t>
+            </w:r>
+          </w:p>
+        </w:tc>
+        <w:tc>
+          <w:tcPr>
+            <w:tcW w:w="0" w:type="auto"/>
+            <w:tcBorders>
+              <w:top w:val="single" w:sz="6" w:space="0" w:color="CCCCCC"/>
+              <w:left w:val="single" w:sz="6" w:space="0" w:color="CCCCCC"/>
+              <w:bottom w:val="single" w:sz="6" w:space="0" w:color="000000"/>
+              <w:right w:val="single" w:sz="6" w:space="0" w:color="000000"/>
+            </w:tcBorders>
+            <w:shd w:val="clear" w:color="auto" w:fill="B6D7A8"/>
+            <w:tcMar>
+              <w:top w:w="30" w:type="dxa"/>
+              <w:left w:w="45" w:type="dxa"/>
+              <w:bottom w:w="30" w:type="dxa"/>
+              <w:right w:w="45" w:type="dxa"/>
+            </w:tcMar>
+            <w:vAlign w:val="bottom"/>
+            <w:hideMark/>
+          </w:tcPr>
+          <w:p>
+            <w:pPr>
+              <w:spacing w:after="0" w:line="240" w:lineRule="auto"/>
+              <w:jc w:val="center"/>
+              <w:rPr>
+                <w:rFonts w:eastAsia="Times New Roman"/>
+              </w:rPr>
+            </w:pPr>
+            <w:r>
+              <w:rPr>
+                <w:rFonts w:eastAsia="Times New Roman"/>
+              </w:rPr>
+              <w:t>Urgencia</w:t>
+            </w:r>
+          </w:p>
+        </w:tc>
+        <w:tc>
+          <w:tcPr>
+            <w:tcW w:w="0" w:type="auto"/>
+            <w:tcBorders>
+              <w:top w:val="single" w:sz="6" w:space="0" w:color="CCCCCC"/>
+              <w:left w:val="single" w:sz="6" w:space="0" w:color="CCCCCC"/>
+              <w:bottom w:val="single" w:sz="6" w:space="0" w:color="000000"/>
+              <w:right w:val="single" w:sz="6" w:space="0" w:color="000000"/>
+            </w:tcBorders>
+            <w:shd w:val="clear" w:color="auto" w:fill="B6D7A8"/>
+            <w:tcMar>
+              <w:top w:w="30" w:type="dxa"/>
+              <w:left w:w="45" w:type="dxa"/>
+              <w:bottom w:w="30" w:type="dxa"/>
+              <w:right w:w="45" w:type="dxa"/>
+            </w:tcMar>
+            <w:vAlign w:val="bottom"/>
+            <w:hideMark/>
+          </w:tcPr>
+          <w:p>
+            <w:pPr>
+              <w:spacing w:after="0" w:line="240" w:lineRule="auto"/>
+              <w:jc w:val="center"/>
+              <w:rPr>
+                <w:rFonts w:eastAsia="Times New Roman"/>
+              </w:rPr>
+            </w:pPr>
+            <w:r>
+              <w:rPr>
+                <w:rFonts w:eastAsia="Times New Roman"/>
+              </w:rPr>
+              <w:t>Estado de desarrollo</w:t>
+            </w:r>
+          </w:p>
+        </w:tc>
+        <w:tc>
+          <w:tcPr>
+            <w:tcW w:w="0" w:type="auto"/>
+            <w:tcBorders>
+              <w:top w:val="single" w:sz="6" w:space="0" w:color="CCCCCC"/>
+              <w:left w:val="single" w:sz="6" w:space="0" w:color="CCCCCC"/>
+              <w:bottom w:val="single" w:sz="6" w:space="0" w:color="000000"/>
+              <w:right w:val="single" w:sz="6" w:space="0" w:color="000000"/>
+            </w:tcBorders>
+            <w:shd w:val="clear" w:color="auto" w:fill="B6D7A8"/>
+            <w:tcMar>
+              <w:top w:w="30" w:type="dxa"/>
+              <w:left w:w="45" w:type="dxa"/>
+              <w:bottom w:w="30" w:type="dxa"/>
+              <w:right w:w="45" w:type="dxa"/>
+            </w:tcMar>
+            <w:vAlign w:val="bottom"/>
+            <w:hideMark/>
+          </w:tcPr>
+          <w:p>
+            <w:pPr>
+              <w:spacing w:after="0" w:line="240" w:lineRule="auto"/>
+              <w:jc w:val="center"/>
+              <w:rPr>
+                <w:rFonts w:eastAsia="Times New Roman"/>
+              </w:rPr>
+            </w:pPr>
+            <w:r>
+              <w:rPr>
+                <w:rFonts w:eastAsia="Times New Roman"/>
+              </w:rPr>
+              <w:t>Estabilidad</w:t>
+            </w:r>
+          </w:p>
+        </w:tc>
+      </w:tr>
+      <w:tr>
+        <w:trPr>
+          <w:trHeight w:val="315"/>
+        </w:trPr>
+        <w:tc>
+          <w:tcPr>
+            <w:tcW w:w="0" w:type="auto"/>
+            <w:tcBorders>
+              <w:top w:val="single" w:sz="6" w:space="0" w:color="CCCCCC"/>
+              <w:left w:val="single" w:sz="6" w:space="0" w:color="000000"/>
+              <w:bottom w:val="single" w:sz="6" w:space="0" w:color="000000"/>
+              <w:right w:val="single" w:sz="6" w:space="0" w:color="000000"/>
+            </w:tcBorders>
+            <w:shd w:val="clear" w:color="auto" w:fill="B6D7A8"/>
+            <w:tcMar>
+              <w:top w:w="30" w:type="dxa"/>
+              <w:left w:w="45" w:type="dxa"/>
+              <w:bottom w:w="30" w:type="dxa"/>
+              <w:right w:w="45" w:type="dxa"/>
+            </w:tcMar>
+            <w:vAlign w:val="bottom"/>
+            <w:hideMark/>
+          </w:tcPr>
+          <w:p>
+            <w:pPr>
+              <w:spacing w:after="0" w:line="240" w:lineRule="auto"/>
+              <w:jc w:val="center"/>
+              <w:rPr>
+                <w:rFonts w:eastAsia="Times New Roman"/>
+              </w:rPr>
+            </w:pPr>
+            <w:r>
+              <w:rPr>
+                <w:rFonts w:eastAsia="Times New Roman"/>
+              </w:rPr>
+              <w:t>RNF1</w:t>
+            </w:r>
+          </w:p>
+        </w:tc>
+        <w:tc>
+          <w:tcPr>
+            <w:tcW w:w="0" w:type="auto"/>
+            <w:tcBorders>
+              <w:top w:val="single" w:sz="6" w:space="0" w:color="CCCCCC"/>
+              <w:left w:val="single" w:sz="6" w:space="0" w:color="CCCCCC"/>
+              <w:bottom w:val="single" w:sz="6" w:space="0" w:color="000000"/>
+              <w:right w:val="single" w:sz="6" w:space="0" w:color="000000"/>
+            </w:tcBorders>
+            <w:shd w:val="clear" w:color="auto" w:fill="B6D7A8"/>
+            <w:tcMar>
+              <w:top w:w="30" w:type="dxa"/>
+              <w:left w:w="45" w:type="dxa"/>
+              <w:bottom w:w="30" w:type="dxa"/>
+              <w:right w:w="45" w:type="dxa"/>
+            </w:tcMar>
+            <w:vAlign w:val="bottom"/>
+            <w:hideMark/>
+          </w:tcPr>
+          <w:p>
+            <w:pPr>
+              <w:spacing w:after="0" w:line="240" w:lineRule="auto"/>
+              <w:jc w:val="center"/>
+              <w:rPr>
+                <w:rFonts w:eastAsia="Times New Roman"/>
+              </w:rPr>
+            </w:pPr>
+            <w:r>
+              <w:rPr>
+                <w:rFonts w:eastAsia="Times New Roman"/>
+              </w:rPr>
+              <w:t>Debe integrar Login</w:t>
+            </w:r>
+          </w:p>
+        </w:tc>
+        <w:tc>
+          <w:tcPr>
+            <w:tcW w:w="0" w:type="auto"/>
+            <w:tcBorders>
+              <w:top w:val="single" w:sz="6" w:space="0" w:color="CCCCCC"/>
+              <w:left w:val="single" w:sz="6" w:space="0" w:color="CCCCCC"/>
+              <w:bottom w:val="single" w:sz="6" w:space="0" w:color="000000"/>
+              <w:right w:val="single" w:sz="6" w:space="0" w:color="000000"/>
+            </w:tcBorders>
+            <w:shd w:val="clear" w:color="auto" w:fill="B6D7A8"/>
+            <w:tcMar>
+              <w:top w:w="30" w:type="dxa"/>
+              <w:left w:w="45" w:type="dxa"/>
+              <w:bottom w:w="30" w:type="dxa"/>
+              <w:right w:w="45" w:type="dxa"/>
+            </w:tcMar>
+            <w:vAlign w:val="bottom"/>
+            <w:hideMark/>
+          </w:tcPr>
+          <w:p>
+            <w:pPr>
+              <w:spacing w:after="0" w:line="240" w:lineRule="auto"/>
+              <w:jc w:val="center"/>
+              <w:rPr>
+                <w:rFonts w:eastAsia="Times New Roman"/>
+              </w:rPr>
+            </w:pPr>
+            <w:r>
+              <w:rPr>
+                <w:rFonts w:eastAsia="Times New Roman"/>
+              </w:rPr>
+              <w:t>Debe validar las credenciales</w:t>
+            </w:r>
+          </w:p>
+        </w:tc>
+        <w:tc>
+          <w:tcPr>
+            <w:tcW w:w="0" w:type="auto"/>
+            <w:tcBorders>
+              <w:top w:val="single" w:sz="6" w:space="0" w:color="CCCCCC"/>
+              <w:left w:val="single" w:sz="6" w:space="0" w:color="CCCCCC"/>
+              <w:bottom w:val="single" w:sz="6" w:space="0" w:color="000000"/>
+              <w:right w:val="single" w:sz="6" w:space="0" w:color="000000"/>
+            </w:tcBorders>
+            <w:shd w:val="clear" w:color="auto" w:fill="B6D7A8"/>
+            <w:tcMar>
+              <w:top w:w="30" w:type="dxa"/>
+              <w:left w:w="45" w:type="dxa"/>
+              <w:bottom w:w="30" w:type="dxa"/>
+              <w:right w:w="45" w:type="dxa"/>
+            </w:tcMar>
+            <w:vAlign w:val="bottom"/>
+            <w:hideMark/>
+          </w:tcPr>
+          <w:p>
+            <w:pPr>
+              <w:spacing w:after="0" w:line="240" w:lineRule="auto"/>
+              <w:rPr>
+                <w:rFonts w:eastAsia="Times New Roman"/>
+              </w:rPr>
+            </w:pPr>
+            <w:r>
+              <w:rPr>
+                <w:rFonts w:eastAsia="Times New Roman"/>
+              </w:rPr>
+              <w:t>Alta</w:t>
+            </w:r>
+          </w:p>
+        </w:tc>
+        <w:tc>
+          <w:tcPr>
+            <w:tcW w:w="0" w:type="auto"/>
+            <w:tcBorders>
+              <w:top w:val="single" w:sz="6" w:space="0" w:color="CCCCCC"/>
+              <w:left w:val="single" w:sz="6" w:space="0" w:color="CCCCCC"/>
+              <w:bottom w:val="single" w:sz="6" w:space="0" w:color="000000"/>
+              <w:right w:val="single" w:sz="6" w:space="0" w:color="000000"/>
+            </w:tcBorders>
+            <w:shd w:val="clear" w:color="auto" w:fill="B6D7A8"/>
+            <w:tcMar>
+              <w:top w:w="30" w:type="dxa"/>
+              <w:left w:w="45" w:type="dxa"/>
+              <w:bottom w:w="30" w:type="dxa"/>
+              <w:right w:w="45" w:type="dxa"/>
+            </w:tcMar>
+            <w:vAlign w:val="bottom"/>
+            <w:hideMark/>
+          </w:tcPr>
+          <w:p>
+            <w:pPr>
+              <w:spacing w:after="0" w:line="240" w:lineRule="auto"/>
+              <w:rPr>
+                <w:rFonts w:eastAsia="Times New Roman"/>
+              </w:rPr>
+            </w:pPr>
+            <w:r>
+              <w:rPr>
+                <w:rFonts w:eastAsia="Times New Roman"/>
+              </w:rPr>
+              <w:t>Necesario</w:t>
+            </w:r>
+          </w:p>
+        </w:tc>
+        <w:tc>
+          <w:tcPr>
+            <w:tcW w:w="0" w:type="auto"/>
+            <w:tcBorders>
+              <w:top w:val="single" w:sz="6" w:space="0" w:color="CCCCCC"/>
+              <w:left w:val="single" w:sz="6" w:space="0" w:color="CCCCCC"/>
+              <w:bottom w:val="single" w:sz="6" w:space="0" w:color="000000"/>
+              <w:right w:val="single" w:sz="6" w:space="0" w:color="000000"/>
+            </w:tcBorders>
+            <w:shd w:val="clear" w:color="auto" w:fill="B6D7A8"/>
+            <w:tcMar>
+              <w:top w:w="30" w:type="dxa"/>
+              <w:left w:w="45" w:type="dxa"/>
+              <w:bottom w:w="30" w:type="dxa"/>
+              <w:right w:w="45" w:type="dxa"/>
+            </w:tcMar>
+            <w:vAlign w:val="bottom"/>
+            <w:hideMark/>
+          </w:tcPr>
+          <w:p>
+            <w:pPr>
+              <w:spacing w:after="0" w:line="240" w:lineRule="auto"/>
+              <w:rPr>
+                <w:rFonts w:eastAsia="Times New Roman"/>
+              </w:rPr>
+            </w:pPr>
+            <w:r>
+              <w:rPr>
+                <w:rFonts w:eastAsia="Times New Roman"/>
+              </w:rPr>
+              <w:t>Terminado</w:t>
+            </w:r>
+          </w:p>
+        </w:tc>
+        <w:tc>
+          <w:tcPr>
+            <w:tcW w:w="0" w:type="auto"/>
+            <w:tcBorders>
+              <w:top w:val="single" w:sz="6" w:space="0" w:color="CCCCCC"/>
+              <w:left w:val="single" w:sz="6" w:space="0" w:color="CCCCCC"/>
+              <w:bottom w:val="single" w:sz="6" w:space="0" w:color="000000"/>
+              <w:right w:val="single" w:sz="6" w:space="0" w:color="000000"/>
+            </w:tcBorders>
+            <w:shd w:val="clear" w:color="auto" w:fill="B6D7A8"/>
+            <w:tcMar>
+              <w:top w:w="30" w:type="dxa"/>
+              <w:left w:w="45" w:type="dxa"/>
+              <w:bottom w:w="30" w:type="dxa"/>
+              <w:right w:w="45" w:type="dxa"/>
+            </w:tcMar>
+            <w:vAlign w:val="bottom"/>
+            <w:hideMark/>
+          </w:tcPr>
+          <w:p>
+            <w:pPr>
+              <w:spacing w:after="0" w:line="240" w:lineRule="auto"/>
+              <w:rPr>
+                <w:rFonts w:eastAsia="Times New Roman"/>
+              </w:rPr>
+            </w:pPr>
+            <w:r>
+              <w:rPr>
+                <w:rFonts w:eastAsia="Times New Roman"/>
+              </w:rPr>
+              <w:t>Alta</w:t>
+            </w:r>
+          </w:p>
+        </w:tc>
+      </w:tr>
+      <w:tr>
+        <w:trPr>
+          <w:trHeight w:val="315"/>
+        </w:trPr>
+        <w:tc>
+          <w:tcPr>
+            <w:tcW w:w="0" w:type="auto"/>
+            <w:tcBorders>
+              <w:top w:val="single" w:sz="6" w:space="0" w:color="CCCCCC"/>
+              <w:left w:val="single" w:sz="6" w:space="0" w:color="000000"/>
+              <w:bottom w:val="single" w:sz="6" w:space="0" w:color="000000"/>
+              <w:right w:val="single" w:sz="6" w:space="0" w:color="000000"/>
+            </w:tcBorders>
+            <w:shd w:val="clear" w:color="auto" w:fill="B6D7A8"/>
+            <w:tcMar>
+              <w:top w:w="30" w:type="dxa"/>
+              <w:left w:w="45" w:type="dxa"/>
+              <w:bottom w:w="30" w:type="dxa"/>
+              <w:right w:w="45" w:type="dxa"/>
+            </w:tcMar>
+            <w:vAlign w:val="bottom"/>
+            <w:hideMark/>
+          </w:tcPr>
+          <w:p>
+            <w:pPr>
+              <w:spacing w:after="0" w:line="240" w:lineRule="auto"/>
+              <w:rPr>
+                <w:rFonts w:eastAsia="Times New Roman"/>
+              </w:rPr>
+            </w:pPr>
+          </w:p>
+        </w:tc>
+        <w:tc>
+          <w:tcPr>
+            <w:tcW w:w="0" w:type="auto"/>
+            <w:tcBorders>
+              <w:top w:val="single" w:sz="6" w:space="0" w:color="CCCCCC"/>
+              <w:left w:val="single" w:sz="6" w:space="0" w:color="CCCCCC"/>
+              <w:bottom w:val="single" w:sz="6" w:space="0" w:color="000000"/>
+              <w:right w:val="single" w:sz="6" w:space="0" w:color="000000"/>
+            </w:tcBorders>
+            <w:shd w:val="clear" w:color="auto" w:fill="B6D7A8"/>
+            <w:tcMar>
+              <w:top w:w="30" w:type="dxa"/>
+              <w:left w:w="45" w:type="dxa"/>
+              <w:bottom w:w="30" w:type="dxa"/>
+              <w:right w:w="45" w:type="dxa"/>
+            </w:tcMar>
+            <w:vAlign w:val="bottom"/>
+            <w:hideMark/>
+          </w:tcPr>
+          <w:p>
+            <w:pPr>
+              <w:spacing w:after="0" w:line="240" w:lineRule="auto"/>
+              <w:rPr>
+                <w:rFonts w:ascii="Times New Roman" w:eastAsia="Times New Roman" w:hAnsi="Times New Roman" w:cs="Times New Roman"/>
+                <w:sz w:val="20"/>
+                <w:szCs w:val="20"/>
+              </w:rPr>
+            </w:pPr>
+          </w:p>
+        </w:tc>
+        <w:tc>
+          <w:tcPr>
+            <w:tcW w:w="0" w:type="auto"/>
+            <w:tcBorders>
+              <w:top w:val="single" w:sz="6" w:space="0" w:color="CCCCCC"/>
+              <w:left w:val="single" w:sz="6" w:space="0" w:color="CCCCCC"/>
+              <w:bottom w:val="single" w:sz="6" w:space="0" w:color="000000"/>
+              <w:right w:val="single" w:sz="6" w:space="0" w:color="000000"/>
+            </w:tcBorders>
+            <w:shd w:val="clear" w:color="auto" w:fill="B6D7A8"/>
+            <w:tcMar>
+              <w:top w:w="30" w:type="dxa"/>
+              <w:left w:w="45" w:type="dxa"/>
+              <w:bottom w:w="30" w:type="dxa"/>
+              <w:right w:w="45" w:type="dxa"/>
+            </w:tcMar>
+            <w:vAlign w:val="bottom"/>
+            <w:hideMark/>
+          </w:tcPr>
+          <w:p>
+            <w:pPr>
+              <w:spacing w:after="0" w:line="240" w:lineRule="auto"/>
+              <w:rPr>
+                <w:rFonts w:ascii="Times New Roman" w:eastAsia="Times New Roman" w:hAnsi="Times New Roman" w:cs="Times New Roman"/>
+                <w:sz w:val="20"/>
+                <w:szCs w:val="20"/>
+              </w:rPr>
+            </w:pPr>
+          </w:p>
+        </w:tc>
+        <w:tc>
+          <w:tcPr>
+            <w:tcW w:w="0" w:type="auto"/>
+            <w:tcBorders>
+              <w:top w:val="single" w:sz="6" w:space="0" w:color="CCCCCC"/>
+              <w:left w:val="single" w:sz="6" w:space="0" w:color="CCCCCC"/>
+              <w:bottom w:val="single" w:sz="6" w:space="0" w:color="000000"/>
+              <w:right w:val="single" w:sz="6" w:space="0" w:color="000000"/>
+            </w:tcBorders>
+            <w:shd w:val="clear" w:color="auto" w:fill="B6D7A8"/>
+            <w:tcMar>
+              <w:top w:w="30" w:type="dxa"/>
+              <w:left w:w="45" w:type="dxa"/>
+              <w:bottom w:w="30" w:type="dxa"/>
+              <w:right w:w="45" w:type="dxa"/>
+            </w:tcMar>
+            <w:vAlign w:val="bottom"/>
+            <w:hideMark/>
+          </w:tcPr>
+          <w:p>
+            <w:pPr>
+              <w:spacing w:after="0" w:line="240" w:lineRule="auto"/>
+              <w:rPr>
+                <w:rFonts w:ascii="Times New Roman" w:eastAsia="Times New Roman" w:hAnsi="Times New Roman" w:cs="Times New Roman"/>
+                <w:sz w:val="20"/>
+                <w:szCs w:val="20"/>
+              </w:rPr>
+            </w:pPr>
+          </w:p>
+        </w:tc>
+        <w:tc>
+          <w:tcPr>
+            <w:tcW w:w="0" w:type="auto"/>
+            <w:tcBorders>
+              <w:top w:val="single" w:sz="6" w:space="0" w:color="CCCCCC"/>
+              <w:left w:val="single" w:sz="6" w:space="0" w:color="CCCCCC"/>
+              <w:bottom w:val="single" w:sz="6" w:space="0" w:color="000000"/>
+              <w:right w:val="single" w:sz="6" w:space="0" w:color="000000"/>
+            </w:tcBorders>
+            <w:shd w:val="clear" w:color="auto" w:fill="B6D7A8"/>
+            <w:tcMar>
+              <w:top w:w="30" w:type="dxa"/>
+              <w:left w:w="45" w:type="dxa"/>
+              <w:bottom w:w="30" w:type="dxa"/>
+              <w:right w:w="45" w:type="dxa"/>
+            </w:tcMar>
+            <w:vAlign w:val="bottom"/>
+            <w:hideMark/>
+          </w:tcPr>
+          <w:p>
+            <w:pPr>
+              <w:spacing w:after="0" w:line="240" w:lineRule="auto"/>
+              <w:rPr>
+                <w:rFonts w:ascii="Times New Roman" w:eastAsia="Times New Roman" w:hAnsi="Times New Roman" w:cs="Times New Roman"/>
+                <w:sz w:val="20"/>
+                <w:szCs w:val="20"/>
+              </w:rPr>
+            </w:pPr>
+          </w:p>
+        </w:tc>
+        <w:tc>
+          <w:tcPr>
+            <w:tcW w:w="0" w:type="auto"/>
+            <w:tcBorders>
+              <w:top w:val="single" w:sz="6" w:space="0" w:color="CCCCCC"/>
+              <w:left w:val="single" w:sz="6" w:space="0" w:color="CCCCCC"/>
+              <w:bottom w:val="single" w:sz="6" w:space="0" w:color="000000"/>
+              <w:right w:val="single" w:sz="6" w:space="0" w:color="000000"/>
+            </w:tcBorders>
+            <w:shd w:val="clear" w:color="auto" w:fill="B6D7A8"/>
+            <w:tcMar>
+              <w:top w:w="30" w:type="dxa"/>
+              <w:left w:w="45" w:type="dxa"/>
+              <w:bottom w:w="30" w:type="dxa"/>
+              <w:right w:w="45" w:type="dxa"/>
+            </w:tcMar>
+            <w:vAlign w:val="bottom"/>
+            <w:hideMark/>
+          </w:tcPr>
+          <w:p>
+            <w:pPr>
+              <w:spacing w:after="0" w:line="240" w:lineRule="auto"/>
+              <w:rPr>
+                <w:rFonts w:ascii="Times New Roman" w:eastAsia="Times New Roman" w:hAnsi="Times New Roman" w:cs="Times New Roman"/>
+                <w:sz w:val="20"/>
+                <w:szCs w:val="20"/>
+              </w:rPr>
+            </w:pPr>
+          </w:p>
+        </w:tc>
+        <w:tc>
+          <w:tcPr>
+            <w:tcW w:w="0" w:type="auto"/>
+            <w:tcBorders>
+              <w:top w:val="single" w:sz="6" w:space="0" w:color="CCCCCC"/>
+              <w:left w:val="single" w:sz="6" w:space="0" w:color="CCCCCC"/>
+              <w:bottom w:val="single" w:sz="6" w:space="0" w:color="000000"/>
+              <w:right w:val="single" w:sz="6" w:space="0" w:color="000000"/>
+            </w:tcBorders>
+            <w:shd w:val="clear" w:color="auto" w:fill="B6D7A8"/>
+            <w:tcMar>
+              <w:top w:w="30" w:type="dxa"/>
+              <w:left w:w="45" w:type="dxa"/>
+              <w:bottom w:w="30" w:type="dxa"/>
+              <w:right w:w="45" w:type="dxa"/>
+            </w:tcMar>
+            <w:vAlign w:val="bottom"/>
+            <w:hideMark/>
+          </w:tcPr>
+          <w:p>
+            <w:pPr>
+              <w:spacing w:after="0" w:line="240" w:lineRule="auto"/>
+              <w:rPr>
+                <w:rFonts w:ascii="Times New Roman" w:eastAsia="Times New Roman" w:hAnsi="Times New Roman" w:cs="Times New Roman"/>
+                <w:sz w:val="20"/>
+                <w:szCs w:val="20"/>
+              </w:rPr>
+            </w:pPr>
+          </w:p>
+        </w:tc>
+      </w:tr>
+      <w:tr>
+        <w:trPr>
+          <w:trHeight w:val="315"/>
+        </w:trPr>
+        <w:tc>
+          <w:tcPr>
+            <w:tcW w:w="0" w:type="auto"/>
+            <w:tcBorders>
+              <w:top w:val="single" w:sz="6" w:space="0" w:color="CCCCCC"/>
+              <w:left w:val="single" w:sz="6" w:space="0" w:color="000000"/>
+              <w:bottom w:val="single" w:sz="6" w:space="0" w:color="000000"/>
+              <w:right w:val="single" w:sz="6" w:space="0" w:color="000000"/>
+            </w:tcBorders>
+            <w:shd w:val="clear" w:color="auto" w:fill="B6D7A8"/>
+            <w:tcMar>
+              <w:top w:w="30" w:type="dxa"/>
+              <w:left w:w="45" w:type="dxa"/>
+              <w:bottom w:w="30" w:type="dxa"/>
+              <w:right w:w="45" w:type="dxa"/>
+            </w:tcMar>
+            <w:vAlign w:val="bottom"/>
+            <w:hideMark/>
+          </w:tcPr>
+          <w:p>
+            <w:pPr>
+              <w:spacing w:after="0" w:line="240" w:lineRule="auto"/>
+              <w:jc w:val="center"/>
+              <w:rPr>
+                <w:rFonts w:eastAsia="Times New Roman"/>
+              </w:rPr>
+            </w:pPr>
+            <w:r>
+              <w:rPr>
+                <w:rFonts w:eastAsia="Times New Roman"/>
+              </w:rPr>
+              <w:t>RNF2</w:t>
+            </w:r>
+          </w:p>
+        </w:tc>
+        <w:tc>
+          <w:tcPr>
+            <w:tcW w:w="0" w:type="auto"/>
+            <w:tcBorders>
+              <w:top w:val="single" w:sz="6" w:space="0" w:color="CCCCCC"/>
+              <w:left w:val="single" w:sz="6" w:space="0" w:color="CCCCCC"/>
+              <w:bottom w:val="single" w:sz="6" w:space="0" w:color="000000"/>
+              <w:right w:val="single" w:sz="6" w:space="0" w:color="000000"/>
+            </w:tcBorders>
+            <w:shd w:val="clear" w:color="auto" w:fill="B6D7A8"/>
+            <w:tcMar>
+              <w:top w:w="30" w:type="dxa"/>
+              <w:left w:w="45" w:type="dxa"/>
+              <w:bottom w:w="30" w:type="dxa"/>
+              <w:right w:w="45" w:type="dxa"/>
+            </w:tcMar>
+            <w:vAlign w:val="bottom"/>
+            <w:hideMark/>
+          </w:tcPr>
+          <w:p>
+            <w:pPr>
+              <w:spacing w:after="0" w:line="240" w:lineRule="auto"/>
+              <w:rPr>
+                <w:rFonts w:ascii="Arial" w:eastAsia="Times New Roman" w:hAnsi="Arial" w:cs="Arial"/>
+                <w:sz w:val="20"/>
+                <w:szCs w:val="20"/>
+              </w:rPr>
+            </w:pPr>
+            <w:r>
+              <w:rPr>
+                <w:rFonts w:ascii="Arial" w:eastAsia="Times New Roman" w:hAnsi="Arial" w:cs="Arial"/>
+                <w:sz w:val="20"/>
+                <w:szCs w:val="20"/>
+              </w:rPr>
+              <w:t>Accesibilidad multiplataforma</w:t>
+            </w:r>
+          </w:p>
+        </w:tc>
+        <w:tc>
+          <w:tcPr>
+            <w:tcW w:w="0" w:type="auto"/>
+            <w:tcBorders>
+              <w:top w:val="single" w:sz="6" w:space="0" w:color="CCCCCC"/>
+              <w:left w:val="single" w:sz="6" w:space="0" w:color="CCCCCC"/>
+              <w:bottom w:val="single" w:sz="6" w:space="0" w:color="000000"/>
+              <w:right w:val="single" w:sz="6" w:space="0" w:color="000000"/>
+            </w:tcBorders>
+            <w:shd w:val="clear" w:color="auto" w:fill="B6D7A8"/>
+            <w:tcMar>
+              <w:top w:w="30" w:type="dxa"/>
+              <w:left w:w="45" w:type="dxa"/>
+              <w:bottom w:w="30" w:type="dxa"/>
+              <w:right w:w="45" w:type="dxa"/>
+            </w:tcMar>
+            <w:vAlign w:val="bottom"/>
+            <w:hideMark/>
+          </w:tcPr>
+          <w:p>
+            <w:pPr>
+              <w:spacing w:after="0" w:line="240" w:lineRule="auto"/>
+              <w:rPr>
+                <w:rFonts w:ascii="Arial" w:eastAsia="Times New Roman" w:hAnsi="Arial" w:cs="Arial"/>
+                <w:sz w:val="20"/>
+                <w:szCs w:val="20"/>
+              </w:rPr>
+            </w:pPr>
+            <w:r>
+              <w:rPr>
+                <w:rFonts w:ascii="Arial" w:eastAsia="Times New Roman" w:hAnsi="Arial" w:cs="Arial"/>
+                <w:sz w:val="20"/>
+                <w:szCs w:val="20"/>
+              </w:rPr>
+              <w:t>La plataforma debe ser accesible desde navegadores web modernos, tanto en computadoras como en dispositivos móviles.</w:t>
+            </w:r>
+          </w:p>
+        </w:tc>
+        <w:tc>
+          <w:tcPr>
+            <w:tcW w:w="0" w:type="auto"/>
+            <w:tcBorders>
+              <w:top w:val="single" w:sz="6" w:space="0" w:color="CCCCCC"/>
+              <w:left w:val="single" w:sz="6" w:space="0" w:color="CCCCCC"/>
+              <w:bottom w:val="single" w:sz="6" w:space="0" w:color="000000"/>
+              <w:right w:val="single" w:sz="6" w:space="0" w:color="000000"/>
+            </w:tcBorders>
+            <w:shd w:val="clear" w:color="auto" w:fill="B6D7A8"/>
+            <w:tcMar>
+              <w:top w:w="30" w:type="dxa"/>
+              <w:left w:w="45" w:type="dxa"/>
+              <w:bottom w:w="30" w:type="dxa"/>
+              <w:right w:w="45" w:type="dxa"/>
+            </w:tcMar>
+            <w:vAlign w:val="bottom"/>
+            <w:hideMark/>
+          </w:tcPr>
+          <w:p>
+            <w:pPr>
+              <w:spacing w:after="0" w:line="240" w:lineRule="auto"/>
+              <w:rPr>
+                <w:rFonts w:eastAsia="Times New Roman"/>
+              </w:rPr>
+            </w:pPr>
+            <w:r>
+              <w:rPr>
+                <w:rFonts w:eastAsia="Times New Roman"/>
+              </w:rPr>
+              <w:t>Alta</w:t>
+            </w:r>
+          </w:p>
+        </w:tc>
+        <w:tc>
+          <w:tcPr>
+            <w:tcW w:w="0" w:type="auto"/>
+            <w:tcBorders>
+              <w:top w:val="single" w:sz="6" w:space="0" w:color="CCCCCC"/>
+              <w:left w:val="single" w:sz="6" w:space="0" w:color="CCCCCC"/>
+              <w:bottom w:val="single" w:sz="6" w:space="0" w:color="000000"/>
+              <w:right w:val="single" w:sz="6" w:space="0" w:color="000000"/>
+            </w:tcBorders>
+            <w:shd w:val="clear" w:color="auto" w:fill="B6D7A8"/>
+            <w:tcMar>
+              <w:top w:w="30" w:type="dxa"/>
+              <w:left w:w="45" w:type="dxa"/>
+              <w:bottom w:w="30" w:type="dxa"/>
+              <w:right w:w="45" w:type="dxa"/>
+            </w:tcMar>
+            <w:vAlign w:val="bottom"/>
+            <w:hideMark/>
+          </w:tcPr>
+          <w:p>
+            <w:pPr>
+              <w:spacing w:after="0" w:line="240" w:lineRule="auto"/>
+              <w:rPr>
+                <w:rFonts w:eastAsia="Times New Roman"/>
+              </w:rPr>
+            </w:pPr>
+            <w:r>
+              <w:rPr>
+                <w:rFonts w:eastAsia="Times New Roman"/>
+              </w:rPr>
+              <w:t>Necesario</w:t>
+            </w:r>
+          </w:p>
+        </w:tc>
+        <w:tc>
+          <w:tcPr>
+            <w:tcW w:w="0" w:type="auto"/>
+            <w:tcBorders>
+              <w:top w:val="single" w:sz="6" w:space="0" w:color="CCCCCC"/>
+              <w:left w:val="single" w:sz="6" w:space="0" w:color="CCCCCC"/>
+              <w:bottom w:val="single" w:sz="6" w:space="0" w:color="000000"/>
+              <w:right w:val="single" w:sz="6" w:space="0" w:color="000000"/>
+            </w:tcBorders>
+            <w:shd w:val="clear" w:color="auto" w:fill="B6D7A8"/>
+            <w:tcMar>
+              <w:top w:w="30" w:type="dxa"/>
+              <w:left w:w="45" w:type="dxa"/>
+              <w:bottom w:w="30" w:type="dxa"/>
+              <w:right w:w="45" w:type="dxa"/>
+            </w:tcMar>
+            <w:vAlign w:val="bottom"/>
+            <w:hideMark/>
+          </w:tcPr>
+          <w:p>
+            <w:pPr>
+              <w:spacing w:after="0" w:line="240" w:lineRule="auto"/>
+              <w:rPr>
+                <w:rFonts w:eastAsia="Times New Roman"/>
+              </w:rPr>
+            </w:pPr>
+            <w:r>
+              <w:rPr>
+                <w:rFonts w:eastAsia="Times New Roman"/>
+              </w:rPr>
+              <w:t>En Proceso</w:t>
+            </w:r>
+          </w:p>
+        </w:tc>
+        <w:tc>
+          <w:tcPr>
+            <w:tcW w:w="0" w:type="auto"/>
+            <w:tcBorders>
+              <w:top w:val="single" w:sz="6" w:space="0" w:color="CCCCCC"/>
+              <w:left w:val="single" w:sz="6" w:space="0" w:color="CCCCCC"/>
+              <w:bottom w:val="single" w:sz="6" w:space="0" w:color="000000"/>
+              <w:right w:val="single" w:sz="6" w:space="0" w:color="000000"/>
+            </w:tcBorders>
+            <w:shd w:val="clear" w:color="auto" w:fill="B6D7A8"/>
+            <w:tcMar>
+              <w:top w:w="30" w:type="dxa"/>
+              <w:left w:w="45" w:type="dxa"/>
+              <w:bottom w:w="30" w:type="dxa"/>
+              <w:right w:w="45" w:type="dxa"/>
+            </w:tcMar>
+            <w:vAlign w:val="bottom"/>
+            <w:hideMark/>
+          </w:tcPr>
+          <w:p>
+            <w:pPr>
+              <w:spacing w:after="0" w:line="240" w:lineRule="auto"/>
+              <w:rPr>
+                <w:rFonts w:eastAsia="Times New Roman"/>
+              </w:rPr>
+            </w:pPr>
+            <w:r>
+              <w:rPr>
+                <w:rFonts w:eastAsia="Times New Roman"/>
+              </w:rPr>
+              <w:t>Media</w:t>
+            </w:r>
+          </w:p>
+        </w:tc>
+      </w:tr>
+      <w:tr>
+        <w:trPr>
+          <w:trHeight w:val="315"/>
+        </w:trPr>
+        <w:tc>
+          <w:tcPr>
+            <w:tcW w:w="0" w:type="auto"/>
+            <w:tcBorders>
+              <w:top w:val="single" w:sz="6" w:space="0" w:color="CCCCCC"/>
+              <w:left w:val="single" w:sz="6" w:space="0" w:color="000000"/>
+              <w:bottom w:val="single" w:sz="6" w:space="0" w:color="000000"/>
+              <w:right w:val="single" w:sz="6" w:space="0" w:color="000000"/>
+            </w:tcBorders>
+            <w:shd w:val="clear" w:color="auto" w:fill="B6D7A8"/>
+            <w:tcMar>
+              <w:top w:w="30" w:type="dxa"/>
+              <w:left w:w="45" w:type="dxa"/>
+              <w:bottom w:w="30" w:type="dxa"/>
+              <w:right w:w="45" w:type="dxa"/>
+            </w:tcMar>
+            <w:vAlign w:val="bottom"/>
+            <w:hideMark/>
+          </w:tcPr>
+          <w:p>
+            <w:pPr>
+              <w:spacing w:after="0" w:line="240" w:lineRule="auto"/>
+              <w:jc w:val="center"/>
+              <w:rPr>
+                <w:rFonts w:eastAsia="Times New Roman"/>
+              </w:rPr>
+            </w:pPr>
+            <w:r>
+              <w:rPr>
+                <w:rFonts w:eastAsia="Times New Roman"/>
+              </w:rPr>
+              <w:t>RNF3</w:t>
+            </w:r>
+          </w:p>
+        </w:tc>
+        <w:tc>
+          <w:tcPr>
+            <w:tcW w:w="0" w:type="auto"/>
+            <w:tcBorders>
+              <w:top w:val="single" w:sz="6" w:space="0" w:color="CCCCCC"/>
+              <w:left w:val="single" w:sz="6" w:space="0" w:color="CCCCCC"/>
+              <w:bottom w:val="single" w:sz="6" w:space="0" w:color="000000"/>
+              <w:right w:val="single" w:sz="6" w:space="0" w:color="000000"/>
+            </w:tcBorders>
+            <w:shd w:val="clear" w:color="auto" w:fill="B6D7A8"/>
+            <w:tcMar>
+              <w:top w:w="30" w:type="dxa"/>
+              <w:left w:w="45" w:type="dxa"/>
+              <w:bottom w:w="30" w:type="dxa"/>
+              <w:right w:w="45" w:type="dxa"/>
+            </w:tcMar>
+            <w:vAlign w:val="bottom"/>
+            <w:hideMark/>
+          </w:tcPr>
+          <w:p>
+            <w:pPr>
+              <w:spacing w:after="0" w:line="240" w:lineRule="auto"/>
+              <w:rPr>
+                <w:rFonts w:ascii="Arial" w:eastAsia="Times New Roman" w:hAnsi="Arial" w:cs="Arial"/>
+                <w:sz w:val="20"/>
+                <w:szCs w:val="20"/>
+              </w:rPr>
+            </w:pPr>
+            <w:r>
+              <w:rPr>
+                <w:rFonts w:ascii="Arial" w:eastAsia="Times New Roman" w:hAnsi="Arial" w:cs="Arial"/>
+                <w:sz w:val="20"/>
+                <w:szCs w:val="20"/>
+              </w:rPr>
+              <w:t>Seguridad de la información</w:t>
+            </w:r>
+          </w:p>
+        </w:tc>
+        <w:tc>
+          <w:tcPr>
+            <w:tcW w:w="0" w:type="auto"/>
+            <w:tcBorders>
+              <w:top w:val="single" w:sz="6" w:space="0" w:color="CCCCCC"/>
+              <w:left w:val="single" w:sz="6" w:space="0" w:color="CCCCCC"/>
+              <w:bottom w:val="single" w:sz="6" w:space="0" w:color="000000"/>
+              <w:right w:val="single" w:sz="6" w:space="0" w:color="000000"/>
+            </w:tcBorders>
+            <w:shd w:val="clear" w:color="auto" w:fill="B6D7A8"/>
+            <w:tcMar>
+              <w:top w:w="30" w:type="dxa"/>
+              <w:left w:w="45" w:type="dxa"/>
+              <w:bottom w:w="30" w:type="dxa"/>
+              <w:right w:w="45" w:type="dxa"/>
+            </w:tcMar>
+            <w:vAlign w:val="bottom"/>
+            <w:hideMark/>
+          </w:tcPr>
+          <w:p>
+            <w:pPr>
+              <w:spacing w:after="0" w:line="240" w:lineRule="auto"/>
+              <w:rPr>
+                <w:rFonts w:ascii="Arial" w:eastAsia="Times New Roman" w:hAnsi="Arial" w:cs="Arial"/>
+                <w:sz w:val="20"/>
+                <w:szCs w:val="20"/>
+              </w:rPr>
+            </w:pPr>
+            <w:r>
+              <w:rPr>
+                <w:rFonts w:ascii="Arial" w:eastAsia="Times New Roman" w:hAnsi="Arial" w:cs="Arial"/>
+                <w:sz w:val="20"/>
+                <w:szCs w:val="20"/>
+              </w:rPr>
+              <w:t xml:space="preserve">La información introducida por los usuarios y los documentos generados deben estar protegidos </w:t>
+            </w:r>
+            <w:r>
+              <w:rPr>
+                <w:rFonts w:ascii="Arial" w:eastAsia="Times New Roman" w:hAnsi="Arial" w:cs="Arial"/>
+                <w:sz w:val="20"/>
+                <w:szCs w:val="20"/>
+              </w:rPr>
+              <w:lastRenderedPageBreak/>
+              <w:t>con autenticación, cifrado y control de acceso.</w:t>
+            </w:r>
+          </w:p>
+        </w:tc>
+        <w:tc>
+          <w:tcPr>
+            <w:tcW w:w="0" w:type="auto"/>
+            <w:tcBorders>
+              <w:top w:val="single" w:sz="6" w:space="0" w:color="CCCCCC"/>
+              <w:left w:val="single" w:sz="6" w:space="0" w:color="CCCCCC"/>
+              <w:bottom w:val="single" w:sz="6" w:space="0" w:color="000000"/>
+              <w:right w:val="single" w:sz="6" w:space="0" w:color="000000"/>
+            </w:tcBorders>
+            <w:shd w:val="clear" w:color="auto" w:fill="B6D7A8"/>
+            <w:tcMar>
+              <w:top w:w="30" w:type="dxa"/>
+              <w:left w:w="45" w:type="dxa"/>
+              <w:bottom w:w="30" w:type="dxa"/>
+              <w:right w:w="45" w:type="dxa"/>
+            </w:tcMar>
+            <w:vAlign w:val="bottom"/>
+            <w:hideMark/>
+          </w:tcPr>
+          <w:p>
+            <w:pPr>
+              <w:spacing w:after="0" w:line="240" w:lineRule="auto"/>
+              <w:rPr>
+                <w:rFonts w:eastAsia="Times New Roman"/>
+              </w:rPr>
+            </w:pPr>
+            <w:r>
+              <w:rPr>
+                <w:rFonts w:eastAsia="Times New Roman"/>
+              </w:rPr>
+              <w:lastRenderedPageBreak/>
+              <w:t>Alta</w:t>
+            </w:r>
+          </w:p>
+        </w:tc>
+        <w:tc>
+          <w:tcPr>
+            <w:tcW w:w="0" w:type="auto"/>
+            <w:tcBorders>
+              <w:top w:val="single" w:sz="6" w:space="0" w:color="CCCCCC"/>
+              <w:left w:val="single" w:sz="6" w:space="0" w:color="CCCCCC"/>
+              <w:bottom w:val="single" w:sz="6" w:space="0" w:color="000000"/>
+              <w:right w:val="single" w:sz="6" w:space="0" w:color="000000"/>
+            </w:tcBorders>
+            <w:shd w:val="clear" w:color="auto" w:fill="B6D7A8"/>
+            <w:tcMar>
+              <w:top w:w="30" w:type="dxa"/>
+              <w:left w:w="45" w:type="dxa"/>
+              <w:bottom w:w="30" w:type="dxa"/>
+              <w:right w:w="45" w:type="dxa"/>
+            </w:tcMar>
+            <w:vAlign w:val="bottom"/>
+            <w:hideMark/>
+          </w:tcPr>
+          <w:p>
+            <w:pPr>
+              <w:spacing w:after="0" w:line="240" w:lineRule="auto"/>
+              <w:rPr>
+                <w:rFonts w:eastAsia="Times New Roman"/>
+              </w:rPr>
+            </w:pPr>
+            <w:r>
+              <w:rPr>
+                <w:rFonts w:eastAsia="Times New Roman"/>
+              </w:rPr>
+              <w:t>Necesario</w:t>
+            </w:r>
+          </w:p>
+        </w:tc>
+        <w:tc>
+          <w:tcPr>
+            <w:tcW w:w="0" w:type="auto"/>
+            <w:tcBorders>
+              <w:top w:val="single" w:sz="6" w:space="0" w:color="CCCCCC"/>
+              <w:left w:val="single" w:sz="6" w:space="0" w:color="CCCCCC"/>
+              <w:bottom w:val="single" w:sz="6" w:space="0" w:color="000000"/>
+              <w:right w:val="single" w:sz="6" w:space="0" w:color="000000"/>
+            </w:tcBorders>
+            <w:shd w:val="clear" w:color="auto" w:fill="B6D7A8"/>
+            <w:tcMar>
+              <w:top w:w="30" w:type="dxa"/>
+              <w:left w:w="45" w:type="dxa"/>
+              <w:bottom w:w="30" w:type="dxa"/>
+              <w:right w:w="45" w:type="dxa"/>
+            </w:tcMar>
+            <w:vAlign w:val="bottom"/>
+            <w:hideMark/>
+          </w:tcPr>
+          <w:p>
+            <w:pPr>
+              <w:spacing w:after="0" w:line="240" w:lineRule="auto"/>
+              <w:rPr>
+                <w:rFonts w:eastAsia="Times New Roman"/>
+              </w:rPr>
+            </w:pPr>
+            <w:r>
+              <w:rPr>
+                <w:rFonts w:eastAsia="Times New Roman"/>
+              </w:rPr>
+              <w:t>En Proceso</w:t>
+            </w:r>
+          </w:p>
+        </w:tc>
+        <w:tc>
+          <w:tcPr>
+            <w:tcW w:w="0" w:type="auto"/>
+            <w:tcBorders>
+              <w:top w:val="single" w:sz="6" w:space="0" w:color="CCCCCC"/>
+              <w:left w:val="single" w:sz="6" w:space="0" w:color="CCCCCC"/>
+              <w:bottom w:val="single" w:sz="6" w:space="0" w:color="000000"/>
+              <w:right w:val="single" w:sz="6" w:space="0" w:color="000000"/>
+            </w:tcBorders>
+            <w:shd w:val="clear" w:color="auto" w:fill="B6D7A8"/>
+            <w:tcMar>
+              <w:top w:w="30" w:type="dxa"/>
+              <w:left w:w="45" w:type="dxa"/>
+              <w:bottom w:w="30" w:type="dxa"/>
+              <w:right w:w="45" w:type="dxa"/>
+            </w:tcMar>
+            <w:vAlign w:val="bottom"/>
+            <w:hideMark/>
+          </w:tcPr>
+          <w:p>
+            <w:pPr>
+              <w:spacing w:after="0" w:line="240" w:lineRule="auto"/>
+              <w:rPr>
+                <w:rFonts w:eastAsia="Times New Roman"/>
+              </w:rPr>
+            </w:pPr>
+            <w:r>
+              <w:rPr>
+                <w:rFonts w:eastAsia="Times New Roman"/>
+              </w:rPr>
+              <w:t>Media</w:t>
+            </w:r>
+          </w:p>
+        </w:tc>
+      </w:tr>
+      <w:tr>
+        <w:trPr>
+          <w:trHeight w:val="315"/>
+        </w:trPr>
+        <w:tc>
+          <w:tcPr>
+            <w:tcW w:w="0" w:type="auto"/>
+            <w:tcBorders>
+              <w:top w:val="single" w:sz="6" w:space="0" w:color="CCCCCC"/>
+              <w:left w:val="single" w:sz="6" w:space="0" w:color="000000"/>
+              <w:bottom w:val="single" w:sz="6" w:space="0" w:color="000000"/>
+              <w:right w:val="single" w:sz="6" w:space="0" w:color="000000"/>
+            </w:tcBorders>
+            <w:shd w:val="clear" w:color="auto" w:fill="B6D7A8"/>
+            <w:tcMar>
+              <w:top w:w="30" w:type="dxa"/>
+              <w:left w:w="45" w:type="dxa"/>
+              <w:bottom w:w="30" w:type="dxa"/>
+              <w:right w:w="45" w:type="dxa"/>
+            </w:tcMar>
+            <w:vAlign w:val="bottom"/>
+            <w:hideMark/>
+          </w:tcPr>
+          <w:p>
+            <w:pPr>
+              <w:spacing w:after="0" w:line="240" w:lineRule="auto"/>
+              <w:rPr>
+                <w:rFonts w:eastAsia="Times New Roman"/>
+              </w:rPr>
+            </w:pPr>
+          </w:p>
+        </w:tc>
+        <w:tc>
+          <w:tcPr>
+            <w:tcW w:w="0" w:type="auto"/>
+            <w:tcBorders>
+              <w:top w:val="single" w:sz="6" w:space="0" w:color="CCCCCC"/>
+              <w:left w:val="single" w:sz="6" w:space="0" w:color="CCCCCC"/>
+              <w:bottom w:val="single" w:sz="6" w:space="0" w:color="000000"/>
+              <w:right w:val="single" w:sz="6" w:space="0" w:color="000000"/>
+            </w:tcBorders>
+            <w:shd w:val="clear" w:color="auto" w:fill="B6D7A8"/>
+            <w:tcMar>
+              <w:top w:w="30" w:type="dxa"/>
+              <w:left w:w="45" w:type="dxa"/>
+              <w:bottom w:w="30" w:type="dxa"/>
+              <w:right w:w="45" w:type="dxa"/>
+            </w:tcMar>
+            <w:vAlign w:val="bottom"/>
+            <w:hideMark/>
+          </w:tcPr>
+          <w:p>
+            <w:pPr>
+              <w:spacing w:after="0" w:line="240" w:lineRule="auto"/>
+              <w:rPr>
+                <w:rFonts w:ascii="Times New Roman" w:eastAsia="Times New Roman" w:hAnsi="Times New Roman" w:cs="Times New Roman"/>
+                <w:sz w:val="20"/>
+                <w:szCs w:val="20"/>
+              </w:rPr>
+            </w:pPr>
+          </w:p>
+        </w:tc>
+        <w:tc>
+          <w:tcPr>
+            <w:tcW w:w="0" w:type="auto"/>
+            <w:tcBorders>
+              <w:top w:val="single" w:sz="6" w:space="0" w:color="CCCCCC"/>
+              <w:left w:val="single" w:sz="6" w:space="0" w:color="CCCCCC"/>
+              <w:bottom w:val="single" w:sz="6" w:space="0" w:color="000000"/>
+              <w:right w:val="single" w:sz="6" w:space="0" w:color="000000"/>
+            </w:tcBorders>
+            <w:shd w:val="clear" w:color="auto" w:fill="B6D7A8"/>
+            <w:tcMar>
+              <w:top w:w="30" w:type="dxa"/>
+              <w:left w:w="45" w:type="dxa"/>
+              <w:bottom w:w="30" w:type="dxa"/>
+              <w:right w:w="45" w:type="dxa"/>
+            </w:tcMar>
+            <w:vAlign w:val="bottom"/>
+            <w:hideMark/>
+          </w:tcPr>
+          <w:p>
+            <w:pPr>
+              <w:spacing w:after="0" w:line="240" w:lineRule="auto"/>
+              <w:rPr>
+                <w:rFonts w:ascii="Times New Roman" w:eastAsia="Times New Roman" w:hAnsi="Times New Roman" w:cs="Times New Roman"/>
+                <w:sz w:val="20"/>
+                <w:szCs w:val="20"/>
+              </w:rPr>
+            </w:pPr>
+          </w:p>
+        </w:tc>
+        <w:tc>
+          <w:tcPr>
+            <w:tcW w:w="0" w:type="auto"/>
+            <w:tcBorders>
+              <w:top w:val="single" w:sz="6" w:space="0" w:color="CCCCCC"/>
+              <w:left w:val="single" w:sz="6" w:space="0" w:color="CCCCCC"/>
+              <w:bottom w:val="single" w:sz="6" w:space="0" w:color="000000"/>
+              <w:right w:val="single" w:sz="6" w:space="0" w:color="000000"/>
+            </w:tcBorders>
+            <w:shd w:val="clear" w:color="auto" w:fill="B6D7A8"/>
+            <w:tcMar>
+              <w:top w:w="30" w:type="dxa"/>
+              <w:left w:w="45" w:type="dxa"/>
+              <w:bottom w:w="30" w:type="dxa"/>
+              <w:right w:w="45" w:type="dxa"/>
+            </w:tcMar>
+            <w:vAlign w:val="bottom"/>
+            <w:hideMark/>
+          </w:tcPr>
+          <w:p>
+            <w:pPr>
+              <w:spacing w:after="0" w:line="240" w:lineRule="auto"/>
+              <w:rPr>
+                <w:rFonts w:ascii="Times New Roman" w:eastAsia="Times New Roman" w:hAnsi="Times New Roman" w:cs="Times New Roman"/>
+                <w:sz w:val="20"/>
+                <w:szCs w:val="20"/>
+              </w:rPr>
+            </w:pPr>
+          </w:p>
+        </w:tc>
+        <w:tc>
+          <w:tcPr>
+            <w:tcW w:w="0" w:type="auto"/>
+            <w:tcBorders>
+              <w:top w:val="single" w:sz="6" w:space="0" w:color="CCCCCC"/>
+              <w:left w:val="single" w:sz="6" w:space="0" w:color="CCCCCC"/>
+              <w:bottom w:val="single" w:sz="6" w:space="0" w:color="000000"/>
+              <w:right w:val="single" w:sz="6" w:space="0" w:color="000000"/>
+            </w:tcBorders>
+            <w:shd w:val="clear" w:color="auto" w:fill="B6D7A8"/>
+            <w:tcMar>
+              <w:top w:w="30" w:type="dxa"/>
+              <w:left w:w="45" w:type="dxa"/>
+              <w:bottom w:w="30" w:type="dxa"/>
+              <w:right w:w="45" w:type="dxa"/>
+            </w:tcMar>
+            <w:vAlign w:val="bottom"/>
+            <w:hideMark/>
+          </w:tcPr>
+          <w:p>
+            <w:pPr>
+              <w:spacing w:after="0" w:line="240" w:lineRule="auto"/>
+              <w:rPr>
+                <w:rFonts w:ascii="Times New Roman" w:eastAsia="Times New Roman" w:hAnsi="Times New Roman" w:cs="Times New Roman"/>
+                <w:sz w:val="20"/>
+                <w:szCs w:val="20"/>
+              </w:rPr>
+            </w:pPr>
+          </w:p>
+        </w:tc>
+        <w:tc>
+          <w:tcPr>
+            <w:tcW w:w="0" w:type="auto"/>
+            <w:tcBorders>
+              <w:top w:val="single" w:sz="6" w:space="0" w:color="CCCCCC"/>
+              <w:left w:val="single" w:sz="6" w:space="0" w:color="CCCCCC"/>
+              <w:bottom w:val="single" w:sz="6" w:space="0" w:color="000000"/>
+              <w:right w:val="single" w:sz="6" w:space="0" w:color="000000"/>
+            </w:tcBorders>
+            <w:shd w:val="clear" w:color="auto" w:fill="B6D7A8"/>
+            <w:tcMar>
+              <w:top w:w="30" w:type="dxa"/>
+              <w:left w:w="45" w:type="dxa"/>
+              <w:bottom w:w="30" w:type="dxa"/>
+              <w:right w:w="45" w:type="dxa"/>
+            </w:tcMar>
+            <w:vAlign w:val="bottom"/>
+            <w:hideMark/>
+          </w:tcPr>
+          <w:p>
+            <w:pPr>
+              <w:spacing w:after="0" w:line="240" w:lineRule="auto"/>
+              <w:rPr>
+                <w:rFonts w:ascii="Times New Roman" w:eastAsia="Times New Roman" w:hAnsi="Times New Roman" w:cs="Times New Roman"/>
+                <w:sz w:val="20"/>
+                <w:szCs w:val="20"/>
+              </w:rPr>
+            </w:pPr>
+          </w:p>
+        </w:tc>
+        <w:tc>
+          <w:tcPr>
+            <w:tcW w:w="0" w:type="auto"/>
+            <w:tcBorders>
+              <w:top w:val="single" w:sz="6" w:space="0" w:color="CCCCCC"/>
+              <w:left w:val="single" w:sz="6" w:space="0" w:color="CCCCCC"/>
+              <w:bottom w:val="single" w:sz="6" w:space="0" w:color="000000"/>
+              <w:right w:val="single" w:sz="6" w:space="0" w:color="000000"/>
+            </w:tcBorders>
+            <w:shd w:val="clear" w:color="auto" w:fill="B6D7A8"/>
+            <w:tcMar>
+              <w:top w:w="30" w:type="dxa"/>
+              <w:left w:w="45" w:type="dxa"/>
+              <w:bottom w:w="30" w:type="dxa"/>
+              <w:right w:w="45" w:type="dxa"/>
+            </w:tcMar>
+            <w:vAlign w:val="bottom"/>
+            <w:hideMark/>
+          </w:tcPr>
+          <w:p>
+            <w:pPr>
+              <w:spacing w:after="0" w:line="240" w:lineRule="auto"/>
+              <w:rPr>
+                <w:rFonts w:ascii="Times New Roman" w:eastAsia="Times New Roman" w:hAnsi="Times New Roman" w:cs="Times New Roman"/>
+                <w:sz w:val="20"/>
+                <w:szCs w:val="20"/>
+              </w:rPr>
+            </w:pPr>
+          </w:p>
+        </w:tc>
+      </w:tr>
+      <w:tr>
+        <w:trPr>
+          <w:trHeight w:val="315"/>
+        </w:trPr>
+        <w:tc>
+          <w:tcPr>
+            <w:tcW w:w="0" w:type="auto"/>
+            <w:tcBorders>
+              <w:top w:val="single" w:sz="6" w:space="0" w:color="CCCCCC"/>
+              <w:left w:val="single" w:sz="6" w:space="0" w:color="000000"/>
+              <w:bottom w:val="single" w:sz="6" w:space="0" w:color="000000"/>
+              <w:right w:val="single" w:sz="6" w:space="0" w:color="000000"/>
+            </w:tcBorders>
+            <w:shd w:val="clear" w:color="auto" w:fill="B6D7A8"/>
+            <w:tcMar>
+              <w:top w:w="30" w:type="dxa"/>
+              <w:left w:w="45" w:type="dxa"/>
+              <w:bottom w:w="30" w:type="dxa"/>
+              <w:right w:w="45" w:type="dxa"/>
+            </w:tcMar>
+            <w:vAlign w:val="bottom"/>
+            <w:hideMark/>
+          </w:tcPr>
+          <w:p>
+            <w:pPr>
+              <w:spacing w:after="0" w:line="240" w:lineRule="auto"/>
+              <w:jc w:val="center"/>
+              <w:rPr>
+                <w:rFonts w:eastAsia="Times New Roman"/>
+              </w:rPr>
+            </w:pPr>
+            <w:r>
+              <w:rPr>
+                <w:rFonts w:eastAsia="Times New Roman"/>
+              </w:rPr>
+              <w:t>RNF4</w:t>
+            </w:r>
+          </w:p>
+        </w:tc>
+        <w:tc>
+          <w:tcPr>
+            <w:tcW w:w="0" w:type="auto"/>
+            <w:tcBorders>
+              <w:top w:val="single" w:sz="6" w:space="0" w:color="CCCCCC"/>
+              <w:left w:val="single" w:sz="6" w:space="0" w:color="CCCCCC"/>
+              <w:bottom w:val="single" w:sz="6" w:space="0" w:color="000000"/>
+              <w:right w:val="single" w:sz="6" w:space="0" w:color="000000"/>
+            </w:tcBorders>
+            <w:shd w:val="clear" w:color="auto" w:fill="B6D7A8"/>
+            <w:tcMar>
+              <w:top w:w="30" w:type="dxa"/>
+              <w:left w:w="45" w:type="dxa"/>
+              <w:bottom w:w="30" w:type="dxa"/>
+              <w:right w:w="45" w:type="dxa"/>
+            </w:tcMar>
+            <w:vAlign w:val="bottom"/>
+            <w:hideMark/>
+          </w:tcPr>
+          <w:p>
+            <w:pPr>
+              <w:spacing w:after="0" w:line="240" w:lineRule="auto"/>
+              <w:rPr>
+                <w:rFonts w:ascii="Arial" w:eastAsia="Times New Roman" w:hAnsi="Arial" w:cs="Arial"/>
+                <w:sz w:val="20"/>
+                <w:szCs w:val="20"/>
+              </w:rPr>
+            </w:pPr>
+            <w:r>
+              <w:rPr>
+                <w:rFonts w:ascii="Arial" w:eastAsia="Times New Roman" w:hAnsi="Arial" w:cs="Arial"/>
+                <w:sz w:val="20"/>
+                <w:szCs w:val="20"/>
+              </w:rPr>
+              <w:t>Escalabilidad</w:t>
+            </w:r>
+          </w:p>
+        </w:tc>
+        <w:tc>
+          <w:tcPr>
+            <w:tcW w:w="0" w:type="auto"/>
+            <w:tcBorders>
+              <w:top w:val="single" w:sz="6" w:space="0" w:color="CCCCCC"/>
+              <w:left w:val="single" w:sz="6" w:space="0" w:color="CCCCCC"/>
+              <w:bottom w:val="single" w:sz="6" w:space="0" w:color="000000"/>
+              <w:right w:val="single" w:sz="6" w:space="0" w:color="000000"/>
+            </w:tcBorders>
+            <w:shd w:val="clear" w:color="auto" w:fill="B6D7A8"/>
+            <w:tcMar>
+              <w:top w:w="30" w:type="dxa"/>
+              <w:left w:w="45" w:type="dxa"/>
+              <w:bottom w:w="30" w:type="dxa"/>
+              <w:right w:w="45" w:type="dxa"/>
+            </w:tcMar>
+            <w:vAlign w:val="bottom"/>
+            <w:hideMark/>
+          </w:tcPr>
+          <w:p>
+            <w:pPr>
+              <w:spacing w:after="0" w:line="240" w:lineRule="auto"/>
+              <w:rPr>
+                <w:rFonts w:ascii="Arial" w:eastAsia="Times New Roman" w:hAnsi="Arial" w:cs="Arial"/>
+                <w:sz w:val="20"/>
+                <w:szCs w:val="20"/>
+              </w:rPr>
+            </w:pPr>
+            <w:r>
+              <w:rPr>
+                <w:rFonts w:ascii="Arial" w:eastAsia="Times New Roman" w:hAnsi="Arial" w:cs="Arial"/>
+                <w:sz w:val="20"/>
+                <w:szCs w:val="20"/>
+              </w:rPr>
+              <w:t>La plataforma debe estar preparada para escalar en cuanto a número de usuarios y tipos de formatos a futuro.</w:t>
+            </w:r>
+          </w:p>
+        </w:tc>
+        <w:tc>
+          <w:tcPr>
+            <w:tcW w:w="0" w:type="auto"/>
+            <w:tcBorders>
+              <w:top w:val="single" w:sz="6" w:space="0" w:color="CCCCCC"/>
+              <w:left w:val="single" w:sz="6" w:space="0" w:color="CCCCCC"/>
+              <w:bottom w:val="single" w:sz="6" w:space="0" w:color="000000"/>
+              <w:right w:val="single" w:sz="6" w:space="0" w:color="000000"/>
+            </w:tcBorders>
+            <w:shd w:val="clear" w:color="auto" w:fill="B6D7A8"/>
+            <w:tcMar>
+              <w:top w:w="30" w:type="dxa"/>
+              <w:left w:w="45" w:type="dxa"/>
+              <w:bottom w:w="30" w:type="dxa"/>
+              <w:right w:w="45" w:type="dxa"/>
+            </w:tcMar>
+            <w:vAlign w:val="bottom"/>
+            <w:hideMark/>
+          </w:tcPr>
+          <w:p>
+            <w:pPr>
+              <w:spacing w:after="0" w:line="240" w:lineRule="auto"/>
+              <w:rPr>
+                <w:rFonts w:eastAsia="Times New Roman"/>
+              </w:rPr>
+            </w:pPr>
+            <w:r>
+              <w:rPr>
+                <w:rFonts w:eastAsia="Times New Roman"/>
+              </w:rPr>
+              <w:t>Alta</w:t>
+            </w:r>
+          </w:p>
+        </w:tc>
+        <w:tc>
+          <w:tcPr>
+            <w:tcW w:w="0" w:type="auto"/>
+            <w:tcBorders>
+              <w:top w:val="single" w:sz="6" w:space="0" w:color="CCCCCC"/>
+              <w:left w:val="single" w:sz="6" w:space="0" w:color="CCCCCC"/>
+              <w:bottom w:val="single" w:sz="6" w:space="0" w:color="000000"/>
+              <w:right w:val="single" w:sz="6" w:space="0" w:color="000000"/>
+            </w:tcBorders>
+            <w:shd w:val="clear" w:color="auto" w:fill="B6D7A8"/>
+            <w:tcMar>
+              <w:top w:w="30" w:type="dxa"/>
+              <w:left w:w="45" w:type="dxa"/>
+              <w:bottom w:w="30" w:type="dxa"/>
+              <w:right w:w="45" w:type="dxa"/>
+            </w:tcMar>
+            <w:vAlign w:val="bottom"/>
+            <w:hideMark/>
+          </w:tcPr>
+          <w:p>
+            <w:pPr>
+              <w:spacing w:after="0" w:line="240" w:lineRule="auto"/>
+              <w:rPr>
+                <w:rFonts w:eastAsia="Times New Roman"/>
+              </w:rPr>
+            </w:pPr>
+            <w:r>
+              <w:rPr>
+                <w:rFonts w:eastAsia="Times New Roman"/>
+              </w:rPr>
+              <w:t>Necesario</w:t>
+            </w:r>
+          </w:p>
+        </w:tc>
+        <w:tc>
+          <w:tcPr>
+            <w:tcW w:w="0" w:type="auto"/>
+            <w:tcBorders>
+              <w:top w:val="single" w:sz="6" w:space="0" w:color="CCCCCC"/>
+              <w:left w:val="single" w:sz="6" w:space="0" w:color="CCCCCC"/>
+              <w:bottom w:val="single" w:sz="6" w:space="0" w:color="000000"/>
+              <w:right w:val="single" w:sz="6" w:space="0" w:color="000000"/>
+            </w:tcBorders>
+            <w:shd w:val="clear" w:color="auto" w:fill="B6D7A8"/>
+            <w:tcMar>
+              <w:top w:w="30" w:type="dxa"/>
+              <w:left w:w="45" w:type="dxa"/>
+              <w:bottom w:w="30" w:type="dxa"/>
+              <w:right w:w="45" w:type="dxa"/>
+            </w:tcMar>
+            <w:vAlign w:val="bottom"/>
+            <w:hideMark/>
+          </w:tcPr>
+          <w:p>
+            <w:pPr>
+              <w:spacing w:after="0" w:line="240" w:lineRule="auto"/>
+              <w:rPr>
+                <w:rFonts w:eastAsia="Times New Roman"/>
+              </w:rPr>
+            </w:pPr>
+            <w:r>
+              <w:rPr>
+                <w:rFonts w:eastAsia="Times New Roman"/>
+              </w:rPr>
+              <w:t>En Proceso</w:t>
+            </w:r>
+          </w:p>
+        </w:tc>
+        <w:tc>
+          <w:tcPr>
+            <w:tcW w:w="0" w:type="auto"/>
+            <w:tcBorders>
+              <w:top w:val="single" w:sz="6" w:space="0" w:color="CCCCCC"/>
+              <w:left w:val="single" w:sz="6" w:space="0" w:color="CCCCCC"/>
+              <w:bottom w:val="single" w:sz="6" w:space="0" w:color="000000"/>
+              <w:right w:val="single" w:sz="6" w:space="0" w:color="000000"/>
+            </w:tcBorders>
+            <w:shd w:val="clear" w:color="auto" w:fill="B6D7A8"/>
+            <w:tcMar>
+              <w:top w:w="30" w:type="dxa"/>
+              <w:left w:w="45" w:type="dxa"/>
+              <w:bottom w:w="30" w:type="dxa"/>
+              <w:right w:w="45" w:type="dxa"/>
+            </w:tcMar>
+            <w:vAlign w:val="bottom"/>
+            <w:hideMark/>
+          </w:tcPr>
+          <w:p>
+            <w:pPr>
+              <w:spacing w:after="0" w:line="240" w:lineRule="auto"/>
+              <w:rPr>
+                <w:rFonts w:eastAsia="Times New Roman"/>
+              </w:rPr>
+            </w:pPr>
+            <w:r>
+              <w:rPr>
+                <w:rFonts w:eastAsia="Times New Roman"/>
+              </w:rPr>
+              <w:t>Baja</w:t>
+            </w:r>
+          </w:p>
+        </w:tc>
+      </w:tr>
+      <w:tr>
+        <w:trPr>
+          <w:trHeight w:val="315"/>
+        </w:trPr>
+        <w:tc>
+          <w:tcPr>
+            <w:tcW w:w="0" w:type="auto"/>
+            <w:tcBorders>
+              <w:top w:val="single" w:sz="6" w:space="0" w:color="CCCCCC"/>
+              <w:left w:val="single" w:sz="6" w:space="0" w:color="000000"/>
+              <w:bottom w:val="single" w:sz="6" w:space="0" w:color="000000"/>
+              <w:right w:val="single" w:sz="6" w:space="0" w:color="000000"/>
+            </w:tcBorders>
+            <w:shd w:val="clear" w:color="auto" w:fill="B6D7A8"/>
+            <w:tcMar>
+              <w:top w:w="30" w:type="dxa"/>
+              <w:left w:w="45" w:type="dxa"/>
+              <w:bottom w:w="30" w:type="dxa"/>
+              <w:right w:w="45" w:type="dxa"/>
+            </w:tcMar>
+            <w:vAlign w:val="bottom"/>
+            <w:hideMark/>
+          </w:tcPr>
+          <w:p>
+            <w:pPr>
+              <w:spacing w:after="0" w:line="240" w:lineRule="auto"/>
+              <w:jc w:val="center"/>
+              <w:rPr>
+                <w:rFonts w:eastAsia="Times New Roman"/>
+              </w:rPr>
+            </w:pPr>
+            <w:r>
+              <w:rPr>
+                <w:rFonts w:eastAsia="Times New Roman"/>
+              </w:rPr>
+              <w:t>RNF5</w:t>
+            </w:r>
+          </w:p>
+        </w:tc>
+        <w:tc>
+          <w:tcPr>
+            <w:tcW w:w="0" w:type="auto"/>
+            <w:tcBorders>
+              <w:top w:val="single" w:sz="6" w:space="0" w:color="CCCCCC"/>
+              <w:left w:val="single" w:sz="6" w:space="0" w:color="CCCCCC"/>
+              <w:bottom w:val="single" w:sz="6" w:space="0" w:color="000000"/>
+              <w:right w:val="single" w:sz="6" w:space="0" w:color="000000"/>
+            </w:tcBorders>
+            <w:shd w:val="clear" w:color="auto" w:fill="B6D7A8"/>
+            <w:tcMar>
+              <w:top w:w="30" w:type="dxa"/>
+              <w:left w:w="45" w:type="dxa"/>
+              <w:bottom w:w="30" w:type="dxa"/>
+              <w:right w:w="45" w:type="dxa"/>
+            </w:tcMar>
+            <w:vAlign w:val="bottom"/>
+            <w:hideMark/>
+          </w:tcPr>
+          <w:p>
+            <w:pPr>
+              <w:spacing w:after="0" w:line="240" w:lineRule="auto"/>
+              <w:rPr>
+                <w:rFonts w:ascii="Arial" w:eastAsia="Times New Roman" w:hAnsi="Arial" w:cs="Arial"/>
+                <w:sz w:val="20"/>
+                <w:szCs w:val="20"/>
+              </w:rPr>
+            </w:pPr>
+            <w:r>
+              <w:rPr>
+                <w:rFonts w:ascii="Arial" w:eastAsia="Times New Roman" w:hAnsi="Arial" w:cs="Arial"/>
+                <w:sz w:val="20"/>
+                <w:szCs w:val="20"/>
+              </w:rPr>
+              <w:t>Compatibilidad con estándares documentales</w:t>
+            </w:r>
+          </w:p>
+        </w:tc>
+        <w:tc>
+          <w:tcPr>
+            <w:tcW w:w="0" w:type="auto"/>
+            <w:tcBorders>
+              <w:top w:val="single" w:sz="6" w:space="0" w:color="CCCCCC"/>
+              <w:left w:val="single" w:sz="6" w:space="0" w:color="CCCCCC"/>
+              <w:bottom w:val="single" w:sz="6" w:space="0" w:color="000000"/>
+              <w:right w:val="single" w:sz="6" w:space="0" w:color="000000"/>
+            </w:tcBorders>
+            <w:shd w:val="clear" w:color="auto" w:fill="B6D7A8"/>
+            <w:tcMar>
+              <w:top w:w="30" w:type="dxa"/>
+              <w:left w:w="45" w:type="dxa"/>
+              <w:bottom w:w="30" w:type="dxa"/>
+              <w:right w:w="45" w:type="dxa"/>
+            </w:tcMar>
+            <w:vAlign w:val="bottom"/>
+            <w:hideMark/>
+          </w:tcPr>
+          <w:p>
+            <w:pPr>
+              <w:spacing w:after="0" w:line="240" w:lineRule="auto"/>
+              <w:rPr>
+                <w:rFonts w:ascii="Arial" w:eastAsia="Times New Roman" w:hAnsi="Arial" w:cs="Arial"/>
+                <w:sz w:val="20"/>
+                <w:szCs w:val="20"/>
+              </w:rPr>
+            </w:pPr>
+            <w:r>
+              <w:rPr>
+                <w:rFonts w:ascii="Arial" w:eastAsia="Times New Roman" w:hAnsi="Arial" w:cs="Arial"/>
+                <w:sz w:val="20"/>
+                <w:szCs w:val="20"/>
+              </w:rPr>
+              <w:t>El contenido generado debe cumplir con los estándares y formatos establecidos en los manuales institucionales.</w:t>
+            </w:r>
+          </w:p>
+        </w:tc>
+        <w:tc>
+          <w:tcPr>
+            <w:tcW w:w="0" w:type="auto"/>
+            <w:tcBorders>
+              <w:top w:val="single" w:sz="6" w:space="0" w:color="CCCCCC"/>
+              <w:left w:val="single" w:sz="6" w:space="0" w:color="CCCCCC"/>
+              <w:bottom w:val="single" w:sz="6" w:space="0" w:color="000000"/>
+              <w:right w:val="single" w:sz="6" w:space="0" w:color="000000"/>
+            </w:tcBorders>
+            <w:shd w:val="clear" w:color="auto" w:fill="B6D7A8"/>
+            <w:tcMar>
+              <w:top w:w="30" w:type="dxa"/>
+              <w:left w:w="45" w:type="dxa"/>
+              <w:bottom w:w="30" w:type="dxa"/>
+              <w:right w:w="45" w:type="dxa"/>
+            </w:tcMar>
+            <w:vAlign w:val="bottom"/>
+            <w:hideMark/>
+          </w:tcPr>
+          <w:p>
+            <w:pPr>
+              <w:spacing w:after="0" w:line="240" w:lineRule="auto"/>
+              <w:rPr>
+                <w:rFonts w:eastAsia="Times New Roman"/>
+              </w:rPr>
+            </w:pPr>
+            <w:r>
+              <w:rPr>
+                <w:rFonts w:eastAsia="Times New Roman"/>
+              </w:rPr>
+              <w:t>Alta</w:t>
+            </w:r>
+          </w:p>
+        </w:tc>
+        <w:tc>
+          <w:tcPr>
+            <w:tcW w:w="0" w:type="auto"/>
+            <w:tcBorders>
+              <w:top w:val="single" w:sz="6" w:space="0" w:color="CCCCCC"/>
+              <w:left w:val="single" w:sz="6" w:space="0" w:color="CCCCCC"/>
+              <w:bottom w:val="single" w:sz="6" w:space="0" w:color="000000"/>
+              <w:right w:val="single" w:sz="6" w:space="0" w:color="000000"/>
+            </w:tcBorders>
+            <w:shd w:val="clear" w:color="auto" w:fill="B6D7A8"/>
+            <w:tcMar>
+              <w:top w:w="30" w:type="dxa"/>
+              <w:left w:w="45" w:type="dxa"/>
+              <w:bottom w:w="30" w:type="dxa"/>
+              <w:right w:w="45" w:type="dxa"/>
+            </w:tcMar>
+            <w:vAlign w:val="bottom"/>
+            <w:hideMark/>
+          </w:tcPr>
+          <w:p>
+            <w:pPr>
+              <w:spacing w:after="0" w:line="240" w:lineRule="auto"/>
+              <w:rPr>
+                <w:rFonts w:eastAsia="Times New Roman"/>
+              </w:rPr>
+            </w:pPr>
+            <w:r>
+              <w:rPr>
+                <w:rFonts w:eastAsia="Times New Roman"/>
+              </w:rPr>
+              <w:t>Necesario</w:t>
+            </w:r>
+          </w:p>
+        </w:tc>
+        <w:tc>
+          <w:tcPr>
+            <w:tcW w:w="0" w:type="auto"/>
+            <w:tcBorders>
+              <w:top w:val="single" w:sz="6" w:space="0" w:color="CCCCCC"/>
+              <w:left w:val="single" w:sz="6" w:space="0" w:color="CCCCCC"/>
+              <w:bottom w:val="single" w:sz="6" w:space="0" w:color="000000"/>
+              <w:right w:val="single" w:sz="6" w:space="0" w:color="000000"/>
+            </w:tcBorders>
+            <w:shd w:val="clear" w:color="auto" w:fill="B6D7A8"/>
+            <w:tcMar>
+              <w:top w:w="30" w:type="dxa"/>
+              <w:left w:w="45" w:type="dxa"/>
+              <w:bottom w:w="30" w:type="dxa"/>
+              <w:right w:w="45" w:type="dxa"/>
+            </w:tcMar>
+            <w:vAlign w:val="bottom"/>
+            <w:hideMark/>
+          </w:tcPr>
+          <w:p>
+            <w:pPr>
+              <w:spacing w:after="0" w:line="240" w:lineRule="auto"/>
+              <w:rPr>
+                <w:rFonts w:eastAsia="Times New Roman"/>
+              </w:rPr>
+            </w:pPr>
+            <w:r>
+              <w:rPr>
+                <w:rFonts w:eastAsia="Times New Roman"/>
+              </w:rPr>
+              <w:t>En Proceso</w:t>
+            </w:r>
+          </w:p>
+        </w:tc>
+        <w:tc>
+          <w:tcPr>
+            <w:tcW w:w="0" w:type="auto"/>
+            <w:tcBorders>
+              <w:top w:val="single" w:sz="6" w:space="0" w:color="CCCCCC"/>
+              <w:left w:val="single" w:sz="6" w:space="0" w:color="CCCCCC"/>
+              <w:bottom w:val="single" w:sz="6" w:space="0" w:color="000000"/>
+              <w:right w:val="single" w:sz="6" w:space="0" w:color="000000"/>
+            </w:tcBorders>
+            <w:shd w:val="clear" w:color="auto" w:fill="B6D7A8"/>
+            <w:tcMar>
+              <w:top w:w="30" w:type="dxa"/>
+              <w:left w:w="45" w:type="dxa"/>
+              <w:bottom w:w="30" w:type="dxa"/>
+              <w:right w:w="45" w:type="dxa"/>
+            </w:tcMar>
+            <w:vAlign w:val="bottom"/>
+            <w:hideMark/>
+          </w:tcPr>
+          <w:p>
+            <w:pPr>
+              <w:spacing w:after="0" w:line="240" w:lineRule="auto"/>
+              <w:rPr>
+                <w:rFonts w:eastAsia="Times New Roman"/>
+              </w:rPr>
+            </w:pPr>
+            <w:r>
+              <w:rPr>
+                <w:rFonts w:eastAsia="Times New Roman"/>
+              </w:rPr>
+              <w:t>Media</w:t>
+            </w:r>
+          </w:p>
+        </w:tc>
+      </w:tr>
+      <w:tr>
+        <w:trPr>
+          <w:trHeight w:val="315"/>
+        </w:trPr>
+        <w:tc>
+          <w:tcPr>
+            <w:tcW w:w="0" w:type="auto"/>
+            <w:tcBorders>
+              <w:top w:val="single" w:sz="6" w:space="0" w:color="CCCCCC"/>
+              <w:left w:val="single" w:sz="6" w:space="0" w:color="000000"/>
+              <w:bottom w:val="single" w:sz="6" w:space="0" w:color="000000"/>
+              <w:right w:val="single" w:sz="6" w:space="0" w:color="000000"/>
+            </w:tcBorders>
+            <w:shd w:val="clear" w:color="auto" w:fill="B6D7A8"/>
+            <w:tcMar>
+              <w:top w:w="30" w:type="dxa"/>
+              <w:left w:w="45" w:type="dxa"/>
+              <w:bottom w:w="30" w:type="dxa"/>
+              <w:right w:w="45" w:type="dxa"/>
+            </w:tcMar>
+            <w:vAlign w:val="bottom"/>
+            <w:hideMark/>
+          </w:tcPr>
+          <w:p>
+            <w:pPr>
+              <w:spacing w:after="0" w:line="240" w:lineRule="auto"/>
+              <w:jc w:val="center"/>
+              <w:rPr>
+                <w:rFonts w:eastAsia="Times New Roman"/>
+              </w:rPr>
+            </w:pPr>
+            <w:r>
+              <w:rPr>
+                <w:rFonts w:eastAsia="Times New Roman"/>
+              </w:rPr>
+              <w:t>RNF6</w:t>
+            </w:r>
+          </w:p>
+        </w:tc>
+        <w:tc>
+          <w:tcPr>
+            <w:tcW w:w="0" w:type="auto"/>
+            <w:tcBorders>
+              <w:top w:val="single" w:sz="6" w:space="0" w:color="CCCCCC"/>
+              <w:left w:val="single" w:sz="6" w:space="0" w:color="CCCCCC"/>
+              <w:bottom w:val="single" w:sz="6" w:space="0" w:color="000000"/>
+              <w:right w:val="single" w:sz="6" w:space="0" w:color="000000"/>
+            </w:tcBorders>
+            <w:shd w:val="clear" w:color="auto" w:fill="B6D7A8"/>
+            <w:tcMar>
+              <w:top w:w="30" w:type="dxa"/>
+              <w:left w:w="45" w:type="dxa"/>
+              <w:bottom w:w="30" w:type="dxa"/>
+              <w:right w:w="45" w:type="dxa"/>
+            </w:tcMar>
+            <w:vAlign w:val="bottom"/>
+            <w:hideMark/>
+          </w:tcPr>
+          <w:p>
+            <w:pPr>
+              <w:spacing w:after="0" w:line="240" w:lineRule="auto"/>
+              <w:jc w:val="center"/>
+              <w:rPr>
+                <w:rFonts w:eastAsia="Times New Roman"/>
+              </w:rPr>
+            </w:pPr>
+            <w:r>
+              <w:rPr>
+                <w:rFonts w:eastAsia="Times New Roman"/>
+              </w:rPr>
+              <w:t>Tolerancia a fallos</w:t>
+            </w:r>
+          </w:p>
+        </w:tc>
+        <w:tc>
+          <w:tcPr>
+            <w:tcW w:w="0" w:type="auto"/>
+            <w:tcBorders>
+              <w:top w:val="single" w:sz="6" w:space="0" w:color="CCCCCC"/>
+              <w:left w:val="single" w:sz="6" w:space="0" w:color="CCCCCC"/>
+              <w:bottom w:val="single" w:sz="6" w:space="0" w:color="000000"/>
+              <w:right w:val="single" w:sz="6" w:space="0" w:color="000000"/>
+            </w:tcBorders>
+            <w:shd w:val="clear" w:color="auto" w:fill="B6D7A8"/>
+            <w:tcMar>
+              <w:top w:w="30" w:type="dxa"/>
+              <w:left w:w="45" w:type="dxa"/>
+              <w:bottom w:w="30" w:type="dxa"/>
+              <w:right w:w="45" w:type="dxa"/>
+            </w:tcMar>
+            <w:vAlign w:val="bottom"/>
+            <w:hideMark/>
+          </w:tcPr>
+          <w:p>
+            <w:pPr>
+              <w:spacing w:after="0" w:line="240" w:lineRule="auto"/>
+              <w:jc w:val="center"/>
+              <w:rPr>
+                <w:rFonts w:eastAsia="Times New Roman"/>
+              </w:rPr>
+            </w:pPr>
+            <w:r>
+              <w:rPr>
+                <w:rFonts w:eastAsia="Times New Roman"/>
+              </w:rPr>
+              <w:t>En caso de fallo de una IA o servicio externo, el sistema debe mostrar un mensaje claro y permitir reintentar la generación.</w:t>
+            </w:r>
+          </w:p>
+        </w:tc>
+        <w:tc>
+          <w:tcPr>
+            <w:tcW w:w="0" w:type="auto"/>
+            <w:tcBorders>
+              <w:top w:val="single" w:sz="6" w:space="0" w:color="CCCCCC"/>
+              <w:left w:val="single" w:sz="6" w:space="0" w:color="CCCCCC"/>
+              <w:bottom w:val="single" w:sz="6" w:space="0" w:color="000000"/>
+              <w:right w:val="single" w:sz="6" w:space="0" w:color="000000"/>
+            </w:tcBorders>
+            <w:shd w:val="clear" w:color="auto" w:fill="B6D7A8"/>
+            <w:tcMar>
+              <w:top w:w="30" w:type="dxa"/>
+              <w:left w:w="45" w:type="dxa"/>
+              <w:bottom w:w="30" w:type="dxa"/>
+              <w:right w:w="45" w:type="dxa"/>
+            </w:tcMar>
+            <w:vAlign w:val="bottom"/>
+            <w:hideMark/>
+          </w:tcPr>
+          <w:p>
+            <w:pPr>
+              <w:spacing w:after="0" w:line="240" w:lineRule="auto"/>
+              <w:rPr>
+                <w:rFonts w:eastAsia="Times New Roman"/>
+              </w:rPr>
+            </w:pPr>
+            <w:r>
+              <w:rPr>
+                <w:rFonts w:eastAsia="Times New Roman"/>
+              </w:rPr>
+              <w:t>Alta</w:t>
+            </w:r>
+          </w:p>
+        </w:tc>
+        <w:tc>
+          <w:tcPr>
+            <w:tcW w:w="0" w:type="auto"/>
+            <w:tcBorders>
+              <w:top w:val="single" w:sz="6" w:space="0" w:color="CCCCCC"/>
+              <w:left w:val="single" w:sz="6" w:space="0" w:color="CCCCCC"/>
+              <w:bottom w:val="single" w:sz="6" w:space="0" w:color="000000"/>
+              <w:right w:val="single" w:sz="6" w:space="0" w:color="000000"/>
+            </w:tcBorders>
+            <w:shd w:val="clear" w:color="auto" w:fill="B6D7A8"/>
+            <w:tcMar>
+              <w:top w:w="30" w:type="dxa"/>
+              <w:left w:w="45" w:type="dxa"/>
+              <w:bottom w:w="30" w:type="dxa"/>
+              <w:right w:w="45" w:type="dxa"/>
+            </w:tcMar>
+            <w:vAlign w:val="bottom"/>
+            <w:hideMark/>
+          </w:tcPr>
+          <w:p>
+            <w:pPr>
+              <w:spacing w:after="0" w:line="240" w:lineRule="auto"/>
+              <w:rPr>
+                <w:rFonts w:eastAsia="Times New Roman"/>
+              </w:rPr>
+            </w:pPr>
+            <w:r>
+              <w:rPr>
+                <w:rFonts w:eastAsia="Times New Roman"/>
+              </w:rPr>
+              <w:t>Necesario</w:t>
+            </w:r>
+          </w:p>
+        </w:tc>
+        <w:tc>
+          <w:tcPr>
+            <w:tcW w:w="0" w:type="auto"/>
+            <w:tcBorders>
+              <w:top w:val="single" w:sz="6" w:space="0" w:color="CCCCCC"/>
+              <w:left w:val="single" w:sz="6" w:space="0" w:color="CCCCCC"/>
+              <w:bottom w:val="single" w:sz="6" w:space="0" w:color="000000"/>
+              <w:right w:val="single" w:sz="6" w:space="0" w:color="000000"/>
+            </w:tcBorders>
+            <w:shd w:val="clear" w:color="auto" w:fill="B6D7A8"/>
+            <w:tcMar>
+              <w:top w:w="30" w:type="dxa"/>
+              <w:left w:w="45" w:type="dxa"/>
+              <w:bottom w:w="30" w:type="dxa"/>
+              <w:right w:w="45" w:type="dxa"/>
+            </w:tcMar>
+            <w:vAlign w:val="bottom"/>
+            <w:hideMark/>
+          </w:tcPr>
+          <w:p>
+            <w:pPr>
+              <w:spacing w:after="0" w:line="240" w:lineRule="auto"/>
+              <w:rPr>
+                <w:rFonts w:eastAsia="Times New Roman"/>
+              </w:rPr>
+            </w:pPr>
+            <w:r>
+              <w:rPr>
+                <w:rFonts w:eastAsia="Times New Roman"/>
+              </w:rPr>
+              <w:t>En Proceso</w:t>
+            </w:r>
+          </w:p>
+        </w:tc>
+        <w:tc>
+          <w:tcPr>
+            <w:tcW w:w="0" w:type="auto"/>
+            <w:tcBorders>
+              <w:top w:val="single" w:sz="6" w:space="0" w:color="CCCCCC"/>
+              <w:left w:val="single" w:sz="6" w:space="0" w:color="CCCCCC"/>
+              <w:bottom w:val="single" w:sz="6" w:space="0" w:color="000000"/>
+              <w:right w:val="single" w:sz="6" w:space="0" w:color="000000"/>
+            </w:tcBorders>
+            <w:shd w:val="clear" w:color="auto" w:fill="B6D7A8"/>
+            <w:tcMar>
+              <w:top w:w="30" w:type="dxa"/>
+              <w:left w:w="45" w:type="dxa"/>
+              <w:bottom w:w="30" w:type="dxa"/>
+              <w:right w:w="45" w:type="dxa"/>
+            </w:tcMar>
+            <w:vAlign w:val="bottom"/>
+            <w:hideMark/>
+          </w:tcPr>
+          <w:p>
+            <w:pPr>
+              <w:spacing w:after="0" w:line="240" w:lineRule="auto"/>
+              <w:rPr>
+                <w:rFonts w:eastAsia="Times New Roman"/>
+              </w:rPr>
+            </w:pPr>
+            <w:r>
+              <w:rPr>
+                <w:rFonts w:eastAsia="Times New Roman"/>
+              </w:rPr>
+              <w:t>Media</w:t>
+            </w:r>
+          </w:p>
+        </w:tc>
+      </w:tr>
+      <w:tr>
+        <w:trPr>
+          <w:trHeight w:val="315"/>
+        </w:trPr>
+        <w:tc>
+          <w:tcPr>
+            <w:tcW w:w="0" w:type="auto"/>
+            <w:tcBorders>
+              <w:top w:val="single" w:sz="6" w:space="0" w:color="CCCCCC"/>
+              <w:left w:val="single" w:sz="6" w:space="0" w:color="000000"/>
+              <w:bottom w:val="single" w:sz="6" w:space="0" w:color="000000"/>
+              <w:right w:val="single" w:sz="6" w:space="0" w:color="000000"/>
+            </w:tcBorders>
+            <w:shd w:val="clear" w:color="auto" w:fill="B6D7A8"/>
+            <w:tcMar>
+              <w:top w:w="30" w:type="dxa"/>
+              <w:left w:w="45" w:type="dxa"/>
+              <w:bottom w:w="30" w:type="dxa"/>
+              <w:right w:w="45" w:type="dxa"/>
+            </w:tcMar>
+            <w:vAlign w:val="bottom"/>
+            <w:hideMark/>
+          </w:tcPr>
+          <w:p>
+            <w:pPr>
+              <w:spacing w:after="0" w:line="240" w:lineRule="auto"/>
+              <w:jc w:val="center"/>
+              <w:rPr>
+                <w:rFonts w:eastAsia="Times New Roman"/>
+              </w:rPr>
+            </w:pPr>
+            <w:r>
+              <w:rPr>
+                <w:rFonts w:eastAsia="Times New Roman"/>
+              </w:rPr>
+              <w:t>RNF7</w:t>
+            </w:r>
+          </w:p>
+        </w:tc>
+        <w:tc>
+          <w:tcPr>
+            <w:tcW w:w="0" w:type="auto"/>
+            <w:tcBorders>
+              <w:top w:val="single" w:sz="6" w:space="0" w:color="CCCCCC"/>
+              <w:left w:val="single" w:sz="6" w:space="0" w:color="CCCCCC"/>
+              <w:bottom w:val="single" w:sz="6" w:space="0" w:color="000000"/>
+              <w:right w:val="single" w:sz="6" w:space="0" w:color="000000"/>
+            </w:tcBorders>
+            <w:shd w:val="clear" w:color="auto" w:fill="B6D7A8"/>
+            <w:tcMar>
+              <w:top w:w="30" w:type="dxa"/>
+              <w:left w:w="45" w:type="dxa"/>
+              <w:bottom w:w="30" w:type="dxa"/>
+              <w:right w:w="45" w:type="dxa"/>
+            </w:tcMar>
+            <w:vAlign w:val="bottom"/>
+            <w:hideMark/>
+          </w:tcPr>
+          <w:p>
+            <w:pPr>
+              <w:spacing w:after="0" w:line="240" w:lineRule="auto"/>
+              <w:jc w:val="center"/>
+              <w:rPr>
+                <w:rFonts w:eastAsia="Times New Roman"/>
+              </w:rPr>
+            </w:pPr>
+            <w:r>
+              <w:rPr>
+                <w:rFonts w:eastAsia="Times New Roman"/>
+              </w:rPr>
+              <w:t>Registro de errores (log)</w:t>
+            </w:r>
+          </w:p>
+        </w:tc>
+        <w:tc>
+          <w:tcPr>
+            <w:tcW w:w="0" w:type="auto"/>
+            <w:tcBorders>
+              <w:top w:val="single" w:sz="6" w:space="0" w:color="CCCCCC"/>
+              <w:left w:val="single" w:sz="6" w:space="0" w:color="CCCCCC"/>
+              <w:bottom w:val="single" w:sz="6" w:space="0" w:color="000000"/>
+              <w:right w:val="single" w:sz="6" w:space="0" w:color="000000"/>
+            </w:tcBorders>
+            <w:shd w:val="clear" w:color="auto" w:fill="B6D7A8"/>
+            <w:tcMar>
+              <w:top w:w="30" w:type="dxa"/>
+              <w:left w:w="45" w:type="dxa"/>
+              <w:bottom w:w="30" w:type="dxa"/>
+              <w:right w:w="45" w:type="dxa"/>
+            </w:tcMar>
+            <w:vAlign w:val="bottom"/>
+            <w:hideMark/>
+          </w:tcPr>
+          <w:p>
+            <w:pPr>
+              <w:spacing w:after="0" w:line="240" w:lineRule="auto"/>
+              <w:jc w:val="center"/>
+              <w:rPr>
+                <w:rFonts w:eastAsia="Times New Roman"/>
+              </w:rPr>
+            </w:pPr>
+            <w:r>
+              <w:rPr>
+                <w:rFonts w:eastAsia="Times New Roman"/>
+              </w:rPr>
+              <w:t>El sistema debe registrar errores internos para fines de soporte y mejora continua.</w:t>
+            </w:r>
+          </w:p>
+        </w:tc>
+        <w:tc>
+          <w:tcPr>
+            <w:tcW w:w="0" w:type="auto"/>
+            <w:tcBorders>
+              <w:top w:val="single" w:sz="6" w:space="0" w:color="CCCCCC"/>
+              <w:left w:val="single" w:sz="6" w:space="0" w:color="CCCCCC"/>
+              <w:bottom w:val="single" w:sz="6" w:space="0" w:color="000000"/>
+              <w:right w:val="single" w:sz="6" w:space="0" w:color="000000"/>
+            </w:tcBorders>
+            <w:shd w:val="clear" w:color="auto" w:fill="B6D7A8"/>
+            <w:tcMar>
+              <w:top w:w="30" w:type="dxa"/>
+              <w:left w:w="45" w:type="dxa"/>
+              <w:bottom w:w="30" w:type="dxa"/>
+              <w:right w:w="45" w:type="dxa"/>
+            </w:tcMar>
+            <w:vAlign w:val="bottom"/>
+            <w:hideMark/>
+          </w:tcPr>
+          <w:p>
+            <w:pPr>
+              <w:spacing w:after="0" w:line="240" w:lineRule="auto"/>
+              <w:rPr>
+                <w:rFonts w:eastAsia="Times New Roman"/>
+              </w:rPr>
+            </w:pPr>
+            <w:r>
+              <w:rPr>
+                <w:rFonts w:eastAsia="Times New Roman"/>
+              </w:rPr>
+              <w:t>Alta</w:t>
+            </w:r>
+          </w:p>
+        </w:tc>
+        <w:tc>
+          <w:tcPr>
+            <w:tcW w:w="0" w:type="auto"/>
+            <w:tcBorders>
+              <w:top w:val="single" w:sz="6" w:space="0" w:color="CCCCCC"/>
+              <w:left w:val="single" w:sz="6" w:space="0" w:color="CCCCCC"/>
+              <w:bottom w:val="single" w:sz="6" w:space="0" w:color="000000"/>
+              <w:right w:val="single" w:sz="6" w:space="0" w:color="000000"/>
+            </w:tcBorders>
+            <w:shd w:val="clear" w:color="auto" w:fill="B6D7A8"/>
+            <w:tcMar>
+              <w:top w:w="30" w:type="dxa"/>
+              <w:left w:w="45" w:type="dxa"/>
+              <w:bottom w:w="30" w:type="dxa"/>
+              <w:right w:w="45" w:type="dxa"/>
+            </w:tcMar>
+            <w:vAlign w:val="bottom"/>
+            <w:hideMark/>
+          </w:tcPr>
+          <w:p>
+            <w:pPr>
+              <w:spacing w:after="0" w:line="240" w:lineRule="auto"/>
+              <w:rPr>
+                <w:rFonts w:eastAsia="Times New Roman"/>
+              </w:rPr>
+            </w:pPr>
+            <w:r>
+              <w:rPr>
+                <w:rFonts w:eastAsia="Times New Roman"/>
+              </w:rPr>
+              <w:t>Necesario</w:t>
+            </w:r>
+          </w:p>
+        </w:tc>
+        <w:tc>
+          <w:tcPr>
+            <w:tcW w:w="0" w:type="auto"/>
+            <w:tcBorders>
+              <w:top w:val="single" w:sz="6" w:space="0" w:color="CCCCCC"/>
+              <w:left w:val="single" w:sz="6" w:space="0" w:color="CCCCCC"/>
+              <w:bottom w:val="single" w:sz="6" w:space="0" w:color="000000"/>
+              <w:right w:val="single" w:sz="6" w:space="0" w:color="000000"/>
+            </w:tcBorders>
+            <w:shd w:val="clear" w:color="auto" w:fill="B6D7A8"/>
+            <w:tcMar>
+              <w:top w:w="30" w:type="dxa"/>
+              <w:left w:w="45" w:type="dxa"/>
+              <w:bottom w:w="30" w:type="dxa"/>
+              <w:right w:w="45" w:type="dxa"/>
+            </w:tcMar>
+            <w:vAlign w:val="bottom"/>
+            <w:hideMark/>
+          </w:tcPr>
+          <w:p>
+            <w:pPr>
+              <w:spacing w:after="0" w:line="240" w:lineRule="auto"/>
+              <w:rPr>
+                <w:rFonts w:eastAsia="Times New Roman"/>
+              </w:rPr>
+            </w:pPr>
+            <w:r>
+              <w:rPr>
+                <w:rFonts w:eastAsia="Times New Roman"/>
+              </w:rPr>
+              <w:t>En Proceso</w:t>
+            </w:r>
+          </w:p>
+        </w:tc>
+        <w:tc>
+          <w:tcPr>
+            <w:tcW w:w="0" w:type="auto"/>
+            <w:tcBorders>
+              <w:top w:val="single" w:sz="6" w:space="0" w:color="CCCCCC"/>
+              <w:left w:val="single" w:sz="6" w:space="0" w:color="CCCCCC"/>
+              <w:bottom w:val="single" w:sz="6" w:space="0" w:color="000000"/>
+              <w:right w:val="single" w:sz="6" w:space="0" w:color="000000"/>
+            </w:tcBorders>
+            <w:shd w:val="clear" w:color="auto" w:fill="B6D7A8"/>
+            <w:tcMar>
+              <w:top w:w="30" w:type="dxa"/>
+              <w:left w:w="45" w:type="dxa"/>
+              <w:bottom w:w="30" w:type="dxa"/>
+              <w:right w:w="45" w:type="dxa"/>
+            </w:tcMar>
+            <w:vAlign w:val="bottom"/>
+            <w:hideMark/>
+          </w:tcPr>
+          <w:p>
+            <w:pPr>
+              <w:spacing w:after="0" w:line="240" w:lineRule="auto"/>
+              <w:rPr>
+                <w:rFonts w:eastAsia="Times New Roman"/>
+              </w:rPr>
+            </w:pPr>
+            <w:r>
+              <w:rPr>
+                <w:rFonts w:eastAsia="Times New Roman"/>
+              </w:rPr>
+              <w:t>Media</w:t>
+            </w:r>
+          </w:p>
+        </w:tc>
+      </w:tr>
+      <w:tr>
+        <w:trPr>
+          <w:trHeight w:val="315"/>
+        </w:trPr>
+        <w:tc>
+          <w:tcPr>
+            <w:tcW w:w="0" w:type="auto"/>
+            <w:tcBorders>
+              <w:top w:val="single" w:sz="6" w:space="0" w:color="CCCCCC"/>
+              <w:left w:val="single" w:sz="6" w:space="0" w:color="000000"/>
+              <w:bottom w:val="single" w:sz="6" w:space="0" w:color="000000"/>
+              <w:right w:val="single" w:sz="6" w:space="0" w:color="000000"/>
+            </w:tcBorders>
+            <w:shd w:val="clear" w:color="auto" w:fill="B6D7A8"/>
+            <w:tcMar>
+              <w:top w:w="30" w:type="dxa"/>
+              <w:left w:w="45" w:type="dxa"/>
+              <w:bottom w:w="30" w:type="dxa"/>
+              <w:right w:w="45" w:type="dxa"/>
+            </w:tcMar>
+            <w:vAlign w:val="bottom"/>
+            <w:hideMark/>
+          </w:tcPr>
+          <w:p>
+            <w:pPr>
+              <w:spacing w:after="0" w:line="240" w:lineRule="auto"/>
+              <w:jc w:val="center"/>
+              <w:rPr>
+                <w:rFonts w:eastAsia="Times New Roman"/>
+              </w:rPr>
+            </w:pPr>
+            <w:r>
+              <w:rPr>
+                <w:rFonts w:eastAsia="Times New Roman"/>
+              </w:rPr>
+              <w:t>RNF8</w:t>
+            </w:r>
+          </w:p>
+        </w:tc>
+        <w:tc>
+          <w:tcPr>
+            <w:tcW w:w="0" w:type="auto"/>
+            <w:tcBorders>
+              <w:top w:val="single" w:sz="6" w:space="0" w:color="CCCCCC"/>
+              <w:left w:val="single" w:sz="6" w:space="0" w:color="CCCCCC"/>
+              <w:bottom w:val="single" w:sz="6" w:space="0" w:color="000000"/>
+              <w:right w:val="single" w:sz="6" w:space="0" w:color="000000"/>
+            </w:tcBorders>
+            <w:shd w:val="clear" w:color="auto" w:fill="B6D7A8"/>
+            <w:tcMar>
+              <w:top w:w="30" w:type="dxa"/>
+              <w:left w:w="45" w:type="dxa"/>
+              <w:bottom w:w="30" w:type="dxa"/>
+              <w:right w:w="45" w:type="dxa"/>
+            </w:tcMar>
+            <w:vAlign w:val="bottom"/>
+            <w:hideMark/>
+          </w:tcPr>
+          <w:p>
+            <w:pPr>
+              <w:spacing w:after="0" w:line="240" w:lineRule="auto"/>
+              <w:jc w:val="center"/>
+              <w:rPr>
+                <w:rFonts w:ascii="Times New Roman" w:eastAsia="Times New Roman" w:hAnsi="Times New Roman" w:cs="Times New Roman"/>
+              </w:rPr>
+            </w:pPr>
+            <w:r>
+              <w:rPr>
+                <w:rFonts w:ascii="Times New Roman" w:eastAsia="Times New Roman" w:hAnsi="Times New Roman" w:cs="Times New Roman"/>
+              </w:rPr>
+              <w:t>Interfaz adaptativa (responsive)</w:t>
+            </w:r>
+          </w:p>
+        </w:tc>
+        <w:tc>
+          <w:tcPr>
+            <w:tcW w:w="0" w:type="auto"/>
+            <w:tcBorders>
+              <w:top w:val="single" w:sz="6" w:space="0" w:color="CCCCCC"/>
+              <w:left w:val="single" w:sz="6" w:space="0" w:color="CCCCCC"/>
+              <w:bottom w:val="single" w:sz="6" w:space="0" w:color="000000"/>
+              <w:right w:val="single" w:sz="6" w:space="0" w:color="000000"/>
+            </w:tcBorders>
+            <w:shd w:val="clear" w:color="auto" w:fill="B6D7A8"/>
+            <w:tcMar>
+              <w:top w:w="30" w:type="dxa"/>
+              <w:left w:w="45" w:type="dxa"/>
+              <w:bottom w:w="30" w:type="dxa"/>
+              <w:right w:w="45" w:type="dxa"/>
+            </w:tcMar>
+            <w:vAlign w:val="bottom"/>
+            <w:hideMark/>
+          </w:tcPr>
+          <w:p>
+            <w:pPr>
+              <w:spacing w:after="0" w:line="240" w:lineRule="auto"/>
+              <w:rPr>
+                <w:rFonts w:ascii="Arial" w:eastAsia="Times New Roman" w:hAnsi="Arial" w:cs="Arial"/>
+                <w:sz w:val="20"/>
+                <w:szCs w:val="20"/>
+              </w:rPr>
+            </w:pPr>
+            <w:r>
+              <w:rPr>
+                <w:rFonts w:ascii="Arial" w:eastAsia="Times New Roman" w:hAnsi="Arial" w:cs="Arial"/>
+                <w:sz w:val="20"/>
+                <w:szCs w:val="20"/>
+              </w:rPr>
+              <w:t>El diseño debe adaptarse correctamente a distintos tamaños de pantalla (teléfono, tablet, laptop, escritorio).</w:t>
+            </w:r>
+          </w:p>
+        </w:tc>
+        <w:tc>
+          <w:tcPr>
+            <w:tcW w:w="0" w:type="auto"/>
+            <w:tcBorders>
+              <w:top w:val="single" w:sz="6" w:space="0" w:color="CCCCCC"/>
+              <w:left w:val="single" w:sz="6" w:space="0" w:color="CCCCCC"/>
+              <w:bottom w:val="single" w:sz="6" w:space="0" w:color="000000"/>
+              <w:right w:val="single" w:sz="6" w:space="0" w:color="000000"/>
+            </w:tcBorders>
+            <w:shd w:val="clear" w:color="auto" w:fill="B6D7A8"/>
+            <w:tcMar>
+              <w:top w:w="30" w:type="dxa"/>
+              <w:left w:w="45" w:type="dxa"/>
+              <w:bottom w:w="30" w:type="dxa"/>
+              <w:right w:w="45" w:type="dxa"/>
+            </w:tcMar>
+            <w:vAlign w:val="bottom"/>
+            <w:hideMark/>
+          </w:tcPr>
+          <w:p>
+            <w:pPr>
+              <w:spacing w:after="0" w:line="240" w:lineRule="auto"/>
+              <w:rPr>
+                <w:rFonts w:eastAsia="Times New Roman"/>
+              </w:rPr>
+            </w:pPr>
+            <w:r>
+              <w:rPr>
+                <w:rFonts w:eastAsia="Times New Roman"/>
+              </w:rPr>
+              <w:t>Alta</w:t>
+            </w:r>
+          </w:p>
+        </w:tc>
+        <w:tc>
+          <w:tcPr>
+            <w:tcW w:w="0" w:type="auto"/>
+            <w:tcBorders>
+              <w:top w:val="single" w:sz="6" w:space="0" w:color="CCCCCC"/>
+              <w:left w:val="single" w:sz="6" w:space="0" w:color="CCCCCC"/>
+              <w:bottom w:val="single" w:sz="6" w:space="0" w:color="000000"/>
+              <w:right w:val="single" w:sz="6" w:space="0" w:color="000000"/>
+            </w:tcBorders>
+            <w:shd w:val="clear" w:color="auto" w:fill="B6D7A8"/>
+            <w:tcMar>
+              <w:top w:w="30" w:type="dxa"/>
+              <w:left w:w="45" w:type="dxa"/>
+              <w:bottom w:w="30" w:type="dxa"/>
+              <w:right w:w="45" w:type="dxa"/>
+            </w:tcMar>
+            <w:vAlign w:val="bottom"/>
+            <w:hideMark/>
+          </w:tcPr>
+          <w:p>
+            <w:pPr>
+              <w:spacing w:after="0" w:line="240" w:lineRule="auto"/>
+              <w:rPr>
+                <w:rFonts w:eastAsia="Times New Roman"/>
+              </w:rPr>
+            </w:pPr>
+            <w:r>
+              <w:rPr>
+                <w:rFonts w:eastAsia="Times New Roman"/>
+              </w:rPr>
+              <w:t>Necesario</w:t>
+            </w:r>
+          </w:p>
+        </w:tc>
+        <w:tc>
+          <w:tcPr>
+            <w:tcW w:w="0" w:type="auto"/>
+            <w:tcBorders>
+              <w:top w:val="single" w:sz="6" w:space="0" w:color="CCCCCC"/>
+              <w:left w:val="single" w:sz="6" w:space="0" w:color="CCCCCC"/>
+              <w:bottom w:val="single" w:sz="6" w:space="0" w:color="000000"/>
+              <w:right w:val="single" w:sz="6" w:space="0" w:color="000000"/>
+            </w:tcBorders>
+            <w:shd w:val="clear" w:color="auto" w:fill="B6D7A8"/>
+            <w:tcMar>
+              <w:top w:w="30" w:type="dxa"/>
+              <w:left w:w="45" w:type="dxa"/>
+              <w:bottom w:w="30" w:type="dxa"/>
+              <w:right w:w="45" w:type="dxa"/>
+            </w:tcMar>
+            <w:vAlign w:val="bottom"/>
+            <w:hideMark/>
+          </w:tcPr>
+          <w:p>
+            <w:pPr>
+              <w:spacing w:after="0" w:line="240" w:lineRule="auto"/>
+              <w:rPr>
+                <w:rFonts w:eastAsia="Times New Roman"/>
+              </w:rPr>
+            </w:pPr>
+            <w:r>
+              <w:rPr>
+                <w:rFonts w:eastAsia="Times New Roman"/>
+              </w:rPr>
+              <w:t>En Proceso</w:t>
+            </w:r>
+          </w:p>
+        </w:tc>
+        <w:tc>
+          <w:tcPr>
+            <w:tcW w:w="0" w:type="auto"/>
+            <w:tcBorders>
+              <w:top w:val="single" w:sz="6" w:space="0" w:color="CCCCCC"/>
+              <w:left w:val="single" w:sz="6" w:space="0" w:color="CCCCCC"/>
+              <w:bottom w:val="single" w:sz="6" w:space="0" w:color="000000"/>
+              <w:right w:val="single" w:sz="6" w:space="0" w:color="000000"/>
+            </w:tcBorders>
+            <w:shd w:val="clear" w:color="auto" w:fill="B6D7A8"/>
+            <w:tcMar>
+              <w:top w:w="30" w:type="dxa"/>
+              <w:left w:w="45" w:type="dxa"/>
+              <w:bottom w:w="30" w:type="dxa"/>
+              <w:right w:w="45" w:type="dxa"/>
+            </w:tcMar>
+            <w:vAlign w:val="bottom"/>
+            <w:hideMark/>
+          </w:tcPr>
+          <w:p>
+            <w:pPr>
+              <w:spacing w:after="0" w:line="240" w:lineRule="auto"/>
+              <w:rPr>
+                <w:rFonts w:eastAsia="Times New Roman"/>
+              </w:rPr>
+            </w:pPr>
+            <w:r>
+              <w:rPr>
+                <w:rFonts w:eastAsia="Times New Roman"/>
+              </w:rPr>
+              <w:t>Media</w:t>
+            </w:r>
+          </w:p>
+        </w:tc>
+      </w:tr>
+    </w:tbl>
     <w:p>
       <w:pPr>
         <w:pStyle w:val="Ttulo2"/>
@@ -6395,8 +9148,6 @@
           <w:color w:val="000000" w:themeColor="text1"/>
         </w:rPr>
       </w:pPr>
-      <w:bookmarkStart w:id="24" w:name="_heading=h.pc21corewfy" w:colFirst="0" w:colLast="0"/>
-      <w:bookmarkEnd w:id="24"/>
     </w:p>
     <w:p>
       <w:pPr>
@@ -10866,6 +13617,7 @@
   <w:style w:type="character" w:default="1" w:styleId="Fuentedeprrafopredeter">
     <w:name w:val="Default Paragraph Font"/>
     <w:uiPriority w:val="1"/>
+    <w:semiHidden/>
     <w:unhideWhenUsed/>
   </w:style>
   <w:style w:type="table" w:default="1" w:styleId="Tablanormal">

</xml_diff>

<commit_message>
Implementacion de cuadro de requerimientos funcionales finales
</commit_message>
<xml_diff>
--- a/Documents/FD03-EPIS-Informe Especificación Requerimientos.docx
+++ b/Documents/FD03-EPIS-Informe Especificación Requerimientos.docx
@@ -9169,6 +9169,3005 @@
         <w:t>Cuadro de Requerimientos funcionales Final</w:t>
       </w:r>
     </w:p>
+    <w:tbl>
+      <w:tblPr>
+        <w:tblW w:w="0" w:type="dxa"/>
+        <w:tblCellMar>
+          <w:left w:w="0" w:type="dxa"/>
+          <w:right w:w="0" w:type="dxa"/>
+        </w:tblCellMar>
+        <w:tblLook w:val="04A0" w:firstRow="1" w:lastRow="0" w:firstColumn="1" w:lastColumn="0" w:noHBand="0" w:noVBand="1"/>
+      </w:tblPr>
+      <w:tblGrid>
+        <w:gridCol w:w="615"/>
+        <w:gridCol w:w="1720"/>
+        <w:gridCol w:w="1604"/>
+        <w:gridCol w:w="1044"/>
+        <w:gridCol w:w="1084"/>
+        <w:gridCol w:w="1214"/>
+        <w:gridCol w:w="1193"/>
+      </w:tblGrid>
+      <w:tr>
+        <w:trPr>
+          <w:trHeight w:val="315"/>
+        </w:trPr>
+        <w:tc>
+          <w:tcPr>
+            <w:tcW w:w="0" w:type="auto"/>
+            <w:gridSpan w:val="7"/>
+            <w:tcBorders>
+              <w:top w:val="single" w:sz="12" w:space="0" w:color="000000"/>
+              <w:left w:val="single" w:sz="12" w:space="0" w:color="000000"/>
+              <w:bottom w:val="single" w:sz="6" w:space="0" w:color="000000"/>
+              <w:right w:val="single" w:sz="12" w:space="0" w:color="000000"/>
+            </w:tcBorders>
+            <w:shd w:val="clear" w:color="auto" w:fill="3C78D8"/>
+            <w:tcMar>
+              <w:top w:w="30" w:type="dxa"/>
+              <w:left w:w="45" w:type="dxa"/>
+              <w:bottom w:w="30" w:type="dxa"/>
+              <w:right w:w="45" w:type="dxa"/>
+            </w:tcMar>
+            <w:vAlign w:val="bottom"/>
+            <w:hideMark/>
+          </w:tcPr>
+          <w:p>
+            <w:pPr>
+              <w:spacing w:after="0" w:line="240" w:lineRule="auto"/>
+              <w:jc w:val="center"/>
+              <w:rPr>
+                <w:rFonts w:eastAsia="Times New Roman"/>
+                <w:b/>
+                <w:bCs/>
+                <w:color w:val="FFFFFF"/>
+                <w:sz w:val="26"/>
+                <w:szCs w:val="26"/>
+              </w:rPr>
+            </w:pPr>
+            <w:r>
+              <w:rPr>
+                <w:rFonts w:eastAsia="Times New Roman"/>
+                <w:b/>
+                <w:bCs/>
+                <w:color w:val="FFFFFF"/>
+                <w:sz w:val="26"/>
+                <w:szCs w:val="26"/>
+              </w:rPr>
+              <w:t>Requerimientos Funcionales - GDI-IA</w:t>
+            </w:r>
+          </w:p>
+        </w:tc>
+      </w:tr>
+      <w:tr>
+        <w:trPr>
+          <w:trHeight w:val="315"/>
+        </w:trPr>
+        <w:tc>
+          <w:tcPr>
+            <w:tcW w:w="0" w:type="auto"/>
+            <w:tcBorders>
+              <w:top w:val="single" w:sz="6" w:space="0" w:color="CCCCCC"/>
+              <w:left w:val="single" w:sz="6" w:space="0" w:color="000000"/>
+              <w:bottom w:val="single" w:sz="6" w:space="0" w:color="000000"/>
+              <w:right w:val="single" w:sz="6" w:space="0" w:color="000000"/>
+            </w:tcBorders>
+            <w:shd w:val="clear" w:color="auto" w:fill="A4C2F4"/>
+            <w:tcMar>
+              <w:top w:w="30" w:type="dxa"/>
+              <w:left w:w="45" w:type="dxa"/>
+              <w:bottom w:w="30" w:type="dxa"/>
+              <w:right w:w="45" w:type="dxa"/>
+            </w:tcMar>
+            <w:vAlign w:val="bottom"/>
+            <w:hideMark/>
+          </w:tcPr>
+          <w:p>
+            <w:pPr>
+              <w:spacing w:after="0" w:line="240" w:lineRule="auto"/>
+              <w:rPr>
+                <w:rFonts w:eastAsia="Times New Roman"/>
+              </w:rPr>
+            </w:pPr>
+            <w:r>
+              <w:rPr>
+                <w:rFonts w:eastAsia="Times New Roman"/>
+              </w:rPr>
+              <w:t>REQS</w:t>
+            </w:r>
+          </w:p>
+        </w:tc>
+        <w:tc>
+          <w:tcPr>
+            <w:tcW w:w="0" w:type="auto"/>
+            <w:tcBorders>
+              <w:top w:val="single" w:sz="6" w:space="0" w:color="CCCCCC"/>
+              <w:left w:val="single" w:sz="6" w:space="0" w:color="CCCCCC"/>
+              <w:bottom w:val="single" w:sz="6" w:space="0" w:color="000000"/>
+              <w:right w:val="single" w:sz="6" w:space="0" w:color="000000"/>
+            </w:tcBorders>
+            <w:shd w:val="clear" w:color="auto" w:fill="A4C2F4"/>
+            <w:tcMar>
+              <w:top w:w="30" w:type="dxa"/>
+              <w:left w:w="45" w:type="dxa"/>
+              <w:bottom w:w="30" w:type="dxa"/>
+              <w:right w:w="45" w:type="dxa"/>
+            </w:tcMar>
+            <w:vAlign w:val="bottom"/>
+            <w:hideMark/>
+          </w:tcPr>
+          <w:p>
+            <w:pPr>
+              <w:spacing w:after="0" w:line="240" w:lineRule="auto"/>
+              <w:rPr>
+                <w:rFonts w:eastAsia="Times New Roman"/>
+              </w:rPr>
+            </w:pPr>
+            <w:r>
+              <w:rPr>
+                <w:rFonts w:eastAsia="Times New Roman"/>
+              </w:rPr>
+              <w:t>REQUERIMIENTO</w:t>
+            </w:r>
+          </w:p>
+        </w:tc>
+        <w:tc>
+          <w:tcPr>
+            <w:tcW w:w="0" w:type="auto"/>
+            <w:tcBorders>
+              <w:top w:val="single" w:sz="6" w:space="0" w:color="CCCCCC"/>
+              <w:left w:val="single" w:sz="6" w:space="0" w:color="CCCCCC"/>
+              <w:bottom w:val="single" w:sz="6" w:space="0" w:color="000000"/>
+              <w:right w:val="single" w:sz="6" w:space="0" w:color="000000"/>
+            </w:tcBorders>
+            <w:shd w:val="clear" w:color="auto" w:fill="A4C2F4"/>
+            <w:tcMar>
+              <w:top w:w="30" w:type="dxa"/>
+              <w:left w:w="45" w:type="dxa"/>
+              <w:bottom w:w="30" w:type="dxa"/>
+              <w:right w:w="45" w:type="dxa"/>
+            </w:tcMar>
+            <w:vAlign w:val="bottom"/>
+            <w:hideMark/>
+          </w:tcPr>
+          <w:p>
+            <w:pPr>
+              <w:spacing w:after="0" w:line="240" w:lineRule="auto"/>
+              <w:rPr>
+                <w:rFonts w:eastAsia="Times New Roman"/>
+              </w:rPr>
+            </w:pPr>
+            <w:r>
+              <w:rPr>
+                <w:rFonts w:eastAsia="Times New Roman"/>
+              </w:rPr>
+              <w:t>DESCRIPCION</w:t>
+            </w:r>
+          </w:p>
+        </w:tc>
+        <w:tc>
+          <w:tcPr>
+            <w:tcW w:w="0" w:type="auto"/>
+            <w:tcBorders>
+              <w:top w:val="single" w:sz="6" w:space="0" w:color="CCCCCC"/>
+              <w:left w:val="single" w:sz="6" w:space="0" w:color="CCCCCC"/>
+              <w:bottom w:val="single" w:sz="6" w:space="0" w:color="000000"/>
+              <w:right w:val="single" w:sz="6" w:space="0" w:color="000000"/>
+            </w:tcBorders>
+            <w:shd w:val="clear" w:color="auto" w:fill="A4C2F4"/>
+            <w:tcMar>
+              <w:top w:w="30" w:type="dxa"/>
+              <w:left w:w="45" w:type="dxa"/>
+              <w:bottom w:w="30" w:type="dxa"/>
+              <w:right w:w="45" w:type="dxa"/>
+            </w:tcMar>
+            <w:vAlign w:val="bottom"/>
+            <w:hideMark/>
+          </w:tcPr>
+          <w:p>
+            <w:pPr>
+              <w:spacing w:after="0" w:line="240" w:lineRule="auto"/>
+              <w:rPr>
+                <w:rFonts w:eastAsia="Times New Roman"/>
+              </w:rPr>
+            </w:pPr>
+            <w:r>
+              <w:rPr>
+                <w:rFonts w:eastAsia="Times New Roman"/>
+              </w:rPr>
+              <w:t>PRIORIDAD</w:t>
+            </w:r>
+          </w:p>
+        </w:tc>
+        <w:tc>
+          <w:tcPr>
+            <w:tcW w:w="0" w:type="auto"/>
+            <w:tcBorders>
+              <w:top w:val="single" w:sz="6" w:space="0" w:color="CCCCCC"/>
+              <w:left w:val="single" w:sz="6" w:space="0" w:color="CCCCCC"/>
+              <w:bottom w:val="single" w:sz="6" w:space="0" w:color="000000"/>
+              <w:right w:val="single" w:sz="6" w:space="0" w:color="000000"/>
+            </w:tcBorders>
+            <w:shd w:val="clear" w:color="auto" w:fill="A4C2F4"/>
+            <w:tcMar>
+              <w:top w:w="30" w:type="dxa"/>
+              <w:left w:w="45" w:type="dxa"/>
+              <w:bottom w:w="30" w:type="dxa"/>
+              <w:right w:w="45" w:type="dxa"/>
+            </w:tcMar>
+            <w:vAlign w:val="bottom"/>
+            <w:hideMark/>
+          </w:tcPr>
+          <w:p>
+            <w:pPr>
+              <w:spacing w:after="0" w:line="240" w:lineRule="auto"/>
+              <w:rPr>
+                <w:rFonts w:eastAsia="Times New Roman"/>
+              </w:rPr>
+            </w:pPr>
+            <w:r>
+              <w:rPr>
+                <w:rFonts w:eastAsia="Times New Roman"/>
+              </w:rPr>
+              <w:t>URGENCIAS</w:t>
+            </w:r>
+          </w:p>
+        </w:tc>
+        <w:tc>
+          <w:tcPr>
+            <w:tcW w:w="0" w:type="auto"/>
+            <w:tcBorders>
+              <w:top w:val="single" w:sz="6" w:space="0" w:color="CCCCCC"/>
+              <w:left w:val="single" w:sz="6" w:space="0" w:color="CCCCCC"/>
+              <w:bottom w:val="single" w:sz="6" w:space="0" w:color="000000"/>
+              <w:right w:val="single" w:sz="6" w:space="0" w:color="000000"/>
+            </w:tcBorders>
+            <w:shd w:val="clear" w:color="auto" w:fill="A4C2F4"/>
+            <w:tcMar>
+              <w:top w:w="30" w:type="dxa"/>
+              <w:left w:w="45" w:type="dxa"/>
+              <w:bottom w:w="30" w:type="dxa"/>
+              <w:right w:w="45" w:type="dxa"/>
+            </w:tcMar>
+            <w:vAlign w:val="bottom"/>
+            <w:hideMark/>
+          </w:tcPr>
+          <w:p>
+            <w:pPr>
+              <w:spacing w:after="0" w:line="240" w:lineRule="auto"/>
+              <w:rPr>
+                <w:rFonts w:eastAsia="Times New Roman"/>
+              </w:rPr>
+            </w:pPr>
+            <w:r>
+              <w:rPr>
+                <w:rFonts w:eastAsia="Times New Roman"/>
+              </w:rPr>
+              <w:t>ESTADO DE DESARROLLO</w:t>
+            </w:r>
+          </w:p>
+        </w:tc>
+        <w:tc>
+          <w:tcPr>
+            <w:tcW w:w="0" w:type="auto"/>
+            <w:tcBorders>
+              <w:top w:val="single" w:sz="6" w:space="0" w:color="CCCCCC"/>
+              <w:left w:val="single" w:sz="6" w:space="0" w:color="CCCCCC"/>
+              <w:bottom w:val="single" w:sz="6" w:space="0" w:color="000000"/>
+              <w:right w:val="single" w:sz="6" w:space="0" w:color="000000"/>
+            </w:tcBorders>
+            <w:shd w:val="clear" w:color="auto" w:fill="A4C2F4"/>
+            <w:tcMar>
+              <w:top w:w="30" w:type="dxa"/>
+              <w:left w:w="45" w:type="dxa"/>
+              <w:bottom w:w="30" w:type="dxa"/>
+              <w:right w:w="45" w:type="dxa"/>
+            </w:tcMar>
+            <w:vAlign w:val="bottom"/>
+            <w:hideMark/>
+          </w:tcPr>
+          <w:p>
+            <w:pPr>
+              <w:spacing w:after="0" w:line="240" w:lineRule="auto"/>
+              <w:rPr>
+                <w:rFonts w:eastAsia="Times New Roman"/>
+              </w:rPr>
+            </w:pPr>
+            <w:r>
+              <w:rPr>
+                <w:rFonts w:eastAsia="Times New Roman"/>
+              </w:rPr>
+              <w:t>ESTABILIDAD</w:t>
+            </w:r>
+          </w:p>
+        </w:tc>
+      </w:tr>
+      <w:tr>
+        <w:trPr>
+          <w:trHeight w:val="315"/>
+        </w:trPr>
+        <w:tc>
+          <w:tcPr>
+            <w:tcW w:w="0" w:type="auto"/>
+            <w:tcBorders>
+              <w:top w:val="single" w:sz="6" w:space="0" w:color="CCCCCC"/>
+              <w:left w:val="single" w:sz="6" w:space="0" w:color="000000"/>
+              <w:bottom w:val="single" w:sz="6" w:space="0" w:color="000000"/>
+              <w:right w:val="single" w:sz="6" w:space="0" w:color="000000"/>
+            </w:tcBorders>
+            <w:shd w:val="clear" w:color="auto" w:fill="A4C2F4"/>
+            <w:tcMar>
+              <w:top w:w="30" w:type="dxa"/>
+              <w:left w:w="45" w:type="dxa"/>
+              <w:bottom w:w="30" w:type="dxa"/>
+              <w:right w:w="45" w:type="dxa"/>
+            </w:tcMar>
+            <w:vAlign w:val="bottom"/>
+            <w:hideMark/>
+          </w:tcPr>
+          <w:p>
+            <w:pPr>
+              <w:spacing w:after="0" w:line="240" w:lineRule="auto"/>
+              <w:rPr>
+                <w:rFonts w:eastAsia="Times New Roman"/>
+              </w:rPr>
+            </w:pPr>
+            <w:r>
+              <w:rPr>
+                <w:rFonts w:eastAsia="Times New Roman"/>
+              </w:rPr>
+              <w:t>RF001</w:t>
+            </w:r>
+          </w:p>
+        </w:tc>
+        <w:tc>
+          <w:tcPr>
+            <w:tcW w:w="0" w:type="auto"/>
+            <w:tcBorders>
+              <w:top w:val="single" w:sz="6" w:space="0" w:color="CCCCCC"/>
+              <w:left w:val="single" w:sz="6" w:space="0" w:color="CCCCCC"/>
+              <w:bottom w:val="single" w:sz="6" w:space="0" w:color="000000"/>
+              <w:right w:val="single" w:sz="6" w:space="0" w:color="000000"/>
+            </w:tcBorders>
+            <w:shd w:val="clear" w:color="auto" w:fill="A4C2F4"/>
+            <w:tcMar>
+              <w:top w:w="30" w:type="dxa"/>
+              <w:left w:w="45" w:type="dxa"/>
+              <w:bottom w:w="30" w:type="dxa"/>
+              <w:right w:w="45" w:type="dxa"/>
+            </w:tcMar>
+            <w:vAlign w:val="bottom"/>
+            <w:hideMark/>
+          </w:tcPr>
+          <w:p>
+            <w:pPr>
+              <w:spacing w:after="0" w:line="240" w:lineRule="auto"/>
+              <w:rPr>
+                <w:rFonts w:eastAsia="Times New Roman"/>
+              </w:rPr>
+            </w:pPr>
+            <w:r>
+              <w:rPr>
+                <w:rFonts w:eastAsia="Times New Roman"/>
+              </w:rPr>
+              <w:t>RegistroUsuario</w:t>
+            </w:r>
+          </w:p>
+        </w:tc>
+        <w:tc>
+          <w:tcPr>
+            <w:tcW w:w="0" w:type="auto"/>
+            <w:tcBorders>
+              <w:top w:val="single" w:sz="6" w:space="0" w:color="CCCCCC"/>
+              <w:left w:val="single" w:sz="6" w:space="0" w:color="CCCCCC"/>
+              <w:bottom w:val="single" w:sz="6" w:space="0" w:color="000000"/>
+              <w:right w:val="single" w:sz="6" w:space="0" w:color="000000"/>
+            </w:tcBorders>
+            <w:shd w:val="clear" w:color="auto" w:fill="A4C2F4"/>
+            <w:tcMar>
+              <w:top w:w="30" w:type="dxa"/>
+              <w:left w:w="45" w:type="dxa"/>
+              <w:bottom w:w="30" w:type="dxa"/>
+              <w:right w:w="45" w:type="dxa"/>
+            </w:tcMar>
+            <w:vAlign w:val="bottom"/>
+            <w:hideMark/>
+          </w:tcPr>
+          <w:p>
+            <w:pPr>
+              <w:spacing w:after="0" w:line="240" w:lineRule="auto"/>
+              <w:rPr>
+                <w:rFonts w:eastAsia="Times New Roman"/>
+              </w:rPr>
+            </w:pPr>
+            <w:r>
+              <w:rPr>
+                <w:rFonts w:eastAsia="Times New Roman"/>
+              </w:rPr>
+              <w:t>El sistema web debe permitir la creacion de cuentas a los usuario nuevos</w:t>
+            </w:r>
+          </w:p>
+        </w:tc>
+        <w:tc>
+          <w:tcPr>
+            <w:tcW w:w="0" w:type="auto"/>
+            <w:tcBorders>
+              <w:top w:val="single" w:sz="6" w:space="0" w:color="CCCCCC"/>
+              <w:left w:val="single" w:sz="6" w:space="0" w:color="CCCCCC"/>
+              <w:bottom w:val="single" w:sz="6" w:space="0" w:color="000000"/>
+              <w:right w:val="single" w:sz="6" w:space="0" w:color="000000"/>
+            </w:tcBorders>
+            <w:shd w:val="clear" w:color="auto" w:fill="A4C2F4"/>
+            <w:tcMar>
+              <w:top w:w="30" w:type="dxa"/>
+              <w:left w:w="45" w:type="dxa"/>
+              <w:bottom w:w="30" w:type="dxa"/>
+              <w:right w:w="45" w:type="dxa"/>
+            </w:tcMar>
+            <w:vAlign w:val="bottom"/>
+            <w:hideMark/>
+          </w:tcPr>
+          <w:p>
+            <w:pPr>
+              <w:spacing w:after="0" w:line="240" w:lineRule="auto"/>
+              <w:rPr>
+                <w:rFonts w:eastAsia="Times New Roman"/>
+              </w:rPr>
+            </w:pPr>
+            <w:r>
+              <w:rPr>
+                <w:rFonts w:eastAsia="Times New Roman"/>
+              </w:rPr>
+              <w:t>Alta</w:t>
+            </w:r>
+          </w:p>
+        </w:tc>
+        <w:tc>
+          <w:tcPr>
+            <w:tcW w:w="0" w:type="auto"/>
+            <w:tcBorders>
+              <w:top w:val="single" w:sz="6" w:space="0" w:color="CCCCCC"/>
+              <w:left w:val="single" w:sz="6" w:space="0" w:color="CCCCCC"/>
+              <w:bottom w:val="single" w:sz="6" w:space="0" w:color="000000"/>
+              <w:right w:val="single" w:sz="6" w:space="0" w:color="000000"/>
+            </w:tcBorders>
+            <w:shd w:val="clear" w:color="auto" w:fill="A4C2F4"/>
+            <w:tcMar>
+              <w:top w:w="30" w:type="dxa"/>
+              <w:left w:w="45" w:type="dxa"/>
+              <w:bottom w:w="30" w:type="dxa"/>
+              <w:right w:w="45" w:type="dxa"/>
+            </w:tcMar>
+            <w:vAlign w:val="bottom"/>
+            <w:hideMark/>
+          </w:tcPr>
+          <w:p>
+            <w:pPr>
+              <w:spacing w:after="0" w:line="240" w:lineRule="auto"/>
+              <w:rPr>
+                <w:rFonts w:eastAsia="Times New Roman"/>
+              </w:rPr>
+            </w:pPr>
+            <w:r>
+              <w:rPr>
+                <w:rFonts w:eastAsia="Times New Roman"/>
+              </w:rPr>
+              <w:t>Necesario</w:t>
+            </w:r>
+          </w:p>
+        </w:tc>
+        <w:tc>
+          <w:tcPr>
+            <w:tcW w:w="0" w:type="auto"/>
+            <w:tcBorders>
+              <w:top w:val="single" w:sz="6" w:space="0" w:color="CCCCCC"/>
+              <w:left w:val="single" w:sz="6" w:space="0" w:color="CCCCCC"/>
+              <w:bottom w:val="single" w:sz="6" w:space="0" w:color="000000"/>
+              <w:right w:val="single" w:sz="6" w:space="0" w:color="000000"/>
+            </w:tcBorders>
+            <w:shd w:val="clear" w:color="auto" w:fill="A4C2F4"/>
+            <w:tcMar>
+              <w:top w:w="30" w:type="dxa"/>
+              <w:left w:w="45" w:type="dxa"/>
+              <w:bottom w:w="30" w:type="dxa"/>
+              <w:right w:w="45" w:type="dxa"/>
+            </w:tcMar>
+            <w:vAlign w:val="bottom"/>
+            <w:hideMark/>
+          </w:tcPr>
+          <w:p>
+            <w:pPr>
+              <w:spacing w:after="0" w:line="240" w:lineRule="auto"/>
+              <w:rPr>
+                <w:rFonts w:eastAsia="Times New Roman"/>
+              </w:rPr>
+            </w:pPr>
+            <w:r>
+              <w:rPr>
+                <w:rFonts w:eastAsia="Times New Roman"/>
+              </w:rPr>
+              <w:t>Terminado</w:t>
+            </w:r>
+          </w:p>
+        </w:tc>
+        <w:tc>
+          <w:tcPr>
+            <w:tcW w:w="0" w:type="auto"/>
+            <w:tcBorders>
+              <w:top w:val="single" w:sz="6" w:space="0" w:color="CCCCCC"/>
+              <w:left w:val="single" w:sz="6" w:space="0" w:color="CCCCCC"/>
+              <w:bottom w:val="single" w:sz="6" w:space="0" w:color="000000"/>
+              <w:right w:val="single" w:sz="6" w:space="0" w:color="000000"/>
+            </w:tcBorders>
+            <w:shd w:val="clear" w:color="auto" w:fill="A4C2F4"/>
+            <w:tcMar>
+              <w:top w:w="30" w:type="dxa"/>
+              <w:left w:w="45" w:type="dxa"/>
+              <w:bottom w:w="30" w:type="dxa"/>
+              <w:right w:w="45" w:type="dxa"/>
+            </w:tcMar>
+            <w:vAlign w:val="bottom"/>
+            <w:hideMark/>
+          </w:tcPr>
+          <w:p>
+            <w:pPr>
+              <w:spacing w:after="0" w:line="240" w:lineRule="auto"/>
+              <w:rPr>
+                <w:rFonts w:eastAsia="Times New Roman"/>
+              </w:rPr>
+            </w:pPr>
+            <w:r>
+              <w:rPr>
+                <w:rFonts w:eastAsia="Times New Roman"/>
+              </w:rPr>
+              <w:t>Alta</w:t>
+            </w:r>
+          </w:p>
+        </w:tc>
+      </w:tr>
+      <w:tr>
+        <w:trPr>
+          <w:trHeight w:val="315"/>
+        </w:trPr>
+        <w:tc>
+          <w:tcPr>
+            <w:tcW w:w="0" w:type="auto"/>
+            <w:tcBorders>
+              <w:top w:val="single" w:sz="6" w:space="0" w:color="CCCCCC"/>
+              <w:left w:val="single" w:sz="6" w:space="0" w:color="000000"/>
+              <w:bottom w:val="single" w:sz="6" w:space="0" w:color="000000"/>
+              <w:right w:val="single" w:sz="6" w:space="0" w:color="000000"/>
+            </w:tcBorders>
+            <w:shd w:val="clear" w:color="auto" w:fill="A4C2F4"/>
+            <w:tcMar>
+              <w:top w:w="30" w:type="dxa"/>
+              <w:left w:w="45" w:type="dxa"/>
+              <w:bottom w:w="30" w:type="dxa"/>
+              <w:right w:w="45" w:type="dxa"/>
+            </w:tcMar>
+            <w:vAlign w:val="bottom"/>
+            <w:hideMark/>
+          </w:tcPr>
+          <w:p>
+            <w:pPr>
+              <w:spacing w:after="0" w:line="240" w:lineRule="auto"/>
+              <w:rPr>
+                <w:rFonts w:eastAsia="Times New Roman"/>
+              </w:rPr>
+            </w:pPr>
+            <w:r>
+              <w:rPr>
+                <w:rFonts w:eastAsia="Times New Roman"/>
+              </w:rPr>
+              <w:t>RF002</w:t>
+            </w:r>
+          </w:p>
+        </w:tc>
+        <w:tc>
+          <w:tcPr>
+            <w:tcW w:w="0" w:type="auto"/>
+            <w:tcBorders>
+              <w:top w:val="single" w:sz="6" w:space="0" w:color="CCCCCC"/>
+              <w:left w:val="single" w:sz="6" w:space="0" w:color="CCCCCC"/>
+              <w:bottom w:val="single" w:sz="6" w:space="0" w:color="000000"/>
+              <w:right w:val="single" w:sz="6" w:space="0" w:color="000000"/>
+            </w:tcBorders>
+            <w:shd w:val="clear" w:color="auto" w:fill="A4C2F4"/>
+            <w:tcMar>
+              <w:top w:w="30" w:type="dxa"/>
+              <w:left w:w="45" w:type="dxa"/>
+              <w:bottom w:w="30" w:type="dxa"/>
+              <w:right w:w="45" w:type="dxa"/>
+            </w:tcMar>
+            <w:vAlign w:val="bottom"/>
+            <w:hideMark/>
+          </w:tcPr>
+          <w:p>
+            <w:pPr>
+              <w:spacing w:after="0" w:line="240" w:lineRule="auto"/>
+              <w:rPr>
+                <w:rFonts w:eastAsia="Times New Roman"/>
+              </w:rPr>
+            </w:pPr>
+            <w:r>
+              <w:rPr>
+                <w:rFonts w:eastAsia="Times New Roman"/>
+              </w:rPr>
+              <w:t>RegistroAdmin</w:t>
+            </w:r>
+          </w:p>
+        </w:tc>
+        <w:tc>
+          <w:tcPr>
+            <w:tcW w:w="0" w:type="auto"/>
+            <w:tcBorders>
+              <w:top w:val="single" w:sz="6" w:space="0" w:color="CCCCCC"/>
+              <w:left w:val="single" w:sz="6" w:space="0" w:color="CCCCCC"/>
+              <w:bottom w:val="single" w:sz="6" w:space="0" w:color="000000"/>
+              <w:right w:val="single" w:sz="6" w:space="0" w:color="000000"/>
+            </w:tcBorders>
+            <w:shd w:val="clear" w:color="auto" w:fill="A4C2F4"/>
+            <w:tcMar>
+              <w:top w:w="30" w:type="dxa"/>
+              <w:left w:w="45" w:type="dxa"/>
+              <w:bottom w:w="30" w:type="dxa"/>
+              <w:right w:w="45" w:type="dxa"/>
+            </w:tcMar>
+            <w:vAlign w:val="bottom"/>
+            <w:hideMark/>
+          </w:tcPr>
+          <w:p>
+            <w:pPr>
+              <w:spacing w:after="0" w:line="240" w:lineRule="auto"/>
+              <w:rPr>
+                <w:rFonts w:eastAsia="Times New Roman"/>
+              </w:rPr>
+            </w:pPr>
+            <w:r>
+              <w:rPr>
+                <w:rFonts w:eastAsia="Times New Roman"/>
+              </w:rPr>
+              <w:t xml:space="preserve">El sistema web debe permitir la </w:t>
+            </w:r>
+            <w:r>
+              <w:rPr>
+                <w:rFonts w:eastAsia="Times New Roman"/>
+              </w:rPr>
+              <w:lastRenderedPageBreak/>
+              <w:t>creacion de cuentas para administrador</w:t>
+            </w:r>
+          </w:p>
+        </w:tc>
+        <w:tc>
+          <w:tcPr>
+            <w:tcW w:w="0" w:type="auto"/>
+            <w:tcBorders>
+              <w:top w:val="single" w:sz="6" w:space="0" w:color="CCCCCC"/>
+              <w:left w:val="single" w:sz="6" w:space="0" w:color="CCCCCC"/>
+              <w:bottom w:val="single" w:sz="6" w:space="0" w:color="000000"/>
+              <w:right w:val="single" w:sz="6" w:space="0" w:color="000000"/>
+            </w:tcBorders>
+            <w:shd w:val="clear" w:color="auto" w:fill="A4C2F4"/>
+            <w:tcMar>
+              <w:top w:w="30" w:type="dxa"/>
+              <w:left w:w="45" w:type="dxa"/>
+              <w:bottom w:w="30" w:type="dxa"/>
+              <w:right w:w="45" w:type="dxa"/>
+            </w:tcMar>
+            <w:vAlign w:val="bottom"/>
+            <w:hideMark/>
+          </w:tcPr>
+          <w:p>
+            <w:pPr>
+              <w:spacing w:after="0" w:line="240" w:lineRule="auto"/>
+              <w:rPr>
+                <w:rFonts w:eastAsia="Times New Roman"/>
+              </w:rPr>
+            </w:pPr>
+            <w:r>
+              <w:rPr>
+                <w:rFonts w:eastAsia="Times New Roman"/>
+              </w:rPr>
+              <w:lastRenderedPageBreak/>
+              <w:t>Alta</w:t>
+            </w:r>
+          </w:p>
+        </w:tc>
+        <w:tc>
+          <w:tcPr>
+            <w:tcW w:w="0" w:type="auto"/>
+            <w:tcBorders>
+              <w:top w:val="single" w:sz="6" w:space="0" w:color="CCCCCC"/>
+              <w:left w:val="single" w:sz="6" w:space="0" w:color="CCCCCC"/>
+              <w:bottom w:val="single" w:sz="6" w:space="0" w:color="000000"/>
+              <w:right w:val="single" w:sz="6" w:space="0" w:color="000000"/>
+            </w:tcBorders>
+            <w:shd w:val="clear" w:color="auto" w:fill="A4C2F4"/>
+            <w:tcMar>
+              <w:top w:w="30" w:type="dxa"/>
+              <w:left w:w="45" w:type="dxa"/>
+              <w:bottom w:w="30" w:type="dxa"/>
+              <w:right w:w="45" w:type="dxa"/>
+            </w:tcMar>
+            <w:vAlign w:val="bottom"/>
+            <w:hideMark/>
+          </w:tcPr>
+          <w:p>
+            <w:pPr>
+              <w:spacing w:after="0" w:line="240" w:lineRule="auto"/>
+              <w:rPr>
+                <w:rFonts w:eastAsia="Times New Roman"/>
+              </w:rPr>
+            </w:pPr>
+            <w:r>
+              <w:rPr>
+                <w:rFonts w:eastAsia="Times New Roman"/>
+              </w:rPr>
+              <w:t>Necesario</w:t>
+            </w:r>
+          </w:p>
+        </w:tc>
+        <w:tc>
+          <w:tcPr>
+            <w:tcW w:w="0" w:type="auto"/>
+            <w:tcBorders>
+              <w:top w:val="single" w:sz="6" w:space="0" w:color="CCCCCC"/>
+              <w:left w:val="single" w:sz="6" w:space="0" w:color="CCCCCC"/>
+              <w:bottom w:val="single" w:sz="6" w:space="0" w:color="000000"/>
+              <w:right w:val="single" w:sz="6" w:space="0" w:color="000000"/>
+            </w:tcBorders>
+            <w:shd w:val="clear" w:color="auto" w:fill="A4C2F4"/>
+            <w:tcMar>
+              <w:top w:w="30" w:type="dxa"/>
+              <w:left w:w="45" w:type="dxa"/>
+              <w:bottom w:w="30" w:type="dxa"/>
+              <w:right w:w="45" w:type="dxa"/>
+            </w:tcMar>
+            <w:vAlign w:val="bottom"/>
+            <w:hideMark/>
+          </w:tcPr>
+          <w:p>
+            <w:pPr>
+              <w:spacing w:after="0" w:line="240" w:lineRule="auto"/>
+              <w:rPr>
+                <w:rFonts w:eastAsia="Times New Roman"/>
+              </w:rPr>
+            </w:pPr>
+            <w:r>
+              <w:rPr>
+                <w:rFonts w:eastAsia="Times New Roman"/>
+              </w:rPr>
+              <w:t>Terminado</w:t>
+            </w:r>
+          </w:p>
+        </w:tc>
+        <w:tc>
+          <w:tcPr>
+            <w:tcW w:w="0" w:type="auto"/>
+            <w:tcBorders>
+              <w:top w:val="single" w:sz="6" w:space="0" w:color="CCCCCC"/>
+              <w:left w:val="single" w:sz="6" w:space="0" w:color="CCCCCC"/>
+              <w:bottom w:val="single" w:sz="6" w:space="0" w:color="000000"/>
+              <w:right w:val="single" w:sz="6" w:space="0" w:color="000000"/>
+            </w:tcBorders>
+            <w:shd w:val="clear" w:color="auto" w:fill="A4C2F4"/>
+            <w:tcMar>
+              <w:top w:w="30" w:type="dxa"/>
+              <w:left w:w="45" w:type="dxa"/>
+              <w:bottom w:w="30" w:type="dxa"/>
+              <w:right w:w="45" w:type="dxa"/>
+            </w:tcMar>
+            <w:vAlign w:val="bottom"/>
+            <w:hideMark/>
+          </w:tcPr>
+          <w:p>
+            <w:pPr>
+              <w:spacing w:after="0" w:line="240" w:lineRule="auto"/>
+              <w:rPr>
+                <w:rFonts w:eastAsia="Times New Roman"/>
+              </w:rPr>
+            </w:pPr>
+            <w:r>
+              <w:rPr>
+                <w:rFonts w:eastAsia="Times New Roman"/>
+              </w:rPr>
+              <w:t>Alta</w:t>
+            </w:r>
+          </w:p>
+        </w:tc>
+      </w:tr>
+      <w:tr>
+        <w:trPr>
+          <w:trHeight w:val="315"/>
+        </w:trPr>
+        <w:tc>
+          <w:tcPr>
+            <w:tcW w:w="0" w:type="auto"/>
+            <w:tcBorders>
+              <w:top w:val="single" w:sz="6" w:space="0" w:color="CCCCCC"/>
+              <w:left w:val="single" w:sz="6" w:space="0" w:color="000000"/>
+              <w:bottom w:val="single" w:sz="6" w:space="0" w:color="000000"/>
+              <w:right w:val="single" w:sz="6" w:space="0" w:color="000000"/>
+            </w:tcBorders>
+            <w:shd w:val="clear" w:color="auto" w:fill="A4C2F4"/>
+            <w:tcMar>
+              <w:top w:w="30" w:type="dxa"/>
+              <w:left w:w="45" w:type="dxa"/>
+              <w:bottom w:w="30" w:type="dxa"/>
+              <w:right w:w="45" w:type="dxa"/>
+            </w:tcMar>
+            <w:vAlign w:val="bottom"/>
+            <w:hideMark/>
+          </w:tcPr>
+          <w:p>
+            <w:pPr>
+              <w:spacing w:after="0" w:line="240" w:lineRule="auto"/>
+              <w:rPr>
+                <w:rFonts w:eastAsia="Times New Roman"/>
+              </w:rPr>
+            </w:pPr>
+            <w:r>
+              <w:rPr>
+                <w:rFonts w:eastAsia="Times New Roman"/>
+              </w:rPr>
+              <w:t>RF003</w:t>
+            </w:r>
+          </w:p>
+        </w:tc>
+        <w:tc>
+          <w:tcPr>
+            <w:tcW w:w="0" w:type="auto"/>
+            <w:tcBorders>
+              <w:top w:val="single" w:sz="6" w:space="0" w:color="CCCCCC"/>
+              <w:left w:val="single" w:sz="6" w:space="0" w:color="CCCCCC"/>
+              <w:bottom w:val="single" w:sz="6" w:space="0" w:color="000000"/>
+              <w:right w:val="single" w:sz="6" w:space="0" w:color="000000"/>
+            </w:tcBorders>
+            <w:shd w:val="clear" w:color="auto" w:fill="A4C2F4"/>
+            <w:tcMar>
+              <w:top w:w="30" w:type="dxa"/>
+              <w:left w:w="45" w:type="dxa"/>
+              <w:bottom w:w="30" w:type="dxa"/>
+              <w:right w:w="45" w:type="dxa"/>
+            </w:tcMar>
+            <w:vAlign w:val="bottom"/>
+            <w:hideMark/>
+          </w:tcPr>
+          <w:p>
+            <w:pPr>
+              <w:spacing w:after="0" w:line="240" w:lineRule="auto"/>
+              <w:rPr>
+                <w:rFonts w:eastAsia="Times New Roman"/>
+              </w:rPr>
+            </w:pPr>
+            <w:r>
+              <w:rPr>
+                <w:rFonts w:eastAsia="Times New Roman"/>
+              </w:rPr>
+              <w:t>ModuloInput</w:t>
+            </w:r>
+          </w:p>
+        </w:tc>
+        <w:tc>
+          <w:tcPr>
+            <w:tcW w:w="0" w:type="auto"/>
+            <w:tcBorders>
+              <w:top w:val="single" w:sz="6" w:space="0" w:color="CCCCCC"/>
+              <w:left w:val="single" w:sz="6" w:space="0" w:color="CCCCCC"/>
+              <w:bottom w:val="single" w:sz="6" w:space="0" w:color="000000"/>
+              <w:right w:val="single" w:sz="6" w:space="0" w:color="000000"/>
+            </w:tcBorders>
+            <w:shd w:val="clear" w:color="auto" w:fill="A4C2F4"/>
+            <w:tcMar>
+              <w:top w:w="30" w:type="dxa"/>
+              <w:left w:w="45" w:type="dxa"/>
+              <w:bottom w:w="30" w:type="dxa"/>
+              <w:right w:w="45" w:type="dxa"/>
+            </w:tcMar>
+            <w:vAlign w:val="bottom"/>
+            <w:hideMark/>
+          </w:tcPr>
+          <w:p>
+            <w:pPr>
+              <w:spacing w:after="0" w:line="240" w:lineRule="auto"/>
+              <w:rPr>
+                <w:rFonts w:eastAsia="Times New Roman"/>
+              </w:rPr>
+            </w:pPr>
+            <w:r>
+              <w:rPr>
+                <w:rFonts w:eastAsia="Times New Roman"/>
+              </w:rPr>
+              <w:t>El sistema web debe tener un modulo para introducir la informacion clave dependiendo del formato escogido</w:t>
+            </w:r>
+          </w:p>
+        </w:tc>
+        <w:tc>
+          <w:tcPr>
+            <w:tcW w:w="0" w:type="auto"/>
+            <w:tcBorders>
+              <w:top w:val="single" w:sz="6" w:space="0" w:color="CCCCCC"/>
+              <w:left w:val="single" w:sz="6" w:space="0" w:color="CCCCCC"/>
+              <w:bottom w:val="single" w:sz="6" w:space="0" w:color="000000"/>
+              <w:right w:val="single" w:sz="6" w:space="0" w:color="000000"/>
+            </w:tcBorders>
+            <w:shd w:val="clear" w:color="auto" w:fill="A4C2F4"/>
+            <w:tcMar>
+              <w:top w:w="30" w:type="dxa"/>
+              <w:left w:w="45" w:type="dxa"/>
+              <w:bottom w:w="30" w:type="dxa"/>
+              <w:right w:w="45" w:type="dxa"/>
+            </w:tcMar>
+            <w:vAlign w:val="bottom"/>
+            <w:hideMark/>
+          </w:tcPr>
+          <w:p>
+            <w:pPr>
+              <w:spacing w:after="0" w:line="240" w:lineRule="auto"/>
+              <w:rPr>
+                <w:rFonts w:eastAsia="Times New Roman"/>
+              </w:rPr>
+            </w:pPr>
+            <w:r>
+              <w:rPr>
+                <w:rFonts w:eastAsia="Times New Roman"/>
+              </w:rPr>
+              <w:t>Alta</w:t>
+            </w:r>
+          </w:p>
+        </w:tc>
+        <w:tc>
+          <w:tcPr>
+            <w:tcW w:w="0" w:type="auto"/>
+            <w:tcBorders>
+              <w:top w:val="single" w:sz="6" w:space="0" w:color="CCCCCC"/>
+              <w:left w:val="single" w:sz="6" w:space="0" w:color="CCCCCC"/>
+              <w:bottom w:val="single" w:sz="6" w:space="0" w:color="000000"/>
+              <w:right w:val="single" w:sz="6" w:space="0" w:color="000000"/>
+            </w:tcBorders>
+            <w:shd w:val="clear" w:color="auto" w:fill="A4C2F4"/>
+            <w:tcMar>
+              <w:top w:w="30" w:type="dxa"/>
+              <w:left w:w="45" w:type="dxa"/>
+              <w:bottom w:w="30" w:type="dxa"/>
+              <w:right w:w="45" w:type="dxa"/>
+            </w:tcMar>
+            <w:vAlign w:val="bottom"/>
+            <w:hideMark/>
+          </w:tcPr>
+          <w:p>
+            <w:pPr>
+              <w:spacing w:after="0" w:line="240" w:lineRule="auto"/>
+              <w:rPr>
+                <w:rFonts w:eastAsia="Times New Roman"/>
+              </w:rPr>
+            </w:pPr>
+            <w:r>
+              <w:rPr>
+                <w:rFonts w:eastAsia="Times New Roman"/>
+              </w:rPr>
+              <w:t>Necesario</w:t>
+            </w:r>
+          </w:p>
+        </w:tc>
+        <w:tc>
+          <w:tcPr>
+            <w:tcW w:w="0" w:type="auto"/>
+            <w:tcBorders>
+              <w:top w:val="single" w:sz="6" w:space="0" w:color="CCCCCC"/>
+              <w:left w:val="single" w:sz="6" w:space="0" w:color="CCCCCC"/>
+              <w:bottom w:val="single" w:sz="6" w:space="0" w:color="000000"/>
+              <w:right w:val="single" w:sz="6" w:space="0" w:color="000000"/>
+            </w:tcBorders>
+            <w:shd w:val="clear" w:color="auto" w:fill="A4C2F4"/>
+            <w:tcMar>
+              <w:top w:w="30" w:type="dxa"/>
+              <w:left w:w="45" w:type="dxa"/>
+              <w:bottom w:w="30" w:type="dxa"/>
+              <w:right w:w="45" w:type="dxa"/>
+            </w:tcMar>
+            <w:vAlign w:val="bottom"/>
+            <w:hideMark/>
+          </w:tcPr>
+          <w:p>
+            <w:pPr>
+              <w:spacing w:after="0" w:line="240" w:lineRule="auto"/>
+              <w:rPr>
+                <w:rFonts w:eastAsia="Times New Roman"/>
+              </w:rPr>
+            </w:pPr>
+            <w:r>
+              <w:rPr>
+                <w:rFonts w:eastAsia="Times New Roman"/>
+              </w:rPr>
+              <w:t>En Proceso</w:t>
+            </w:r>
+          </w:p>
+        </w:tc>
+        <w:tc>
+          <w:tcPr>
+            <w:tcW w:w="0" w:type="auto"/>
+            <w:tcBorders>
+              <w:top w:val="single" w:sz="6" w:space="0" w:color="CCCCCC"/>
+              <w:left w:val="single" w:sz="6" w:space="0" w:color="CCCCCC"/>
+              <w:bottom w:val="single" w:sz="6" w:space="0" w:color="000000"/>
+              <w:right w:val="single" w:sz="6" w:space="0" w:color="000000"/>
+            </w:tcBorders>
+            <w:shd w:val="clear" w:color="auto" w:fill="A4C2F4"/>
+            <w:tcMar>
+              <w:top w:w="30" w:type="dxa"/>
+              <w:left w:w="45" w:type="dxa"/>
+              <w:bottom w:w="30" w:type="dxa"/>
+              <w:right w:w="45" w:type="dxa"/>
+            </w:tcMar>
+            <w:vAlign w:val="bottom"/>
+            <w:hideMark/>
+          </w:tcPr>
+          <w:p>
+            <w:pPr>
+              <w:spacing w:after="0" w:line="240" w:lineRule="auto"/>
+              <w:rPr>
+                <w:rFonts w:eastAsia="Times New Roman"/>
+              </w:rPr>
+            </w:pPr>
+            <w:r>
+              <w:rPr>
+                <w:rFonts w:eastAsia="Times New Roman"/>
+              </w:rPr>
+              <w:t>Media</w:t>
+            </w:r>
+          </w:p>
+        </w:tc>
+      </w:tr>
+      <w:tr>
+        <w:trPr>
+          <w:trHeight w:val="315"/>
+        </w:trPr>
+        <w:tc>
+          <w:tcPr>
+            <w:tcW w:w="0" w:type="auto"/>
+            <w:tcBorders>
+              <w:top w:val="single" w:sz="6" w:space="0" w:color="CCCCCC"/>
+              <w:left w:val="single" w:sz="6" w:space="0" w:color="000000"/>
+              <w:bottom w:val="single" w:sz="6" w:space="0" w:color="000000"/>
+              <w:right w:val="single" w:sz="6" w:space="0" w:color="000000"/>
+            </w:tcBorders>
+            <w:shd w:val="clear" w:color="auto" w:fill="A4C2F4"/>
+            <w:tcMar>
+              <w:top w:w="30" w:type="dxa"/>
+              <w:left w:w="45" w:type="dxa"/>
+              <w:bottom w:w="30" w:type="dxa"/>
+              <w:right w:w="45" w:type="dxa"/>
+            </w:tcMar>
+            <w:vAlign w:val="bottom"/>
+            <w:hideMark/>
+          </w:tcPr>
+          <w:p>
+            <w:pPr>
+              <w:spacing w:after="0" w:line="240" w:lineRule="auto"/>
+              <w:rPr>
+                <w:rFonts w:eastAsia="Times New Roman"/>
+              </w:rPr>
+            </w:pPr>
+            <w:r>
+              <w:rPr>
+                <w:rFonts w:eastAsia="Times New Roman"/>
+              </w:rPr>
+              <w:t>RF004</w:t>
+            </w:r>
+          </w:p>
+        </w:tc>
+        <w:tc>
+          <w:tcPr>
+            <w:tcW w:w="0" w:type="auto"/>
+            <w:tcBorders>
+              <w:top w:val="single" w:sz="6" w:space="0" w:color="CCCCCC"/>
+              <w:left w:val="single" w:sz="6" w:space="0" w:color="CCCCCC"/>
+              <w:bottom w:val="single" w:sz="6" w:space="0" w:color="000000"/>
+              <w:right w:val="single" w:sz="6" w:space="0" w:color="000000"/>
+            </w:tcBorders>
+            <w:shd w:val="clear" w:color="auto" w:fill="A4C2F4"/>
+            <w:tcMar>
+              <w:top w:w="30" w:type="dxa"/>
+              <w:left w:w="45" w:type="dxa"/>
+              <w:bottom w:w="30" w:type="dxa"/>
+              <w:right w:w="45" w:type="dxa"/>
+            </w:tcMar>
+            <w:vAlign w:val="bottom"/>
+            <w:hideMark/>
+          </w:tcPr>
+          <w:p>
+            <w:pPr>
+              <w:spacing w:after="0" w:line="240" w:lineRule="auto"/>
+              <w:rPr>
+                <w:rFonts w:eastAsia="Times New Roman"/>
+              </w:rPr>
+            </w:pPr>
+            <w:r>
+              <w:rPr>
+                <w:rFonts w:eastAsia="Times New Roman"/>
+              </w:rPr>
+              <w:t>SeleccionFormato</w:t>
+            </w:r>
+          </w:p>
+        </w:tc>
+        <w:tc>
+          <w:tcPr>
+            <w:tcW w:w="0" w:type="auto"/>
+            <w:tcBorders>
+              <w:top w:val="single" w:sz="6" w:space="0" w:color="CCCCCC"/>
+              <w:left w:val="single" w:sz="6" w:space="0" w:color="CCCCCC"/>
+              <w:bottom w:val="single" w:sz="6" w:space="0" w:color="000000"/>
+              <w:right w:val="single" w:sz="6" w:space="0" w:color="000000"/>
+            </w:tcBorders>
+            <w:shd w:val="clear" w:color="auto" w:fill="A4C2F4"/>
+            <w:tcMar>
+              <w:top w:w="30" w:type="dxa"/>
+              <w:left w:w="45" w:type="dxa"/>
+              <w:bottom w:w="30" w:type="dxa"/>
+              <w:right w:w="45" w:type="dxa"/>
+            </w:tcMar>
+            <w:vAlign w:val="bottom"/>
+            <w:hideMark/>
+          </w:tcPr>
+          <w:p>
+            <w:pPr>
+              <w:spacing w:after="0" w:line="240" w:lineRule="auto"/>
+              <w:rPr>
+                <w:rFonts w:eastAsia="Times New Roman"/>
+              </w:rPr>
+            </w:pPr>
+            <w:r>
+              <w:rPr>
+                <w:rFonts w:eastAsia="Times New Roman"/>
+              </w:rPr>
+              <w:t>El sistema web debe permitir la seleccion del formato estandarizado para iniciar un nuevo documento</w:t>
+            </w:r>
+          </w:p>
+        </w:tc>
+        <w:tc>
+          <w:tcPr>
+            <w:tcW w:w="0" w:type="auto"/>
+            <w:tcBorders>
+              <w:top w:val="single" w:sz="6" w:space="0" w:color="CCCCCC"/>
+              <w:left w:val="single" w:sz="6" w:space="0" w:color="CCCCCC"/>
+              <w:bottom w:val="single" w:sz="6" w:space="0" w:color="000000"/>
+              <w:right w:val="single" w:sz="6" w:space="0" w:color="000000"/>
+            </w:tcBorders>
+            <w:shd w:val="clear" w:color="auto" w:fill="A4C2F4"/>
+            <w:tcMar>
+              <w:top w:w="30" w:type="dxa"/>
+              <w:left w:w="45" w:type="dxa"/>
+              <w:bottom w:w="30" w:type="dxa"/>
+              <w:right w:w="45" w:type="dxa"/>
+            </w:tcMar>
+            <w:vAlign w:val="bottom"/>
+            <w:hideMark/>
+          </w:tcPr>
+          <w:p>
+            <w:pPr>
+              <w:spacing w:after="0" w:line="240" w:lineRule="auto"/>
+              <w:rPr>
+                <w:rFonts w:eastAsia="Times New Roman"/>
+              </w:rPr>
+            </w:pPr>
+            <w:r>
+              <w:rPr>
+                <w:rFonts w:eastAsia="Times New Roman"/>
+              </w:rPr>
+              <w:t>Alta</w:t>
+            </w:r>
+          </w:p>
+        </w:tc>
+        <w:tc>
+          <w:tcPr>
+            <w:tcW w:w="0" w:type="auto"/>
+            <w:tcBorders>
+              <w:top w:val="single" w:sz="6" w:space="0" w:color="CCCCCC"/>
+              <w:left w:val="single" w:sz="6" w:space="0" w:color="CCCCCC"/>
+              <w:bottom w:val="single" w:sz="6" w:space="0" w:color="000000"/>
+              <w:right w:val="single" w:sz="6" w:space="0" w:color="000000"/>
+            </w:tcBorders>
+            <w:shd w:val="clear" w:color="auto" w:fill="A4C2F4"/>
+            <w:tcMar>
+              <w:top w:w="30" w:type="dxa"/>
+              <w:left w:w="45" w:type="dxa"/>
+              <w:bottom w:w="30" w:type="dxa"/>
+              <w:right w:w="45" w:type="dxa"/>
+            </w:tcMar>
+            <w:vAlign w:val="bottom"/>
+            <w:hideMark/>
+          </w:tcPr>
+          <w:p>
+            <w:pPr>
+              <w:spacing w:after="0" w:line="240" w:lineRule="auto"/>
+              <w:rPr>
+                <w:rFonts w:eastAsia="Times New Roman"/>
+              </w:rPr>
+            </w:pPr>
+            <w:r>
+              <w:rPr>
+                <w:rFonts w:eastAsia="Times New Roman"/>
+              </w:rPr>
+              <w:t>Necesario</w:t>
+            </w:r>
+          </w:p>
+        </w:tc>
+        <w:tc>
+          <w:tcPr>
+            <w:tcW w:w="0" w:type="auto"/>
+            <w:tcBorders>
+              <w:top w:val="single" w:sz="6" w:space="0" w:color="CCCCCC"/>
+              <w:left w:val="single" w:sz="6" w:space="0" w:color="CCCCCC"/>
+              <w:bottom w:val="single" w:sz="6" w:space="0" w:color="000000"/>
+              <w:right w:val="single" w:sz="6" w:space="0" w:color="000000"/>
+            </w:tcBorders>
+            <w:shd w:val="clear" w:color="auto" w:fill="A4C2F4"/>
+            <w:tcMar>
+              <w:top w:w="30" w:type="dxa"/>
+              <w:left w:w="45" w:type="dxa"/>
+              <w:bottom w:w="30" w:type="dxa"/>
+              <w:right w:w="45" w:type="dxa"/>
+            </w:tcMar>
+            <w:vAlign w:val="bottom"/>
+            <w:hideMark/>
+          </w:tcPr>
+          <w:p>
+            <w:pPr>
+              <w:spacing w:after="0" w:line="240" w:lineRule="auto"/>
+              <w:rPr>
+                <w:rFonts w:eastAsia="Times New Roman"/>
+              </w:rPr>
+            </w:pPr>
+            <w:r>
+              <w:rPr>
+                <w:rFonts w:eastAsia="Times New Roman"/>
+              </w:rPr>
+              <w:t>En Proceso</w:t>
+            </w:r>
+          </w:p>
+        </w:tc>
+        <w:tc>
+          <w:tcPr>
+            <w:tcW w:w="0" w:type="auto"/>
+            <w:tcBorders>
+              <w:top w:val="single" w:sz="6" w:space="0" w:color="CCCCCC"/>
+              <w:left w:val="single" w:sz="6" w:space="0" w:color="CCCCCC"/>
+              <w:bottom w:val="single" w:sz="6" w:space="0" w:color="000000"/>
+              <w:right w:val="single" w:sz="6" w:space="0" w:color="000000"/>
+            </w:tcBorders>
+            <w:shd w:val="clear" w:color="auto" w:fill="A4C2F4"/>
+            <w:tcMar>
+              <w:top w:w="30" w:type="dxa"/>
+              <w:left w:w="45" w:type="dxa"/>
+              <w:bottom w:w="30" w:type="dxa"/>
+              <w:right w:w="45" w:type="dxa"/>
+            </w:tcMar>
+            <w:vAlign w:val="bottom"/>
+            <w:hideMark/>
+          </w:tcPr>
+          <w:p>
+            <w:pPr>
+              <w:spacing w:after="0" w:line="240" w:lineRule="auto"/>
+              <w:rPr>
+                <w:rFonts w:eastAsia="Times New Roman"/>
+              </w:rPr>
+            </w:pPr>
+            <w:r>
+              <w:rPr>
+                <w:rFonts w:eastAsia="Times New Roman"/>
+              </w:rPr>
+              <w:t>Media</w:t>
+            </w:r>
+          </w:p>
+        </w:tc>
+      </w:tr>
+      <w:tr>
+        <w:trPr>
+          <w:trHeight w:val="315"/>
+        </w:trPr>
+        <w:tc>
+          <w:tcPr>
+            <w:tcW w:w="0" w:type="auto"/>
+            <w:tcBorders>
+              <w:top w:val="single" w:sz="6" w:space="0" w:color="CCCCCC"/>
+              <w:left w:val="single" w:sz="6" w:space="0" w:color="000000"/>
+              <w:bottom w:val="single" w:sz="6" w:space="0" w:color="000000"/>
+              <w:right w:val="single" w:sz="6" w:space="0" w:color="000000"/>
+            </w:tcBorders>
+            <w:shd w:val="clear" w:color="auto" w:fill="A4C2F4"/>
+            <w:tcMar>
+              <w:top w:w="30" w:type="dxa"/>
+              <w:left w:w="45" w:type="dxa"/>
+              <w:bottom w:w="30" w:type="dxa"/>
+              <w:right w:w="45" w:type="dxa"/>
+            </w:tcMar>
+            <w:vAlign w:val="bottom"/>
+            <w:hideMark/>
+          </w:tcPr>
+          <w:p>
+            <w:pPr>
+              <w:spacing w:after="0" w:line="240" w:lineRule="auto"/>
+              <w:rPr>
+                <w:rFonts w:eastAsia="Times New Roman"/>
+              </w:rPr>
+            </w:pPr>
+            <w:r>
+              <w:rPr>
+                <w:rFonts w:eastAsia="Times New Roman"/>
+              </w:rPr>
+              <w:t>RF005</w:t>
+            </w:r>
+          </w:p>
+        </w:tc>
+        <w:tc>
+          <w:tcPr>
+            <w:tcW w:w="0" w:type="auto"/>
+            <w:tcBorders>
+              <w:top w:val="single" w:sz="6" w:space="0" w:color="CCCCCC"/>
+              <w:left w:val="single" w:sz="6" w:space="0" w:color="CCCCCC"/>
+              <w:bottom w:val="single" w:sz="6" w:space="0" w:color="000000"/>
+              <w:right w:val="single" w:sz="6" w:space="0" w:color="000000"/>
+            </w:tcBorders>
+            <w:shd w:val="clear" w:color="auto" w:fill="A4C2F4"/>
+            <w:tcMar>
+              <w:top w:w="30" w:type="dxa"/>
+              <w:left w:w="45" w:type="dxa"/>
+              <w:bottom w:w="30" w:type="dxa"/>
+              <w:right w:w="45" w:type="dxa"/>
+            </w:tcMar>
+            <w:vAlign w:val="bottom"/>
+            <w:hideMark/>
+          </w:tcPr>
+          <w:p>
+            <w:pPr>
+              <w:spacing w:after="0" w:line="240" w:lineRule="auto"/>
+              <w:rPr>
+                <w:rFonts w:eastAsia="Times New Roman"/>
+              </w:rPr>
+            </w:pPr>
+            <w:r>
+              <w:rPr>
+                <w:rFonts w:eastAsia="Times New Roman"/>
+              </w:rPr>
+              <w:t>MultiIdioma</w:t>
+            </w:r>
+          </w:p>
+        </w:tc>
+        <w:tc>
+          <w:tcPr>
+            <w:tcW w:w="0" w:type="auto"/>
+            <w:tcBorders>
+              <w:top w:val="single" w:sz="6" w:space="0" w:color="CCCCCC"/>
+              <w:left w:val="single" w:sz="6" w:space="0" w:color="CCCCCC"/>
+              <w:bottom w:val="single" w:sz="6" w:space="0" w:color="000000"/>
+              <w:right w:val="single" w:sz="6" w:space="0" w:color="000000"/>
+            </w:tcBorders>
+            <w:shd w:val="clear" w:color="auto" w:fill="A4C2F4"/>
+            <w:tcMar>
+              <w:top w:w="30" w:type="dxa"/>
+              <w:left w:w="45" w:type="dxa"/>
+              <w:bottom w:w="30" w:type="dxa"/>
+              <w:right w:w="45" w:type="dxa"/>
+            </w:tcMar>
+            <w:vAlign w:val="bottom"/>
+            <w:hideMark/>
+          </w:tcPr>
+          <w:p>
+            <w:pPr>
+              <w:spacing w:after="0" w:line="240" w:lineRule="auto"/>
+              <w:rPr>
+                <w:rFonts w:eastAsia="Times New Roman"/>
+              </w:rPr>
+            </w:pPr>
+            <w:r>
+              <w:rPr>
+                <w:rFonts w:eastAsia="Times New Roman"/>
+              </w:rPr>
+              <w:t>El sistema web debe permitir generar documentos en distintos idiomas si así lo permite el modelo IA configurado.</w:t>
+            </w:r>
+          </w:p>
+        </w:tc>
+        <w:tc>
+          <w:tcPr>
+            <w:tcW w:w="0" w:type="auto"/>
+            <w:tcBorders>
+              <w:top w:val="single" w:sz="6" w:space="0" w:color="CCCCCC"/>
+              <w:left w:val="single" w:sz="6" w:space="0" w:color="CCCCCC"/>
+              <w:bottom w:val="single" w:sz="6" w:space="0" w:color="000000"/>
+              <w:right w:val="single" w:sz="6" w:space="0" w:color="000000"/>
+            </w:tcBorders>
+            <w:shd w:val="clear" w:color="auto" w:fill="A4C2F4"/>
+            <w:tcMar>
+              <w:top w:w="30" w:type="dxa"/>
+              <w:left w:w="45" w:type="dxa"/>
+              <w:bottom w:w="30" w:type="dxa"/>
+              <w:right w:w="45" w:type="dxa"/>
+            </w:tcMar>
+            <w:vAlign w:val="bottom"/>
+            <w:hideMark/>
+          </w:tcPr>
+          <w:p>
+            <w:pPr>
+              <w:spacing w:after="0" w:line="240" w:lineRule="auto"/>
+              <w:rPr>
+                <w:rFonts w:eastAsia="Times New Roman"/>
+              </w:rPr>
+            </w:pPr>
+            <w:r>
+              <w:rPr>
+                <w:rFonts w:eastAsia="Times New Roman"/>
+              </w:rPr>
+              <w:t>Alta</w:t>
+            </w:r>
+          </w:p>
+        </w:tc>
+        <w:tc>
+          <w:tcPr>
+            <w:tcW w:w="0" w:type="auto"/>
+            <w:tcBorders>
+              <w:top w:val="single" w:sz="6" w:space="0" w:color="CCCCCC"/>
+              <w:left w:val="single" w:sz="6" w:space="0" w:color="CCCCCC"/>
+              <w:bottom w:val="single" w:sz="6" w:space="0" w:color="000000"/>
+              <w:right w:val="single" w:sz="6" w:space="0" w:color="000000"/>
+            </w:tcBorders>
+            <w:shd w:val="clear" w:color="auto" w:fill="A4C2F4"/>
+            <w:tcMar>
+              <w:top w:w="30" w:type="dxa"/>
+              <w:left w:w="45" w:type="dxa"/>
+              <w:bottom w:w="30" w:type="dxa"/>
+              <w:right w:w="45" w:type="dxa"/>
+            </w:tcMar>
+            <w:vAlign w:val="bottom"/>
+            <w:hideMark/>
+          </w:tcPr>
+          <w:p>
+            <w:pPr>
+              <w:spacing w:after="0" w:line="240" w:lineRule="auto"/>
+              <w:rPr>
+                <w:rFonts w:eastAsia="Times New Roman"/>
+              </w:rPr>
+            </w:pPr>
+            <w:r>
+              <w:rPr>
+                <w:rFonts w:eastAsia="Times New Roman"/>
+              </w:rPr>
+              <w:t>Necesario</w:t>
+            </w:r>
+          </w:p>
+        </w:tc>
+        <w:tc>
+          <w:tcPr>
+            <w:tcW w:w="0" w:type="auto"/>
+            <w:tcBorders>
+              <w:top w:val="single" w:sz="6" w:space="0" w:color="CCCCCC"/>
+              <w:left w:val="single" w:sz="6" w:space="0" w:color="CCCCCC"/>
+              <w:bottom w:val="single" w:sz="6" w:space="0" w:color="000000"/>
+              <w:right w:val="single" w:sz="6" w:space="0" w:color="000000"/>
+            </w:tcBorders>
+            <w:shd w:val="clear" w:color="auto" w:fill="A4C2F4"/>
+            <w:tcMar>
+              <w:top w:w="30" w:type="dxa"/>
+              <w:left w:w="45" w:type="dxa"/>
+              <w:bottom w:w="30" w:type="dxa"/>
+              <w:right w:w="45" w:type="dxa"/>
+            </w:tcMar>
+            <w:vAlign w:val="bottom"/>
+            <w:hideMark/>
+          </w:tcPr>
+          <w:p>
+            <w:pPr>
+              <w:spacing w:after="0" w:line="240" w:lineRule="auto"/>
+              <w:rPr>
+                <w:rFonts w:eastAsia="Times New Roman"/>
+              </w:rPr>
+            </w:pPr>
+            <w:r>
+              <w:rPr>
+                <w:rFonts w:eastAsia="Times New Roman"/>
+              </w:rPr>
+              <w:t>En Proceso</w:t>
+            </w:r>
+          </w:p>
+        </w:tc>
+        <w:tc>
+          <w:tcPr>
+            <w:tcW w:w="0" w:type="auto"/>
+            <w:tcBorders>
+              <w:top w:val="single" w:sz="6" w:space="0" w:color="CCCCCC"/>
+              <w:left w:val="single" w:sz="6" w:space="0" w:color="CCCCCC"/>
+              <w:bottom w:val="single" w:sz="6" w:space="0" w:color="000000"/>
+              <w:right w:val="single" w:sz="6" w:space="0" w:color="000000"/>
+            </w:tcBorders>
+            <w:shd w:val="clear" w:color="auto" w:fill="A4C2F4"/>
+            <w:tcMar>
+              <w:top w:w="30" w:type="dxa"/>
+              <w:left w:w="45" w:type="dxa"/>
+              <w:bottom w:w="30" w:type="dxa"/>
+              <w:right w:w="45" w:type="dxa"/>
+            </w:tcMar>
+            <w:vAlign w:val="bottom"/>
+            <w:hideMark/>
+          </w:tcPr>
+          <w:p>
+            <w:pPr>
+              <w:spacing w:after="0" w:line="240" w:lineRule="auto"/>
+              <w:rPr>
+                <w:rFonts w:eastAsia="Times New Roman"/>
+              </w:rPr>
+            </w:pPr>
+            <w:r>
+              <w:rPr>
+                <w:rFonts w:eastAsia="Times New Roman"/>
+              </w:rPr>
+              <w:t>Media</w:t>
+            </w:r>
+          </w:p>
+        </w:tc>
+      </w:tr>
+      <w:tr>
+        <w:trPr>
+          <w:trHeight w:val="315"/>
+        </w:trPr>
+        <w:tc>
+          <w:tcPr>
+            <w:tcW w:w="0" w:type="auto"/>
+            <w:tcBorders>
+              <w:top w:val="single" w:sz="6" w:space="0" w:color="CCCCCC"/>
+              <w:left w:val="single" w:sz="6" w:space="0" w:color="000000"/>
+              <w:bottom w:val="single" w:sz="6" w:space="0" w:color="000000"/>
+              <w:right w:val="single" w:sz="6" w:space="0" w:color="000000"/>
+            </w:tcBorders>
+            <w:shd w:val="clear" w:color="auto" w:fill="A4C2F4"/>
+            <w:tcMar>
+              <w:top w:w="30" w:type="dxa"/>
+              <w:left w:w="45" w:type="dxa"/>
+              <w:bottom w:w="30" w:type="dxa"/>
+              <w:right w:w="45" w:type="dxa"/>
+            </w:tcMar>
+            <w:vAlign w:val="bottom"/>
+            <w:hideMark/>
+          </w:tcPr>
+          <w:p>
+            <w:pPr>
+              <w:spacing w:after="0" w:line="240" w:lineRule="auto"/>
+              <w:rPr>
+                <w:rFonts w:eastAsia="Times New Roman"/>
+              </w:rPr>
+            </w:pPr>
+            <w:r>
+              <w:rPr>
+                <w:rFonts w:eastAsia="Times New Roman"/>
+              </w:rPr>
+              <w:t>RF006</w:t>
+            </w:r>
+          </w:p>
+        </w:tc>
+        <w:tc>
+          <w:tcPr>
+            <w:tcW w:w="0" w:type="auto"/>
+            <w:tcBorders>
+              <w:top w:val="single" w:sz="6" w:space="0" w:color="CCCCCC"/>
+              <w:left w:val="single" w:sz="6" w:space="0" w:color="CCCCCC"/>
+              <w:bottom w:val="single" w:sz="6" w:space="0" w:color="000000"/>
+              <w:right w:val="single" w:sz="6" w:space="0" w:color="000000"/>
+            </w:tcBorders>
+            <w:shd w:val="clear" w:color="auto" w:fill="A4C2F4"/>
+            <w:tcMar>
+              <w:top w:w="30" w:type="dxa"/>
+              <w:left w:w="45" w:type="dxa"/>
+              <w:bottom w:w="30" w:type="dxa"/>
+              <w:right w:w="45" w:type="dxa"/>
+            </w:tcMar>
+            <w:vAlign w:val="bottom"/>
+            <w:hideMark/>
+          </w:tcPr>
+          <w:p>
+            <w:pPr>
+              <w:spacing w:after="0" w:line="240" w:lineRule="auto"/>
+              <w:rPr>
+                <w:rFonts w:eastAsia="Times New Roman"/>
+              </w:rPr>
+            </w:pPr>
+            <w:r>
+              <w:rPr>
+                <w:rFonts w:eastAsia="Times New Roman"/>
+              </w:rPr>
+              <w:t>ModelosIA</w:t>
+            </w:r>
+          </w:p>
+        </w:tc>
+        <w:tc>
+          <w:tcPr>
+            <w:tcW w:w="0" w:type="auto"/>
+            <w:tcBorders>
+              <w:top w:val="single" w:sz="6" w:space="0" w:color="CCCCCC"/>
+              <w:left w:val="single" w:sz="6" w:space="0" w:color="CCCCCC"/>
+              <w:bottom w:val="single" w:sz="6" w:space="0" w:color="000000"/>
+              <w:right w:val="single" w:sz="6" w:space="0" w:color="000000"/>
+            </w:tcBorders>
+            <w:shd w:val="clear" w:color="auto" w:fill="A4C2F4"/>
+            <w:tcMar>
+              <w:top w:w="30" w:type="dxa"/>
+              <w:left w:w="45" w:type="dxa"/>
+              <w:bottom w:w="30" w:type="dxa"/>
+              <w:right w:w="45" w:type="dxa"/>
+            </w:tcMar>
+            <w:vAlign w:val="bottom"/>
+            <w:hideMark/>
+          </w:tcPr>
+          <w:p>
+            <w:pPr>
+              <w:spacing w:after="0" w:line="240" w:lineRule="auto"/>
+              <w:rPr>
+                <w:rFonts w:eastAsia="Times New Roman"/>
+                <w:sz w:val="20"/>
+                <w:szCs w:val="20"/>
+              </w:rPr>
+            </w:pPr>
+            <w:r>
+              <w:rPr>
+                <w:rFonts w:eastAsia="Times New Roman"/>
+                <w:sz w:val="20"/>
+                <w:szCs w:val="20"/>
+              </w:rPr>
+              <w:t>El sistema web debe contener modelos de IA</w:t>
+            </w:r>
+          </w:p>
+        </w:tc>
+        <w:tc>
+          <w:tcPr>
+            <w:tcW w:w="0" w:type="auto"/>
+            <w:tcBorders>
+              <w:top w:val="single" w:sz="6" w:space="0" w:color="CCCCCC"/>
+              <w:left w:val="single" w:sz="6" w:space="0" w:color="CCCCCC"/>
+              <w:bottom w:val="single" w:sz="6" w:space="0" w:color="000000"/>
+              <w:right w:val="single" w:sz="6" w:space="0" w:color="000000"/>
+            </w:tcBorders>
+            <w:shd w:val="clear" w:color="auto" w:fill="A4C2F4"/>
+            <w:tcMar>
+              <w:top w:w="30" w:type="dxa"/>
+              <w:left w:w="45" w:type="dxa"/>
+              <w:bottom w:w="30" w:type="dxa"/>
+              <w:right w:w="45" w:type="dxa"/>
+            </w:tcMar>
+            <w:vAlign w:val="bottom"/>
+            <w:hideMark/>
+          </w:tcPr>
+          <w:p>
+            <w:pPr>
+              <w:spacing w:after="0" w:line="240" w:lineRule="auto"/>
+              <w:rPr>
+                <w:rFonts w:eastAsia="Times New Roman"/>
+              </w:rPr>
+            </w:pPr>
+            <w:r>
+              <w:rPr>
+                <w:rFonts w:eastAsia="Times New Roman"/>
+              </w:rPr>
+              <w:t>Alta</w:t>
+            </w:r>
+          </w:p>
+        </w:tc>
+        <w:tc>
+          <w:tcPr>
+            <w:tcW w:w="0" w:type="auto"/>
+            <w:tcBorders>
+              <w:top w:val="single" w:sz="6" w:space="0" w:color="CCCCCC"/>
+              <w:left w:val="single" w:sz="6" w:space="0" w:color="CCCCCC"/>
+              <w:bottom w:val="single" w:sz="6" w:space="0" w:color="000000"/>
+              <w:right w:val="single" w:sz="6" w:space="0" w:color="000000"/>
+            </w:tcBorders>
+            <w:shd w:val="clear" w:color="auto" w:fill="A4C2F4"/>
+            <w:tcMar>
+              <w:top w:w="30" w:type="dxa"/>
+              <w:left w:w="45" w:type="dxa"/>
+              <w:bottom w:w="30" w:type="dxa"/>
+              <w:right w:w="45" w:type="dxa"/>
+            </w:tcMar>
+            <w:vAlign w:val="bottom"/>
+            <w:hideMark/>
+          </w:tcPr>
+          <w:p>
+            <w:pPr>
+              <w:spacing w:after="0" w:line="240" w:lineRule="auto"/>
+              <w:rPr>
+                <w:rFonts w:eastAsia="Times New Roman"/>
+              </w:rPr>
+            </w:pPr>
+            <w:r>
+              <w:rPr>
+                <w:rFonts w:eastAsia="Times New Roman"/>
+              </w:rPr>
+              <w:t>Necesario</w:t>
+            </w:r>
+          </w:p>
+        </w:tc>
+        <w:tc>
+          <w:tcPr>
+            <w:tcW w:w="0" w:type="auto"/>
+            <w:tcBorders>
+              <w:top w:val="single" w:sz="6" w:space="0" w:color="CCCCCC"/>
+              <w:left w:val="single" w:sz="6" w:space="0" w:color="CCCCCC"/>
+              <w:bottom w:val="single" w:sz="6" w:space="0" w:color="000000"/>
+              <w:right w:val="single" w:sz="6" w:space="0" w:color="000000"/>
+            </w:tcBorders>
+            <w:shd w:val="clear" w:color="auto" w:fill="A4C2F4"/>
+            <w:tcMar>
+              <w:top w:w="30" w:type="dxa"/>
+              <w:left w:w="45" w:type="dxa"/>
+              <w:bottom w:w="30" w:type="dxa"/>
+              <w:right w:w="45" w:type="dxa"/>
+            </w:tcMar>
+            <w:vAlign w:val="bottom"/>
+            <w:hideMark/>
+          </w:tcPr>
+          <w:p>
+            <w:pPr>
+              <w:spacing w:after="0" w:line="240" w:lineRule="auto"/>
+              <w:rPr>
+                <w:rFonts w:eastAsia="Times New Roman"/>
+              </w:rPr>
+            </w:pPr>
+            <w:r>
+              <w:rPr>
+                <w:rFonts w:eastAsia="Times New Roman"/>
+              </w:rPr>
+              <w:t>En Proceso</w:t>
+            </w:r>
+          </w:p>
+        </w:tc>
+        <w:tc>
+          <w:tcPr>
+            <w:tcW w:w="0" w:type="auto"/>
+            <w:tcBorders>
+              <w:top w:val="single" w:sz="6" w:space="0" w:color="CCCCCC"/>
+              <w:left w:val="single" w:sz="6" w:space="0" w:color="CCCCCC"/>
+              <w:bottom w:val="single" w:sz="6" w:space="0" w:color="000000"/>
+              <w:right w:val="single" w:sz="6" w:space="0" w:color="000000"/>
+            </w:tcBorders>
+            <w:shd w:val="clear" w:color="auto" w:fill="A4C2F4"/>
+            <w:tcMar>
+              <w:top w:w="30" w:type="dxa"/>
+              <w:left w:w="45" w:type="dxa"/>
+              <w:bottom w:w="30" w:type="dxa"/>
+              <w:right w:w="45" w:type="dxa"/>
+            </w:tcMar>
+            <w:vAlign w:val="bottom"/>
+            <w:hideMark/>
+          </w:tcPr>
+          <w:p>
+            <w:pPr>
+              <w:spacing w:after="0" w:line="240" w:lineRule="auto"/>
+              <w:rPr>
+                <w:rFonts w:eastAsia="Times New Roman"/>
+              </w:rPr>
+            </w:pPr>
+            <w:r>
+              <w:rPr>
+                <w:rFonts w:eastAsia="Times New Roman"/>
+              </w:rPr>
+              <w:t>Baja</w:t>
+            </w:r>
+          </w:p>
+        </w:tc>
+      </w:tr>
+      <w:tr>
+        <w:trPr>
+          <w:trHeight w:val="315"/>
+        </w:trPr>
+        <w:tc>
+          <w:tcPr>
+            <w:tcW w:w="0" w:type="auto"/>
+            <w:tcBorders>
+              <w:top w:val="single" w:sz="6" w:space="0" w:color="CCCCCC"/>
+              <w:left w:val="single" w:sz="6" w:space="0" w:color="000000"/>
+              <w:bottom w:val="single" w:sz="6" w:space="0" w:color="000000"/>
+              <w:right w:val="single" w:sz="6" w:space="0" w:color="000000"/>
+            </w:tcBorders>
+            <w:shd w:val="clear" w:color="auto" w:fill="A4C2F4"/>
+            <w:tcMar>
+              <w:top w:w="30" w:type="dxa"/>
+              <w:left w:w="45" w:type="dxa"/>
+              <w:bottom w:w="30" w:type="dxa"/>
+              <w:right w:w="45" w:type="dxa"/>
+            </w:tcMar>
+            <w:vAlign w:val="bottom"/>
+            <w:hideMark/>
+          </w:tcPr>
+          <w:p>
+            <w:pPr>
+              <w:spacing w:after="0" w:line="240" w:lineRule="auto"/>
+              <w:rPr>
+                <w:rFonts w:eastAsia="Times New Roman"/>
+              </w:rPr>
+            </w:pPr>
+            <w:r>
+              <w:rPr>
+                <w:rFonts w:eastAsia="Times New Roman"/>
+              </w:rPr>
+              <w:t>RF007</w:t>
+            </w:r>
+          </w:p>
+        </w:tc>
+        <w:tc>
+          <w:tcPr>
+            <w:tcW w:w="0" w:type="auto"/>
+            <w:tcBorders>
+              <w:top w:val="single" w:sz="6" w:space="0" w:color="CCCCCC"/>
+              <w:left w:val="single" w:sz="6" w:space="0" w:color="CCCCCC"/>
+              <w:bottom w:val="single" w:sz="6" w:space="0" w:color="000000"/>
+              <w:right w:val="single" w:sz="6" w:space="0" w:color="000000"/>
+            </w:tcBorders>
+            <w:shd w:val="clear" w:color="auto" w:fill="A4C2F4"/>
+            <w:tcMar>
+              <w:top w:w="30" w:type="dxa"/>
+              <w:left w:w="45" w:type="dxa"/>
+              <w:bottom w:w="30" w:type="dxa"/>
+              <w:right w:w="45" w:type="dxa"/>
+            </w:tcMar>
+            <w:vAlign w:val="bottom"/>
+            <w:hideMark/>
+          </w:tcPr>
+          <w:p>
+            <w:pPr>
+              <w:spacing w:after="0" w:line="240" w:lineRule="auto"/>
+              <w:rPr>
+                <w:rFonts w:eastAsia="Times New Roman"/>
+              </w:rPr>
+            </w:pPr>
+            <w:r>
+              <w:rPr>
+                <w:rFonts w:eastAsia="Times New Roman"/>
+              </w:rPr>
+              <w:t>GenerarPDF</w:t>
+            </w:r>
+          </w:p>
+        </w:tc>
+        <w:tc>
+          <w:tcPr>
+            <w:tcW w:w="0" w:type="auto"/>
+            <w:tcBorders>
+              <w:top w:val="single" w:sz="6" w:space="0" w:color="CCCCCC"/>
+              <w:left w:val="single" w:sz="6" w:space="0" w:color="CCCCCC"/>
+              <w:bottom w:val="single" w:sz="6" w:space="0" w:color="000000"/>
+              <w:right w:val="single" w:sz="6" w:space="0" w:color="000000"/>
+            </w:tcBorders>
+            <w:shd w:val="clear" w:color="auto" w:fill="A4C2F4"/>
+            <w:tcMar>
+              <w:top w:w="30" w:type="dxa"/>
+              <w:left w:w="45" w:type="dxa"/>
+              <w:bottom w:w="30" w:type="dxa"/>
+              <w:right w:w="45" w:type="dxa"/>
+            </w:tcMar>
+            <w:vAlign w:val="bottom"/>
+            <w:hideMark/>
+          </w:tcPr>
+          <w:p>
+            <w:pPr>
+              <w:spacing w:after="0" w:line="240" w:lineRule="auto"/>
+              <w:rPr>
+                <w:rFonts w:eastAsia="Times New Roman"/>
+              </w:rPr>
+            </w:pPr>
+            <w:r>
+              <w:rPr>
+                <w:rFonts w:eastAsia="Times New Roman"/>
+              </w:rPr>
+              <w:t>El sistema web debe permitir la generacion documentos completos en formatos PDF siguiendo los formatos establecidos.</w:t>
+            </w:r>
+          </w:p>
+        </w:tc>
+        <w:tc>
+          <w:tcPr>
+            <w:tcW w:w="0" w:type="auto"/>
+            <w:tcBorders>
+              <w:top w:val="single" w:sz="6" w:space="0" w:color="CCCCCC"/>
+              <w:left w:val="single" w:sz="6" w:space="0" w:color="CCCCCC"/>
+              <w:bottom w:val="single" w:sz="6" w:space="0" w:color="000000"/>
+              <w:right w:val="single" w:sz="6" w:space="0" w:color="000000"/>
+            </w:tcBorders>
+            <w:shd w:val="clear" w:color="auto" w:fill="A4C2F4"/>
+            <w:tcMar>
+              <w:top w:w="30" w:type="dxa"/>
+              <w:left w:w="45" w:type="dxa"/>
+              <w:bottom w:w="30" w:type="dxa"/>
+              <w:right w:w="45" w:type="dxa"/>
+            </w:tcMar>
+            <w:vAlign w:val="bottom"/>
+            <w:hideMark/>
+          </w:tcPr>
+          <w:p>
+            <w:pPr>
+              <w:spacing w:after="0" w:line="240" w:lineRule="auto"/>
+              <w:rPr>
+                <w:rFonts w:eastAsia="Times New Roman"/>
+              </w:rPr>
+            </w:pPr>
+            <w:r>
+              <w:rPr>
+                <w:rFonts w:eastAsia="Times New Roman"/>
+              </w:rPr>
+              <w:t>Alta</w:t>
+            </w:r>
+          </w:p>
+        </w:tc>
+        <w:tc>
+          <w:tcPr>
+            <w:tcW w:w="0" w:type="auto"/>
+            <w:tcBorders>
+              <w:top w:val="single" w:sz="6" w:space="0" w:color="CCCCCC"/>
+              <w:left w:val="single" w:sz="6" w:space="0" w:color="CCCCCC"/>
+              <w:bottom w:val="single" w:sz="6" w:space="0" w:color="000000"/>
+              <w:right w:val="single" w:sz="6" w:space="0" w:color="000000"/>
+            </w:tcBorders>
+            <w:shd w:val="clear" w:color="auto" w:fill="A4C2F4"/>
+            <w:tcMar>
+              <w:top w:w="30" w:type="dxa"/>
+              <w:left w:w="45" w:type="dxa"/>
+              <w:bottom w:w="30" w:type="dxa"/>
+              <w:right w:w="45" w:type="dxa"/>
+            </w:tcMar>
+            <w:vAlign w:val="bottom"/>
+            <w:hideMark/>
+          </w:tcPr>
+          <w:p>
+            <w:pPr>
+              <w:spacing w:after="0" w:line="240" w:lineRule="auto"/>
+              <w:rPr>
+                <w:rFonts w:eastAsia="Times New Roman"/>
+              </w:rPr>
+            </w:pPr>
+            <w:r>
+              <w:rPr>
+                <w:rFonts w:eastAsia="Times New Roman"/>
+              </w:rPr>
+              <w:t>Necesario</w:t>
+            </w:r>
+          </w:p>
+        </w:tc>
+        <w:tc>
+          <w:tcPr>
+            <w:tcW w:w="0" w:type="auto"/>
+            <w:tcBorders>
+              <w:top w:val="single" w:sz="6" w:space="0" w:color="CCCCCC"/>
+              <w:left w:val="single" w:sz="6" w:space="0" w:color="CCCCCC"/>
+              <w:bottom w:val="single" w:sz="6" w:space="0" w:color="000000"/>
+              <w:right w:val="single" w:sz="6" w:space="0" w:color="000000"/>
+            </w:tcBorders>
+            <w:shd w:val="clear" w:color="auto" w:fill="A4C2F4"/>
+            <w:tcMar>
+              <w:top w:w="30" w:type="dxa"/>
+              <w:left w:w="45" w:type="dxa"/>
+              <w:bottom w:w="30" w:type="dxa"/>
+              <w:right w:w="45" w:type="dxa"/>
+            </w:tcMar>
+            <w:vAlign w:val="bottom"/>
+            <w:hideMark/>
+          </w:tcPr>
+          <w:p>
+            <w:pPr>
+              <w:spacing w:after="0" w:line="240" w:lineRule="auto"/>
+              <w:rPr>
+                <w:rFonts w:eastAsia="Times New Roman"/>
+              </w:rPr>
+            </w:pPr>
+            <w:r>
+              <w:rPr>
+                <w:rFonts w:eastAsia="Times New Roman"/>
+              </w:rPr>
+              <w:t>En Proceso</w:t>
+            </w:r>
+          </w:p>
+        </w:tc>
+        <w:tc>
+          <w:tcPr>
+            <w:tcW w:w="0" w:type="auto"/>
+            <w:tcBorders>
+              <w:top w:val="single" w:sz="6" w:space="0" w:color="CCCCCC"/>
+              <w:left w:val="single" w:sz="6" w:space="0" w:color="CCCCCC"/>
+              <w:bottom w:val="single" w:sz="6" w:space="0" w:color="000000"/>
+              <w:right w:val="single" w:sz="6" w:space="0" w:color="000000"/>
+            </w:tcBorders>
+            <w:shd w:val="clear" w:color="auto" w:fill="A4C2F4"/>
+            <w:tcMar>
+              <w:top w:w="30" w:type="dxa"/>
+              <w:left w:w="45" w:type="dxa"/>
+              <w:bottom w:w="30" w:type="dxa"/>
+              <w:right w:w="45" w:type="dxa"/>
+            </w:tcMar>
+            <w:vAlign w:val="bottom"/>
+            <w:hideMark/>
+          </w:tcPr>
+          <w:p>
+            <w:pPr>
+              <w:spacing w:after="0" w:line="240" w:lineRule="auto"/>
+              <w:rPr>
+                <w:rFonts w:eastAsia="Times New Roman"/>
+              </w:rPr>
+            </w:pPr>
+            <w:r>
+              <w:rPr>
+                <w:rFonts w:eastAsia="Times New Roman"/>
+              </w:rPr>
+              <w:t>Media</w:t>
+            </w:r>
+          </w:p>
+        </w:tc>
+      </w:tr>
+      <w:tr>
+        <w:trPr>
+          <w:trHeight w:val="315"/>
+        </w:trPr>
+        <w:tc>
+          <w:tcPr>
+            <w:tcW w:w="0" w:type="auto"/>
+            <w:tcBorders>
+              <w:top w:val="single" w:sz="6" w:space="0" w:color="CCCCCC"/>
+              <w:left w:val="single" w:sz="6" w:space="0" w:color="000000"/>
+              <w:bottom w:val="single" w:sz="6" w:space="0" w:color="000000"/>
+              <w:right w:val="single" w:sz="6" w:space="0" w:color="000000"/>
+            </w:tcBorders>
+            <w:shd w:val="clear" w:color="auto" w:fill="A4C2F4"/>
+            <w:tcMar>
+              <w:top w:w="30" w:type="dxa"/>
+              <w:left w:w="45" w:type="dxa"/>
+              <w:bottom w:w="30" w:type="dxa"/>
+              <w:right w:w="45" w:type="dxa"/>
+            </w:tcMar>
+            <w:vAlign w:val="bottom"/>
+            <w:hideMark/>
+          </w:tcPr>
+          <w:p>
+            <w:pPr>
+              <w:spacing w:after="0" w:line="240" w:lineRule="auto"/>
+              <w:rPr>
+                <w:rFonts w:eastAsia="Times New Roman"/>
+              </w:rPr>
+            </w:pPr>
+            <w:r>
+              <w:rPr>
+                <w:rFonts w:eastAsia="Times New Roman"/>
+              </w:rPr>
+              <w:t>RF008</w:t>
+            </w:r>
+          </w:p>
+        </w:tc>
+        <w:tc>
+          <w:tcPr>
+            <w:tcW w:w="0" w:type="auto"/>
+            <w:tcBorders>
+              <w:top w:val="single" w:sz="6" w:space="0" w:color="CCCCCC"/>
+              <w:left w:val="single" w:sz="6" w:space="0" w:color="CCCCCC"/>
+              <w:bottom w:val="single" w:sz="6" w:space="0" w:color="000000"/>
+              <w:right w:val="single" w:sz="6" w:space="0" w:color="000000"/>
+            </w:tcBorders>
+            <w:shd w:val="clear" w:color="auto" w:fill="A4C2F4"/>
+            <w:tcMar>
+              <w:top w:w="30" w:type="dxa"/>
+              <w:left w:w="45" w:type="dxa"/>
+              <w:bottom w:w="30" w:type="dxa"/>
+              <w:right w:w="45" w:type="dxa"/>
+            </w:tcMar>
+            <w:vAlign w:val="bottom"/>
+            <w:hideMark/>
+          </w:tcPr>
+          <w:p>
+            <w:pPr>
+              <w:spacing w:after="0" w:line="240" w:lineRule="auto"/>
+              <w:rPr>
+                <w:rFonts w:eastAsia="Times New Roman"/>
+              </w:rPr>
+            </w:pPr>
+            <w:r>
+              <w:rPr>
+                <w:rFonts w:eastAsia="Times New Roman"/>
+              </w:rPr>
+              <w:t>DescargaInmediata</w:t>
+            </w:r>
+          </w:p>
+        </w:tc>
+        <w:tc>
+          <w:tcPr>
+            <w:tcW w:w="0" w:type="auto"/>
+            <w:tcBorders>
+              <w:top w:val="single" w:sz="6" w:space="0" w:color="CCCCCC"/>
+              <w:left w:val="single" w:sz="6" w:space="0" w:color="CCCCCC"/>
+              <w:bottom w:val="single" w:sz="6" w:space="0" w:color="000000"/>
+              <w:right w:val="single" w:sz="6" w:space="0" w:color="000000"/>
+            </w:tcBorders>
+            <w:shd w:val="clear" w:color="auto" w:fill="A4C2F4"/>
+            <w:tcMar>
+              <w:top w:w="30" w:type="dxa"/>
+              <w:left w:w="45" w:type="dxa"/>
+              <w:bottom w:w="30" w:type="dxa"/>
+              <w:right w:w="45" w:type="dxa"/>
+            </w:tcMar>
+            <w:vAlign w:val="bottom"/>
+            <w:hideMark/>
+          </w:tcPr>
+          <w:p>
+            <w:pPr>
+              <w:spacing w:after="0" w:line="240" w:lineRule="auto"/>
+              <w:rPr>
+                <w:rFonts w:eastAsia="Times New Roman"/>
+              </w:rPr>
+            </w:pPr>
+            <w:r>
+              <w:rPr>
+                <w:rFonts w:eastAsia="Times New Roman"/>
+              </w:rPr>
+              <w:t>El sistema web debe permitir la descarga del documento en el momento de su generacion</w:t>
+            </w:r>
+          </w:p>
+        </w:tc>
+        <w:tc>
+          <w:tcPr>
+            <w:tcW w:w="0" w:type="auto"/>
+            <w:tcBorders>
+              <w:top w:val="single" w:sz="6" w:space="0" w:color="CCCCCC"/>
+              <w:left w:val="single" w:sz="6" w:space="0" w:color="CCCCCC"/>
+              <w:bottom w:val="single" w:sz="6" w:space="0" w:color="000000"/>
+              <w:right w:val="single" w:sz="6" w:space="0" w:color="000000"/>
+            </w:tcBorders>
+            <w:shd w:val="clear" w:color="auto" w:fill="A4C2F4"/>
+            <w:tcMar>
+              <w:top w:w="30" w:type="dxa"/>
+              <w:left w:w="45" w:type="dxa"/>
+              <w:bottom w:w="30" w:type="dxa"/>
+              <w:right w:w="45" w:type="dxa"/>
+            </w:tcMar>
+            <w:vAlign w:val="bottom"/>
+            <w:hideMark/>
+          </w:tcPr>
+          <w:p>
+            <w:pPr>
+              <w:spacing w:after="0" w:line="240" w:lineRule="auto"/>
+              <w:rPr>
+                <w:rFonts w:eastAsia="Times New Roman"/>
+              </w:rPr>
+            </w:pPr>
+            <w:r>
+              <w:rPr>
+                <w:rFonts w:eastAsia="Times New Roman"/>
+              </w:rPr>
+              <w:t>Alta</w:t>
+            </w:r>
+          </w:p>
+        </w:tc>
+        <w:tc>
+          <w:tcPr>
+            <w:tcW w:w="0" w:type="auto"/>
+            <w:tcBorders>
+              <w:top w:val="single" w:sz="6" w:space="0" w:color="CCCCCC"/>
+              <w:left w:val="single" w:sz="6" w:space="0" w:color="CCCCCC"/>
+              <w:bottom w:val="single" w:sz="6" w:space="0" w:color="000000"/>
+              <w:right w:val="single" w:sz="6" w:space="0" w:color="000000"/>
+            </w:tcBorders>
+            <w:shd w:val="clear" w:color="auto" w:fill="A4C2F4"/>
+            <w:tcMar>
+              <w:top w:w="30" w:type="dxa"/>
+              <w:left w:w="45" w:type="dxa"/>
+              <w:bottom w:w="30" w:type="dxa"/>
+              <w:right w:w="45" w:type="dxa"/>
+            </w:tcMar>
+            <w:vAlign w:val="bottom"/>
+            <w:hideMark/>
+          </w:tcPr>
+          <w:p>
+            <w:pPr>
+              <w:spacing w:after="0" w:line="240" w:lineRule="auto"/>
+              <w:rPr>
+                <w:rFonts w:eastAsia="Times New Roman"/>
+              </w:rPr>
+            </w:pPr>
+            <w:r>
+              <w:rPr>
+                <w:rFonts w:eastAsia="Times New Roman"/>
+              </w:rPr>
+              <w:t>Necesario</w:t>
+            </w:r>
+          </w:p>
+        </w:tc>
+        <w:tc>
+          <w:tcPr>
+            <w:tcW w:w="0" w:type="auto"/>
+            <w:tcBorders>
+              <w:top w:val="single" w:sz="6" w:space="0" w:color="CCCCCC"/>
+              <w:left w:val="single" w:sz="6" w:space="0" w:color="CCCCCC"/>
+              <w:bottom w:val="single" w:sz="6" w:space="0" w:color="000000"/>
+              <w:right w:val="single" w:sz="6" w:space="0" w:color="000000"/>
+            </w:tcBorders>
+            <w:shd w:val="clear" w:color="auto" w:fill="A4C2F4"/>
+            <w:tcMar>
+              <w:top w:w="30" w:type="dxa"/>
+              <w:left w:w="45" w:type="dxa"/>
+              <w:bottom w:w="30" w:type="dxa"/>
+              <w:right w:w="45" w:type="dxa"/>
+            </w:tcMar>
+            <w:vAlign w:val="bottom"/>
+            <w:hideMark/>
+          </w:tcPr>
+          <w:p>
+            <w:pPr>
+              <w:spacing w:after="0" w:line="240" w:lineRule="auto"/>
+              <w:rPr>
+                <w:rFonts w:eastAsia="Times New Roman"/>
+              </w:rPr>
+            </w:pPr>
+            <w:r>
+              <w:rPr>
+                <w:rFonts w:eastAsia="Times New Roman"/>
+              </w:rPr>
+              <w:t>En Proceso</w:t>
+            </w:r>
+          </w:p>
+        </w:tc>
+        <w:tc>
+          <w:tcPr>
+            <w:tcW w:w="0" w:type="auto"/>
+            <w:tcBorders>
+              <w:top w:val="single" w:sz="6" w:space="0" w:color="CCCCCC"/>
+              <w:left w:val="single" w:sz="6" w:space="0" w:color="CCCCCC"/>
+              <w:bottom w:val="single" w:sz="6" w:space="0" w:color="000000"/>
+              <w:right w:val="single" w:sz="6" w:space="0" w:color="000000"/>
+            </w:tcBorders>
+            <w:shd w:val="clear" w:color="auto" w:fill="A4C2F4"/>
+            <w:tcMar>
+              <w:top w:w="30" w:type="dxa"/>
+              <w:left w:w="45" w:type="dxa"/>
+              <w:bottom w:w="30" w:type="dxa"/>
+              <w:right w:w="45" w:type="dxa"/>
+            </w:tcMar>
+            <w:vAlign w:val="bottom"/>
+            <w:hideMark/>
+          </w:tcPr>
+          <w:p>
+            <w:pPr>
+              <w:spacing w:after="0" w:line="240" w:lineRule="auto"/>
+              <w:rPr>
+                <w:rFonts w:eastAsia="Times New Roman"/>
+              </w:rPr>
+            </w:pPr>
+            <w:r>
+              <w:rPr>
+                <w:rFonts w:eastAsia="Times New Roman"/>
+              </w:rPr>
+              <w:t>Media</w:t>
+            </w:r>
+          </w:p>
+        </w:tc>
+      </w:tr>
+      <w:tr>
+        <w:trPr>
+          <w:trHeight w:val="315"/>
+        </w:trPr>
+        <w:tc>
+          <w:tcPr>
+            <w:tcW w:w="0" w:type="auto"/>
+            <w:tcBorders>
+              <w:top w:val="single" w:sz="6" w:space="0" w:color="CCCCCC"/>
+              <w:left w:val="single" w:sz="6" w:space="0" w:color="000000"/>
+              <w:bottom w:val="single" w:sz="6" w:space="0" w:color="000000"/>
+              <w:right w:val="single" w:sz="6" w:space="0" w:color="000000"/>
+            </w:tcBorders>
+            <w:shd w:val="clear" w:color="auto" w:fill="A4C2F4"/>
+            <w:tcMar>
+              <w:top w:w="30" w:type="dxa"/>
+              <w:left w:w="45" w:type="dxa"/>
+              <w:bottom w:w="30" w:type="dxa"/>
+              <w:right w:w="45" w:type="dxa"/>
+            </w:tcMar>
+            <w:vAlign w:val="bottom"/>
+            <w:hideMark/>
+          </w:tcPr>
+          <w:p>
+            <w:pPr>
+              <w:spacing w:after="0" w:line="240" w:lineRule="auto"/>
+              <w:rPr>
+                <w:rFonts w:eastAsia="Times New Roman"/>
+              </w:rPr>
+            </w:pPr>
+            <w:r>
+              <w:rPr>
+                <w:rFonts w:eastAsia="Times New Roman"/>
+              </w:rPr>
+              <w:lastRenderedPageBreak/>
+              <w:t>RF009</w:t>
+            </w:r>
+          </w:p>
+        </w:tc>
+        <w:tc>
+          <w:tcPr>
+            <w:tcW w:w="0" w:type="auto"/>
+            <w:tcBorders>
+              <w:top w:val="single" w:sz="6" w:space="0" w:color="CCCCCC"/>
+              <w:left w:val="single" w:sz="6" w:space="0" w:color="CCCCCC"/>
+              <w:bottom w:val="single" w:sz="6" w:space="0" w:color="000000"/>
+              <w:right w:val="single" w:sz="6" w:space="0" w:color="000000"/>
+            </w:tcBorders>
+            <w:shd w:val="clear" w:color="auto" w:fill="A4C2F4"/>
+            <w:tcMar>
+              <w:top w:w="30" w:type="dxa"/>
+              <w:left w:w="45" w:type="dxa"/>
+              <w:bottom w:w="30" w:type="dxa"/>
+              <w:right w:w="45" w:type="dxa"/>
+            </w:tcMar>
+            <w:vAlign w:val="bottom"/>
+            <w:hideMark/>
+          </w:tcPr>
+          <w:p>
+            <w:pPr>
+              <w:spacing w:after="0" w:line="240" w:lineRule="auto"/>
+              <w:rPr>
+                <w:rFonts w:eastAsia="Times New Roman"/>
+              </w:rPr>
+            </w:pPr>
+            <w:r>
+              <w:rPr>
+                <w:rFonts w:eastAsia="Times New Roman"/>
+              </w:rPr>
+              <w:t>GenerarCitas</w:t>
+            </w:r>
+          </w:p>
+        </w:tc>
+        <w:tc>
+          <w:tcPr>
+            <w:tcW w:w="0" w:type="auto"/>
+            <w:tcBorders>
+              <w:top w:val="single" w:sz="6" w:space="0" w:color="CCCCCC"/>
+              <w:left w:val="single" w:sz="6" w:space="0" w:color="CCCCCC"/>
+              <w:bottom w:val="single" w:sz="6" w:space="0" w:color="000000"/>
+              <w:right w:val="single" w:sz="6" w:space="0" w:color="000000"/>
+            </w:tcBorders>
+            <w:shd w:val="clear" w:color="auto" w:fill="A4C2F4"/>
+            <w:tcMar>
+              <w:top w:w="30" w:type="dxa"/>
+              <w:left w:w="45" w:type="dxa"/>
+              <w:bottom w:w="30" w:type="dxa"/>
+              <w:right w:w="45" w:type="dxa"/>
+            </w:tcMar>
+            <w:vAlign w:val="bottom"/>
+            <w:hideMark/>
+          </w:tcPr>
+          <w:p>
+            <w:pPr>
+              <w:spacing w:after="0" w:line="240" w:lineRule="auto"/>
+              <w:rPr>
+                <w:rFonts w:eastAsia="Times New Roman"/>
+              </w:rPr>
+            </w:pPr>
+            <w:r>
+              <w:rPr>
+                <w:rFonts w:eastAsia="Times New Roman"/>
+              </w:rPr>
+              <w:t>El sistema web debe generar las citas y bibliografia automaticamente segun el contenido extraidas de fuentes reales dependiendo del formato escogido</w:t>
+            </w:r>
+          </w:p>
+        </w:tc>
+        <w:tc>
+          <w:tcPr>
+            <w:tcW w:w="0" w:type="auto"/>
+            <w:tcBorders>
+              <w:top w:val="single" w:sz="6" w:space="0" w:color="CCCCCC"/>
+              <w:left w:val="single" w:sz="6" w:space="0" w:color="CCCCCC"/>
+              <w:bottom w:val="single" w:sz="6" w:space="0" w:color="000000"/>
+              <w:right w:val="single" w:sz="6" w:space="0" w:color="000000"/>
+            </w:tcBorders>
+            <w:shd w:val="clear" w:color="auto" w:fill="A4C2F4"/>
+            <w:tcMar>
+              <w:top w:w="30" w:type="dxa"/>
+              <w:left w:w="45" w:type="dxa"/>
+              <w:bottom w:w="30" w:type="dxa"/>
+              <w:right w:w="45" w:type="dxa"/>
+            </w:tcMar>
+            <w:vAlign w:val="bottom"/>
+            <w:hideMark/>
+          </w:tcPr>
+          <w:p>
+            <w:pPr>
+              <w:spacing w:after="0" w:line="240" w:lineRule="auto"/>
+              <w:rPr>
+                <w:rFonts w:eastAsia="Times New Roman"/>
+              </w:rPr>
+            </w:pPr>
+            <w:r>
+              <w:rPr>
+                <w:rFonts w:eastAsia="Times New Roman"/>
+              </w:rPr>
+              <w:t>Alta</w:t>
+            </w:r>
+          </w:p>
+        </w:tc>
+        <w:tc>
+          <w:tcPr>
+            <w:tcW w:w="0" w:type="auto"/>
+            <w:tcBorders>
+              <w:top w:val="single" w:sz="6" w:space="0" w:color="CCCCCC"/>
+              <w:left w:val="single" w:sz="6" w:space="0" w:color="CCCCCC"/>
+              <w:bottom w:val="single" w:sz="6" w:space="0" w:color="000000"/>
+              <w:right w:val="single" w:sz="6" w:space="0" w:color="000000"/>
+            </w:tcBorders>
+            <w:shd w:val="clear" w:color="auto" w:fill="A4C2F4"/>
+            <w:tcMar>
+              <w:top w:w="30" w:type="dxa"/>
+              <w:left w:w="45" w:type="dxa"/>
+              <w:bottom w:w="30" w:type="dxa"/>
+              <w:right w:w="45" w:type="dxa"/>
+            </w:tcMar>
+            <w:vAlign w:val="bottom"/>
+            <w:hideMark/>
+          </w:tcPr>
+          <w:p>
+            <w:pPr>
+              <w:spacing w:after="0" w:line="240" w:lineRule="auto"/>
+              <w:rPr>
+                <w:rFonts w:eastAsia="Times New Roman"/>
+              </w:rPr>
+            </w:pPr>
+            <w:r>
+              <w:rPr>
+                <w:rFonts w:eastAsia="Times New Roman"/>
+              </w:rPr>
+              <w:t>Necesario</w:t>
+            </w:r>
+          </w:p>
+        </w:tc>
+        <w:tc>
+          <w:tcPr>
+            <w:tcW w:w="0" w:type="auto"/>
+            <w:tcBorders>
+              <w:top w:val="single" w:sz="6" w:space="0" w:color="CCCCCC"/>
+              <w:left w:val="single" w:sz="6" w:space="0" w:color="CCCCCC"/>
+              <w:bottom w:val="single" w:sz="6" w:space="0" w:color="000000"/>
+              <w:right w:val="single" w:sz="6" w:space="0" w:color="000000"/>
+            </w:tcBorders>
+            <w:shd w:val="clear" w:color="auto" w:fill="A4C2F4"/>
+            <w:tcMar>
+              <w:top w:w="30" w:type="dxa"/>
+              <w:left w:w="45" w:type="dxa"/>
+              <w:bottom w:w="30" w:type="dxa"/>
+              <w:right w:w="45" w:type="dxa"/>
+            </w:tcMar>
+            <w:vAlign w:val="bottom"/>
+            <w:hideMark/>
+          </w:tcPr>
+          <w:p>
+            <w:pPr>
+              <w:spacing w:after="0" w:line="240" w:lineRule="auto"/>
+              <w:rPr>
+                <w:rFonts w:eastAsia="Times New Roman"/>
+              </w:rPr>
+            </w:pPr>
+            <w:r>
+              <w:rPr>
+                <w:rFonts w:eastAsia="Times New Roman"/>
+              </w:rPr>
+              <w:t>En Proceso</w:t>
+            </w:r>
+          </w:p>
+        </w:tc>
+        <w:tc>
+          <w:tcPr>
+            <w:tcW w:w="0" w:type="auto"/>
+            <w:tcBorders>
+              <w:top w:val="single" w:sz="6" w:space="0" w:color="CCCCCC"/>
+              <w:left w:val="single" w:sz="6" w:space="0" w:color="CCCCCC"/>
+              <w:bottom w:val="single" w:sz="6" w:space="0" w:color="000000"/>
+              <w:right w:val="single" w:sz="6" w:space="0" w:color="000000"/>
+            </w:tcBorders>
+            <w:shd w:val="clear" w:color="auto" w:fill="A4C2F4"/>
+            <w:tcMar>
+              <w:top w:w="30" w:type="dxa"/>
+              <w:left w:w="45" w:type="dxa"/>
+              <w:bottom w:w="30" w:type="dxa"/>
+              <w:right w:w="45" w:type="dxa"/>
+            </w:tcMar>
+            <w:vAlign w:val="bottom"/>
+            <w:hideMark/>
+          </w:tcPr>
+          <w:p>
+            <w:pPr>
+              <w:spacing w:after="0" w:line="240" w:lineRule="auto"/>
+              <w:rPr>
+                <w:rFonts w:eastAsia="Times New Roman"/>
+              </w:rPr>
+            </w:pPr>
+            <w:r>
+              <w:rPr>
+                <w:rFonts w:eastAsia="Times New Roman"/>
+              </w:rPr>
+              <w:t>Media</w:t>
+            </w:r>
+          </w:p>
+        </w:tc>
+      </w:tr>
+      <w:tr>
+        <w:trPr>
+          <w:trHeight w:val="315"/>
+        </w:trPr>
+        <w:tc>
+          <w:tcPr>
+            <w:tcW w:w="0" w:type="auto"/>
+            <w:tcBorders>
+              <w:top w:val="single" w:sz="6" w:space="0" w:color="CCCCCC"/>
+              <w:left w:val="single" w:sz="6" w:space="0" w:color="000000"/>
+              <w:bottom w:val="single" w:sz="6" w:space="0" w:color="000000"/>
+              <w:right w:val="single" w:sz="6" w:space="0" w:color="000000"/>
+            </w:tcBorders>
+            <w:shd w:val="clear" w:color="auto" w:fill="A4C2F4"/>
+            <w:tcMar>
+              <w:top w:w="30" w:type="dxa"/>
+              <w:left w:w="45" w:type="dxa"/>
+              <w:bottom w:w="30" w:type="dxa"/>
+              <w:right w:w="45" w:type="dxa"/>
+            </w:tcMar>
+            <w:vAlign w:val="bottom"/>
+            <w:hideMark/>
+          </w:tcPr>
+          <w:p>
+            <w:pPr>
+              <w:spacing w:after="0" w:line="240" w:lineRule="auto"/>
+              <w:rPr>
+                <w:rFonts w:eastAsia="Times New Roman"/>
+              </w:rPr>
+            </w:pPr>
+            <w:r>
+              <w:rPr>
+                <w:rFonts w:eastAsia="Times New Roman"/>
+              </w:rPr>
+              <w:t>RF010</w:t>
+            </w:r>
+          </w:p>
+        </w:tc>
+        <w:tc>
+          <w:tcPr>
+            <w:tcW w:w="0" w:type="auto"/>
+            <w:tcBorders>
+              <w:top w:val="single" w:sz="6" w:space="0" w:color="CCCCCC"/>
+              <w:left w:val="single" w:sz="6" w:space="0" w:color="CCCCCC"/>
+              <w:bottom w:val="single" w:sz="6" w:space="0" w:color="000000"/>
+              <w:right w:val="single" w:sz="6" w:space="0" w:color="000000"/>
+            </w:tcBorders>
+            <w:shd w:val="clear" w:color="auto" w:fill="A4C2F4"/>
+            <w:tcMar>
+              <w:top w:w="30" w:type="dxa"/>
+              <w:left w:w="45" w:type="dxa"/>
+              <w:bottom w:w="30" w:type="dxa"/>
+              <w:right w:w="45" w:type="dxa"/>
+            </w:tcMar>
+            <w:vAlign w:val="bottom"/>
+            <w:hideMark/>
+          </w:tcPr>
+          <w:p>
+            <w:pPr>
+              <w:spacing w:after="0" w:line="240" w:lineRule="auto"/>
+              <w:rPr>
+                <w:rFonts w:eastAsia="Times New Roman"/>
+              </w:rPr>
+            </w:pPr>
+            <w:r>
+              <w:rPr>
+                <w:rFonts w:eastAsia="Times New Roman"/>
+              </w:rPr>
+              <w:t>HistorialDocs</w:t>
+            </w:r>
+          </w:p>
+        </w:tc>
+        <w:tc>
+          <w:tcPr>
+            <w:tcW w:w="0" w:type="auto"/>
+            <w:tcBorders>
+              <w:top w:val="single" w:sz="6" w:space="0" w:color="CCCCCC"/>
+              <w:left w:val="single" w:sz="6" w:space="0" w:color="CCCCCC"/>
+              <w:bottom w:val="single" w:sz="6" w:space="0" w:color="000000"/>
+              <w:right w:val="single" w:sz="6" w:space="0" w:color="000000"/>
+            </w:tcBorders>
+            <w:shd w:val="clear" w:color="auto" w:fill="A4C2F4"/>
+            <w:tcMar>
+              <w:top w:w="30" w:type="dxa"/>
+              <w:left w:w="45" w:type="dxa"/>
+              <w:bottom w:w="30" w:type="dxa"/>
+              <w:right w:w="45" w:type="dxa"/>
+            </w:tcMar>
+            <w:vAlign w:val="bottom"/>
+            <w:hideMark/>
+          </w:tcPr>
+          <w:p>
+            <w:pPr>
+              <w:spacing w:after="0" w:line="240" w:lineRule="auto"/>
+              <w:rPr>
+                <w:rFonts w:eastAsia="Times New Roman"/>
+              </w:rPr>
+            </w:pPr>
+            <w:r>
+              <w:rPr>
+                <w:rFonts w:eastAsia="Times New Roman"/>
+              </w:rPr>
+              <w:t>El sistema web debe almacenar un historial de los documentos realizados previamente</w:t>
+            </w:r>
+          </w:p>
+        </w:tc>
+        <w:tc>
+          <w:tcPr>
+            <w:tcW w:w="0" w:type="auto"/>
+            <w:tcBorders>
+              <w:top w:val="single" w:sz="6" w:space="0" w:color="CCCCCC"/>
+              <w:left w:val="single" w:sz="6" w:space="0" w:color="CCCCCC"/>
+              <w:bottom w:val="single" w:sz="6" w:space="0" w:color="000000"/>
+              <w:right w:val="single" w:sz="6" w:space="0" w:color="000000"/>
+            </w:tcBorders>
+            <w:shd w:val="clear" w:color="auto" w:fill="A4C2F4"/>
+            <w:tcMar>
+              <w:top w:w="30" w:type="dxa"/>
+              <w:left w:w="45" w:type="dxa"/>
+              <w:bottom w:w="30" w:type="dxa"/>
+              <w:right w:w="45" w:type="dxa"/>
+            </w:tcMar>
+            <w:vAlign w:val="bottom"/>
+            <w:hideMark/>
+          </w:tcPr>
+          <w:p>
+            <w:pPr>
+              <w:spacing w:after="0" w:line="240" w:lineRule="auto"/>
+              <w:rPr>
+                <w:rFonts w:eastAsia="Times New Roman"/>
+              </w:rPr>
+            </w:pPr>
+            <w:r>
+              <w:rPr>
+                <w:rFonts w:eastAsia="Times New Roman"/>
+              </w:rPr>
+              <w:t>Alta</w:t>
+            </w:r>
+          </w:p>
+        </w:tc>
+        <w:tc>
+          <w:tcPr>
+            <w:tcW w:w="0" w:type="auto"/>
+            <w:tcBorders>
+              <w:top w:val="single" w:sz="6" w:space="0" w:color="CCCCCC"/>
+              <w:left w:val="single" w:sz="6" w:space="0" w:color="CCCCCC"/>
+              <w:bottom w:val="single" w:sz="6" w:space="0" w:color="000000"/>
+              <w:right w:val="single" w:sz="6" w:space="0" w:color="000000"/>
+            </w:tcBorders>
+            <w:shd w:val="clear" w:color="auto" w:fill="A4C2F4"/>
+            <w:tcMar>
+              <w:top w:w="30" w:type="dxa"/>
+              <w:left w:w="45" w:type="dxa"/>
+              <w:bottom w:w="30" w:type="dxa"/>
+              <w:right w:w="45" w:type="dxa"/>
+            </w:tcMar>
+            <w:vAlign w:val="bottom"/>
+            <w:hideMark/>
+          </w:tcPr>
+          <w:p>
+            <w:pPr>
+              <w:spacing w:after="0" w:line="240" w:lineRule="auto"/>
+              <w:rPr>
+                <w:rFonts w:eastAsia="Times New Roman"/>
+              </w:rPr>
+            </w:pPr>
+            <w:r>
+              <w:rPr>
+                <w:rFonts w:eastAsia="Times New Roman"/>
+              </w:rPr>
+              <w:t>Necesario</w:t>
+            </w:r>
+          </w:p>
+        </w:tc>
+        <w:tc>
+          <w:tcPr>
+            <w:tcW w:w="0" w:type="auto"/>
+            <w:tcBorders>
+              <w:top w:val="single" w:sz="6" w:space="0" w:color="CCCCCC"/>
+              <w:left w:val="single" w:sz="6" w:space="0" w:color="CCCCCC"/>
+              <w:bottom w:val="single" w:sz="6" w:space="0" w:color="000000"/>
+              <w:right w:val="single" w:sz="6" w:space="0" w:color="000000"/>
+            </w:tcBorders>
+            <w:shd w:val="clear" w:color="auto" w:fill="A4C2F4"/>
+            <w:tcMar>
+              <w:top w:w="30" w:type="dxa"/>
+              <w:left w:w="45" w:type="dxa"/>
+              <w:bottom w:w="30" w:type="dxa"/>
+              <w:right w:w="45" w:type="dxa"/>
+            </w:tcMar>
+            <w:vAlign w:val="bottom"/>
+            <w:hideMark/>
+          </w:tcPr>
+          <w:p>
+            <w:pPr>
+              <w:spacing w:after="0" w:line="240" w:lineRule="auto"/>
+              <w:rPr>
+                <w:rFonts w:eastAsia="Times New Roman"/>
+              </w:rPr>
+            </w:pPr>
+            <w:r>
+              <w:rPr>
+                <w:rFonts w:eastAsia="Times New Roman"/>
+              </w:rPr>
+              <w:t>En Proceso</w:t>
+            </w:r>
+          </w:p>
+        </w:tc>
+        <w:tc>
+          <w:tcPr>
+            <w:tcW w:w="0" w:type="auto"/>
+            <w:tcBorders>
+              <w:top w:val="single" w:sz="6" w:space="0" w:color="CCCCCC"/>
+              <w:left w:val="single" w:sz="6" w:space="0" w:color="CCCCCC"/>
+              <w:bottom w:val="single" w:sz="6" w:space="0" w:color="000000"/>
+              <w:right w:val="single" w:sz="6" w:space="0" w:color="000000"/>
+            </w:tcBorders>
+            <w:shd w:val="clear" w:color="auto" w:fill="A4C2F4"/>
+            <w:tcMar>
+              <w:top w:w="30" w:type="dxa"/>
+              <w:left w:w="45" w:type="dxa"/>
+              <w:bottom w:w="30" w:type="dxa"/>
+              <w:right w:w="45" w:type="dxa"/>
+            </w:tcMar>
+            <w:vAlign w:val="bottom"/>
+            <w:hideMark/>
+          </w:tcPr>
+          <w:p>
+            <w:pPr>
+              <w:spacing w:after="0" w:line="240" w:lineRule="auto"/>
+              <w:rPr>
+                <w:rFonts w:eastAsia="Times New Roman"/>
+              </w:rPr>
+            </w:pPr>
+            <w:r>
+              <w:rPr>
+                <w:rFonts w:eastAsia="Times New Roman"/>
+              </w:rPr>
+              <w:t>Media</w:t>
+            </w:r>
+          </w:p>
+        </w:tc>
+      </w:tr>
+      <w:tr>
+        <w:trPr>
+          <w:trHeight w:val="315"/>
+        </w:trPr>
+        <w:tc>
+          <w:tcPr>
+            <w:tcW w:w="0" w:type="auto"/>
+            <w:tcBorders>
+              <w:top w:val="single" w:sz="6" w:space="0" w:color="CCCCCC"/>
+              <w:left w:val="single" w:sz="6" w:space="0" w:color="000000"/>
+              <w:bottom w:val="single" w:sz="6" w:space="0" w:color="CCCCCC"/>
+              <w:right w:val="single" w:sz="6" w:space="0" w:color="000000"/>
+            </w:tcBorders>
+            <w:shd w:val="clear" w:color="auto" w:fill="A4C2F4"/>
+            <w:tcMar>
+              <w:top w:w="30" w:type="dxa"/>
+              <w:left w:w="45" w:type="dxa"/>
+              <w:bottom w:w="30" w:type="dxa"/>
+              <w:right w:w="45" w:type="dxa"/>
+            </w:tcMar>
+            <w:vAlign w:val="bottom"/>
+            <w:hideMark/>
+          </w:tcPr>
+          <w:p>
+            <w:pPr>
+              <w:spacing w:after="0" w:line="240" w:lineRule="auto"/>
+              <w:rPr>
+                <w:rFonts w:eastAsia="Times New Roman"/>
+              </w:rPr>
+            </w:pPr>
+            <w:r>
+              <w:rPr>
+                <w:rFonts w:eastAsia="Times New Roman"/>
+              </w:rPr>
+              <w:t>RF011</w:t>
+            </w:r>
+          </w:p>
+        </w:tc>
+        <w:tc>
+          <w:tcPr>
+            <w:tcW w:w="0" w:type="auto"/>
+            <w:tcBorders>
+              <w:top w:val="single" w:sz="6" w:space="0" w:color="CCCCCC"/>
+              <w:left w:val="single" w:sz="6" w:space="0" w:color="CCCCCC"/>
+              <w:bottom w:val="single" w:sz="6" w:space="0" w:color="CCCCCC"/>
+              <w:right w:val="single" w:sz="6" w:space="0" w:color="000000"/>
+            </w:tcBorders>
+            <w:shd w:val="clear" w:color="auto" w:fill="A4C2F4"/>
+            <w:tcMar>
+              <w:top w:w="30" w:type="dxa"/>
+              <w:left w:w="45" w:type="dxa"/>
+              <w:bottom w:w="30" w:type="dxa"/>
+              <w:right w:w="45" w:type="dxa"/>
+            </w:tcMar>
+            <w:vAlign w:val="bottom"/>
+            <w:hideMark/>
+          </w:tcPr>
+          <w:p>
+            <w:pPr>
+              <w:spacing w:after="0" w:line="240" w:lineRule="auto"/>
+              <w:rPr>
+                <w:rFonts w:eastAsia="Times New Roman"/>
+              </w:rPr>
+            </w:pPr>
+            <w:r>
+              <w:rPr>
+                <w:rFonts w:eastAsia="Times New Roman"/>
+              </w:rPr>
+              <w:t>DescargaHistorial</w:t>
+            </w:r>
+          </w:p>
+        </w:tc>
+        <w:tc>
+          <w:tcPr>
+            <w:tcW w:w="0" w:type="auto"/>
+            <w:tcBorders>
+              <w:top w:val="single" w:sz="6" w:space="0" w:color="CCCCCC"/>
+              <w:left w:val="single" w:sz="6" w:space="0" w:color="CCCCCC"/>
+              <w:bottom w:val="single" w:sz="6" w:space="0" w:color="CCCCCC"/>
+              <w:right w:val="single" w:sz="6" w:space="0" w:color="000000"/>
+            </w:tcBorders>
+            <w:shd w:val="clear" w:color="auto" w:fill="A4C2F4"/>
+            <w:tcMar>
+              <w:top w:w="30" w:type="dxa"/>
+              <w:left w:w="45" w:type="dxa"/>
+              <w:bottom w:w="30" w:type="dxa"/>
+              <w:right w:w="45" w:type="dxa"/>
+            </w:tcMar>
+            <w:vAlign w:val="bottom"/>
+            <w:hideMark/>
+          </w:tcPr>
+          <w:p>
+            <w:pPr>
+              <w:spacing w:after="0" w:line="240" w:lineRule="auto"/>
+              <w:rPr>
+                <w:rFonts w:eastAsia="Times New Roman"/>
+              </w:rPr>
+            </w:pPr>
+            <w:r>
+              <w:rPr>
+                <w:rFonts w:eastAsia="Times New Roman"/>
+              </w:rPr>
+              <w:t>El sistema web debe permitir la descarga de los documentos previos</w:t>
+            </w:r>
+          </w:p>
+        </w:tc>
+        <w:tc>
+          <w:tcPr>
+            <w:tcW w:w="0" w:type="auto"/>
+            <w:tcBorders>
+              <w:top w:val="single" w:sz="6" w:space="0" w:color="CCCCCC"/>
+              <w:left w:val="single" w:sz="6" w:space="0" w:color="CCCCCC"/>
+              <w:bottom w:val="single" w:sz="6" w:space="0" w:color="CCCCCC"/>
+              <w:right w:val="single" w:sz="6" w:space="0" w:color="000000"/>
+            </w:tcBorders>
+            <w:shd w:val="clear" w:color="auto" w:fill="A4C2F4"/>
+            <w:tcMar>
+              <w:top w:w="30" w:type="dxa"/>
+              <w:left w:w="45" w:type="dxa"/>
+              <w:bottom w:w="30" w:type="dxa"/>
+              <w:right w:w="45" w:type="dxa"/>
+            </w:tcMar>
+            <w:vAlign w:val="bottom"/>
+            <w:hideMark/>
+          </w:tcPr>
+          <w:p>
+            <w:pPr>
+              <w:spacing w:after="0" w:line="240" w:lineRule="auto"/>
+              <w:rPr>
+                <w:rFonts w:eastAsia="Times New Roman"/>
+              </w:rPr>
+            </w:pPr>
+            <w:r>
+              <w:rPr>
+                <w:rFonts w:eastAsia="Times New Roman"/>
+              </w:rPr>
+              <w:t>Alta</w:t>
+            </w:r>
+          </w:p>
+        </w:tc>
+        <w:tc>
+          <w:tcPr>
+            <w:tcW w:w="0" w:type="auto"/>
+            <w:tcBorders>
+              <w:top w:val="single" w:sz="6" w:space="0" w:color="CCCCCC"/>
+              <w:left w:val="single" w:sz="6" w:space="0" w:color="CCCCCC"/>
+              <w:bottom w:val="single" w:sz="6" w:space="0" w:color="CCCCCC"/>
+              <w:right w:val="single" w:sz="6" w:space="0" w:color="000000"/>
+            </w:tcBorders>
+            <w:shd w:val="clear" w:color="auto" w:fill="A4C2F4"/>
+            <w:tcMar>
+              <w:top w:w="30" w:type="dxa"/>
+              <w:left w:w="45" w:type="dxa"/>
+              <w:bottom w:w="30" w:type="dxa"/>
+              <w:right w:w="45" w:type="dxa"/>
+            </w:tcMar>
+            <w:vAlign w:val="bottom"/>
+            <w:hideMark/>
+          </w:tcPr>
+          <w:p>
+            <w:pPr>
+              <w:spacing w:after="0" w:line="240" w:lineRule="auto"/>
+              <w:rPr>
+                <w:rFonts w:eastAsia="Times New Roman"/>
+              </w:rPr>
+            </w:pPr>
+            <w:r>
+              <w:rPr>
+                <w:rFonts w:eastAsia="Times New Roman"/>
+              </w:rPr>
+              <w:t>Necesario</w:t>
+            </w:r>
+          </w:p>
+        </w:tc>
+        <w:tc>
+          <w:tcPr>
+            <w:tcW w:w="0" w:type="auto"/>
+            <w:tcBorders>
+              <w:top w:val="single" w:sz="6" w:space="0" w:color="CCCCCC"/>
+              <w:left w:val="single" w:sz="6" w:space="0" w:color="CCCCCC"/>
+              <w:bottom w:val="single" w:sz="6" w:space="0" w:color="CCCCCC"/>
+              <w:right w:val="single" w:sz="6" w:space="0" w:color="000000"/>
+            </w:tcBorders>
+            <w:shd w:val="clear" w:color="auto" w:fill="A4C2F4"/>
+            <w:tcMar>
+              <w:top w:w="30" w:type="dxa"/>
+              <w:left w:w="45" w:type="dxa"/>
+              <w:bottom w:w="30" w:type="dxa"/>
+              <w:right w:w="45" w:type="dxa"/>
+            </w:tcMar>
+            <w:vAlign w:val="bottom"/>
+            <w:hideMark/>
+          </w:tcPr>
+          <w:p>
+            <w:pPr>
+              <w:spacing w:after="0" w:line="240" w:lineRule="auto"/>
+              <w:rPr>
+                <w:rFonts w:eastAsia="Times New Roman"/>
+              </w:rPr>
+            </w:pPr>
+            <w:r>
+              <w:rPr>
+                <w:rFonts w:eastAsia="Times New Roman"/>
+              </w:rPr>
+              <w:t>En Proceso</w:t>
+            </w:r>
+          </w:p>
+        </w:tc>
+        <w:tc>
+          <w:tcPr>
+            <w:tcW w:w="0" w:type="auto"/>
+            <w:tcBorders>
+              <w:top w:val="single" w:sz="6" w:space="0" w:color="CCCCCC"/>
+              <w:left w:val="single" w:sz="6" w:space="0" w:color="CCCCCC"/>
+              <w:bottom w:val="single" w:sz="6" w:space="0" w:color="CCCCCC"/>
+              <w:right w:val="single" w:sz="6" w:space="0" w:color="000000"/>
+            </w:tcBorders>
+            <w:shd w:val="clear" w:color="auto" w:fill="A4C2F4"/>
+            <w:tcMar>
+              <w:top w:w="30" w:type="dxa"/>
+              <w:left w:w="45" w:type="dxa"/>
+              <w:bottom w:w="30" w:type="dxa"/>
+              <w:right w:w="45" w:type="dxa"/>
+            </w:tcMar>
+            <w:vAlign w:val="bottom"/>
+            <w:hideMark/>
+          </w:tcPr>
+          <w:p>
+            <w:pPr>
+              <w:spacing w:after="0" w:line="240" w:lineRule="auto"/>
+              <w:rPr>
+                <w:rFonts w:eastAsia="Times New Roman"/>
+              </w:rPr>
+            </w:pPr>
+            <w:r>
+              <w:rPr>
+                <w:rFonts w:eastAsia="Times New Roman"/>
+              </w:rPr>
+              <w:t>Media</w:t>
+            </w:r>
+          </w:p>
+        </w:tc>
+      </w:tr>
+    </w:tbl>
     <w:p>
       <w:pPr>
         <w:pStyle w:val="Ttulo2"/>
@@ -13617,7 +16616,6 @@
   <w:style w:type="character" w:default="1" w:styleId="Fuentedeprrafopredeter">
     <w:name w:val="Default Paragraph Font"/>
     <w:uiPriority w:val="1"/>
-    <w:semiHidden/>
     <w:unhideWhenUsed/>
   </w:style>
   <w:style w:type="table" w:default="1" w:styleId="Tablanormal">

</xml_diff>